<commit_message>
Rewrite course paper based on actual uploaded course materials
Grounded all four answers in the course source sheets, presentations,
and syllabus articles: Q1 now uses the eglah arufah/levayah sugya from
meeting 1; Q2 is anchored in Halbertal's introduction and the Mishnah
characteristics chavruta sheet (Sukkah 1:1 example); Q3 corrected to
the Rabban Yochanan ben Zakkai escape narrative (Gittin 56a-b) analyzed
through Dalia Marx's article; Q4 expands on R. Eliezer ben Hyrcanus via
Avot 2:8, Sotah 3:4 and Boyarin. Added a bibliography page.

Co-Authored-By: Claude Fable 5 <noreply@anthropic.com>
Claude-Session: https://claude.ai/code/session_01JB6bGJBwBnqBZeMysNqh8L
</commit_message>
<xml_diff>
--- a/עבודת-סיום-אדם-ספרות-ומעשה-בימי-חזל.docx
+++ b/עבודת-סיום-אדם-ספרות-ומעשה-בימי-חזל.docx
@@ -404,7 +404,7 @@
           <w:szCs w:val="24"/>
           <w:rtl/>
         </w:rPr>
-        <w:t xml:space="preserve">בחרתי לשאת דברים בפני צוות שאני שותף בהובלתו, בפתיחתו של תהליך ארוך־טווח, ולבסס אותם על אגדת חוני המעגל ונוטע החרוב, מתוך התלמוד הבבלי, מסכת תענית דף כג ע"א:</w:t>
+        <w:t xml:space="preserve">נבחרתי לשאת דברים בפתיחת שנת פעילות של צוות שאני שותף בהובלתו, ובחרתי לבסס את דבריי על סוגיית עגלה ערופה שנלמדה במפגש הראשון – ובמרכזה משנה, מסכת סוטה פרק ט, משנה ו, והרחבתה בתלמוד הבבלי, סוטה דף מו ע"ב:</w:t>
       </w:r>
     </w:p>
     <w:p>
@@ -423,27 +423,27 @@
           <w:szCs w:val="24"/>
           <w:rtl/>
         </w:rPr>
-        <w:t xml:space="preserve">יומא חד הוה אזל באורחא, חזייה לההוא גברא דהוה נטע חרובא. אמר ליה: האי, עד כמה שנין טעין? אמר ליה: עד שבעין שנין. אמר ליה: פשיטא לך דחיית שבעין שנין? אמר ליה: האי גברא עלמא בחרובא אשכחתיה; כי היכי דשתלי לי אבהתי – שתלי נמי לבנאי.</w:t>
-      </w:r>
-    </w:p>
-    <w:p>
-      <w:pPr>
-        <w:bidi/>
-        <w:spacing w:after="120" w:line="360" w:lineRule="auto"/>
-        <w:jc w:val="both"/>
-      </w:pPr>
-      <w:r>
-        <w:rPr>
-          <w:rFonts w:ascii="David" w:cs="David" w:eastAsia="David" w:hAnsi="David"/>
-          <w:b w:val="false"/>
-          <w:bCs w:val="false"/>
-          <w:i w:val="false"/>
-          <w:iCs w:val="false"/>
-          <w:sz w:val="24"/>
-          <w:szCs w:val="24"/>
-          <w:rtl/>
-        </w:rPr>
-        <w:t xml:space="preserve">ובתרגום לעברית: יום אחד היה חוני המעגל מהלך בדרך, וראה אדם נוטע עץ חרוב. שאל אותו: עץ זה – בעוד כמה שנים יישא פירות? ענה לו: בעוד שבעים שנה. אמר לו חוני: וכי ברור לך שתחיה שבעים שנה ותזכה לאכול מפירותיו? השיב לו הנוטע: אני מצאתי את העולם מלא עצי חרוב; כשם שנטעו אבותיי בשבילי – כך אני נוטע בשביל בניי. בהמשך הסיפור נרדם חוני שבעים שנה, וכשהוא מתעורר הוא רואה את נכדו של הנוטע מלקט חרובים מאותו העץ.</w:t>
+        <w:t xml:space="preserve">"זקני אותה העיר רוחצין את ידיהן במים במקום עריפה של עגלה, ואומרים: ידינו לא שפכה את הדם הזה ועינינו לא ראו. וכי על דעתנו עלתה, שזקני בית דין שופכי דמים הן?! אלא: שלא בא לידינו ופטרנוהו בלא מזון, ולא ראינוהו והנחנוהו בלא לויה."</w:t>
+      </w:r>
+    </w:p>
+    <w:p>
+      <w:pPr>
+        <w:bidi/>
+        <w:spacing w:after="120" w:line="360" w:lineRule="auto"/>
+        <w:jc w:val="both"/>
+      </w:pPr>
+      <w:r>
+        <w:rPr>
+          <w:rFonts w:ascii="David" w:cs="David" w:eastAsia="David" w:hAnsi="David"/>
+          <w:b w:val="false"/>
+          <w:bCs w:val="false"/>
+          <w:i w:val="false"/>
+          <w:iCs w:val="false"/>
+          <w:sz w:val="24"/>
+          <w:szCs w:val="24"/>
+          <w:rtl/>
+        </w:rPr>
+        <w:t xml:space="preserve">המשנה מפרשת את הטקס המקראי שבדברים כא: כאשר נמצא חלל בשדה ולא נודע מי הכהו, יוצאים זקני העיר הקרובה, עורפים עגלה בנחל ומצהירים "ידינו לא שפכו את הדם הזה". המשנה שואלת את השאלה המתבקשת – וכי מישהו חשד בזקני בית הדין שהם רצחו? – ותשובתה מפליגה: ההצהרה אינה על הרצח אלא על המחדל. הזקנים מעידים שהאיש לא יצא מעירם רעב ובלא ליווי. התלמוד מרחיב את הרעיון ומעמיד את הליווי כערך מכונן: "אמר רבי יוחנן משום רבי מאיר: כל שאינו מלוה ומתלוה – כאילו שופך דמים", ולצדו: "כל המלוה את חברו ארבע אמות בעיר – אינו ניזוק".</w:t>
       </w:r>
     </w:p>
     <w:p>
@@ -483,7 +483,7 @@
           <w:szCs w:val="24"/>
           <w:rtl/>
         </w:rPr>
-        <w:t xml:space="preserve">מקור הסיפור בתלמוד הבבלי, במסכת תענית, בתוך רצף של אגדות העוסקות בחוני המעגל. הדמות המרכזית היא חוני המעגל, חכם ואיש מופת מסוף ימי הבית השני, המוכר ממשנה תענית (פרק ג, משנה ח) כמי שעג עוגה ועמד בתוכה עד שירדו גשמים. הדמות השנייה היא אדם פשוט ואלמוני – נוטע החרוב. הסיטואציה המתוארת היא מפגש אקראי בדרך: החכם הגדול, שרגיל שתפילותיו נענות מיד, פוגש אדם עובד אדמה המשקיע את זמנו ומרצו במעשה שאת פירותיו לא יראה לעולם, ודווקא האיש הפשוט הוא שמלמד את החכם שיעור על אמונה, על סבלנות ועל אחריות בין־דורית.</w:t>
+        <w:t xml:space="preserve">מקור הטקסט במשנה, מסכת סוטה, בפרק העוסק בטקסים שבטלו, והרחבתו בסוגיית הבבלי שם. הדמויות המרכזיות הן זקני העיר והכוהנים – מנהיגי הציבור – והחלל האלמוני, אדם שאיש אינו יודע את שמו. הסיטואציה: מוות שאין לו אשם ידוע, שדווקא בו התורה וחז"ל מחייבים את ההנהגה כולה לצאת, להתכנס סביב הגופה ולתת דין וחשבון פומבי. הטקסט נלמד אצלנו כדוגמה לתנועה של חז"ל מן המקרא אל המשנה ואל התלמוד: מטקס כפרה פולחני – אל אמירה מוסרית על אחריות חברתית.</w:t>
       </w:r>
     </w:p>
     <w:p>
@@ -523,7 +523,7 @@
           <w:szCs w:val="24"/>
           <w:rtl/>
         </w:rPr>
-        <w:t xml:space="preserve">הטקסט מתאים לדעתי לכל קבוצה הנמצאת בתחילתה של עשייה שפירותיה אינם מיידיים – צוות חינוכי, קהילה או פרויקט חברתי. ראשית, הוא מציב את המסר המרכזי שברצוני לחדד: עשייה משמעותית אינה נמדדת בתוצאה מיידית, ומנהיגות אמיתית היא נכונות "לנטוע" גם כשמישהו אחר יקטוף. שנית, הוא מזכיר לנו ענווה והכרת הטוב – אנחנו עצמנו אוכלים מפירות שנטעו קודמינו, ומכאן חובתנו כלפי הבאים אחרינו. שלישית, יש בו היפוך מפתיע שכוחו הרטורי רב: דווקא האדם הפשוט מלמד את החכם, ומכאן שכל חבר בקבוצה, ולא רק העומד בראשה, יכול להיות מקור להשראה. סיפור קצר, מוחשי ומצויר היטב כזה נחקק בזיכרון השומעים הרבה יותר מכל נאום מופשט.</w:t>
+        <w:t xml:space="preserve">בחרתי בטקסט הזה משום שהוא מנסח בדיוק את המסר שברצוני לחדד בפתיחת שנה של עשייה משותפת: המבחן של קבוצה אינו במה שהיא עושה לחבריה, אלא במה שהיא מניחה שלא לעשות. הזקנים אינם נחשדים ברצח – הם נתבעים על ליווי שלא ניתן ועל מזון שלא הוצע. חז"ל מלמדים שאחריות אינה רק הימנעות מפגיעה אלא חובת נוכחות פעילה: לראות את מי שבשוליים, ללוות את מי שיוצא לדרך, לא להניח לאיש "לצאת מן העיר" לבדו. בעיניי זהו מסר חד למנהיגות בכל ארגון וקהילה: תרבות של קבוצה נמדדת ברגעי הפרידה והמעבר של חבריה, ובשאלה אם מישהו נעלם – ואיש לא שם לב. האמירה "כל שאינו מלווה – כאילו שופך דמים" חריפה במתכוון, והחריפות הזאת היא שעושה אותה בלתי נשכחת עבור השומעים.</w:t>
       </w:r>
     </w:p>
     <w:p>
@@ -583,7 +583,7 @@
           <w:szCs w:val="24"/>
           <w:rtl/>
         </w:rPr>
-        <w:t xml:space="preserve">החיבור המשמעותי ביותר בעיניי מתקופת חז"ל הוא המשנה. המשנה נערכה ונחתמה בארץ ישראל בסביבות שנת 200 לספירה בידי רבי יהודה הנשיא ("רבי"), והיא שיאו של מפעל איסוף ועריכה שנמשך דורות – ממסורות בית הלל ובית שמאי, דרך משנתו של רבי עקיבא ותלמידו רבי מאיר, ועד לעריכה הסופית. מאפייניה הבולטים: היא כתובה בעברית ייחודית ("לשון חכמים"); היא מסודרת סידור ענייני־נושאי בשישה סדרים (זרעים, מועד, נשים, נזיקין, קדשים, טהרות) המתחלקים לשישים ושלוש מסכתות – ולא לפי סדר פסוקי המקרא; לשונה קצרה, פסקנית ומנוסחת לשינון; והיא משמרת בצד ההכרעות גם מחלוקות ודעות יחיד בשם אומריהן.</w:t>
+        <w:t xml:space="preserve">החיבור המשמעותי ביותר בעיניי מתקופת חז"ל הוא המשנה. המשנה נערכה בארץ ישראל בסביבות שנת 220 לספירה בידי רבי יהודה הנשיא ("רבי"), כסיכום ההלכה התנאית שהתפתחה בבתי המדרש מאז דורות בית הלל ובית שמאי, דרך משנת רבי עקיבא ותלמידיו. מאפייניה, כפי שלמדנו בעקבות מבואו של משה הלברטל: היקף עצום ויומרה לסכם את כלל הידע ההלכתי; ארגון ענייני-נושאי בשישה סדרים (זרעים, מועד, נשים, נזיקין, קדשים, טהרות) ולא לפי סדר פסוקי המקרא; עברית ייחודית – "לשון חכמים" – קצרה, מדודה וכמעט ללא הנמקות; ועריכה "כרצף מחלוקות", המשמרת דעות רבים ויחיד בשם אומריהן. המניעים לעריכתה, כפי שנידונו במפגשים: החשש מאובדן המסורת בתקופה סוערת שלאחר החורבן והמרידות, התרחבות הידע והקושי לשלוט בו, והצורך לשמר את המסורת בלא תלות במוסדות ריכוזיים שחרבו.</w:t>
       </w:r>
     </w:p>
     <w:p>
@@ -623,7 +623,7 @@
           <w:szCs w:val="24"/>
           <w:rtl/>
         </w:rPr>
-        <w:t xml:space="preserve">המשנה היא החיבור הראשון שהעלה את התורה שבעל־פה מאוסף מסורות מפוזרות לכדי קורפוס ערוך, מוסכם ומחייב. השינוי שחוללה הוא כפול. ראשית, בעקבות חורבן הבית ואובדן המרכז הפולחני, המשנה העמידה במרכז החיים הדתיים את לימוד הטקסט ואת בית המדרש: מעתה הסמכות הדתית אינה שוכנת במקדש ובכהונה אלא בידי החכמים, הנקנית בלימוד ובמסירה. שנית, המשנה יצרה "שפה משותפת" לעם כולו: היא הפכה לטקסט היסוד שסביבו נבנו שני התלמודים – הבבלי והירושלמי – וכל ספרות ההלכה שאחריהם, עד ימינו. נוסף על כך, בעצם שימור המחלוקות ודעות היחיד, קיבעה המשנה את עקרון המחלוקת הלגיטימית כחלק ממהות התורה שבעל־פה – רעיון מהפכני שעיצב את תרבות הלימוד היהודית לדורות.</w:t>
+        <w:t xml:space="preserve">המשנה היא החיבור הראשון שהעלה את התורה שבעל־פה מאוסף מסורות מפוזרות לכדי קורפוס ערוך, מוסכם ומחייב – ובכך כונן מחדש את היהדות שלאחר החורבן. השינוי שחוללה כפול. ראשית, היא העמידה את לימוד הטקסט ואת בית המדרש במרכז החיים הדתיים: משחרב המקדש ובטלה עבודת הקרבנות, נעשתה המשנה הציר שסביבו מתארגנים הזיכרון, הסמכות והזהות – "הזיכרון המארגן" של עולם החכמים. שנית, היא יצרה שפה משותפת לעם כולו: המשנה היא התשתית שעליה נבנו שני התלמודים, הבבלי והירושלמי, וכל ספרות ההלכה שאחריהם עד ימינו. ולצד אלה חידוש שלישי, מהפכני לא פחות: בעצם עריכתה כרצף מחלוקות קיבעה המשנה את המחלוקת הלגיטימית – "מחלוקת לשם שמים" – כדרך המלך של התורה שבעל־פה. בניגוד לחתירה לאחידות שאפיינה את האמונה המקראית, בית המדרש מקדש ריבוי דעות וביקורת הדדית ככלי לבירור האמת.</w:t>
       </w:r>
     </w:p>
     <w:p>
@@ -663,7 +663,7 @@
           <w:szCs w:val="24"/>
           <w:rtl/>
         </w:rPr>
-        <w:t xml:space="preserve">דוגמה הממחישה את המהלך הזה היא המשנה הפותחת את מסכת אבות (פרק א, משנה א):</w:t>
+        <w:t xml:space="preserve">דוגמה הממחישה זאת, מתוך דף החברותא על מאפייני המשנה – משנה, מסכת סוכה פרק א, משנה א:</w:t>
       </w:r>
     </w:p>
     <w:p>
@@ -682,27 +682,27 @@
           <w:szCs w:val="24"/>
           <w:rtl/>
         </w:rPr>
-        <w:t xml:space="preserve">"משה קיבל תורה מסיני, ומסרהּ ליהושע, ויהושע לזקנים, וזקנים לנביאים, ונביאים מסרוה לאנשי כנסת הגדולה. הם אמרו שלושה דברים: הוו מתונים בדין, והעמידו תלמידים הרבה, ועשו סייג לתורה."</w:t>
-      </w:r>
-    </w:p>
-    <w:p>
-      <w:pPr>
-        <w:bidi/>
-        <w:spacing w:after="120" w:line="360" w:lineRule="auto"/>
-        <w:jc w:val="both"/>
-      </w:pPr>
-      <w:r>
-        <w:rPr>
-          <w:rFonts w:ascii="David" w:cs="David" w:eastAsia="David" w:hAnsi="David"/>
-          <w:b w:val="false"/>
-          <w:bCs w:val="false"/>
-          <w:i w:val="false"/>
-          <w:iCs w:val="false"/>
-          <w:sz w:val="24"/>
-          <w:szCs w:val="24"/>
-          <w:rtl/>
-        </w:rPr>
-        <w:t xml:space="preserve">משנה זו מנסחת את שלשלת המסירה של התורה שבעל־פה, ובאופן מכוון היא מדלגת על הכהונה ועל המלוכה: החוליות בשרשרת הן משה, יהושע, הזקנים, הנביאים ואנשי כנסת הגדולה – שהחכמים רואים עצמם כממשיכיהם הישירים. זהו בדיוק השינוי שחוללה המשנה: היא מעניקה לגיטימציה לסמכות החכמים ולתורה שבעל־פה עצמה, ומעבירה את מוקד הכובד מן המקדש והכהונה אל בית המדרש, אל הרב ואל תלמידיו ("והעמידו תלמידים הרבה").</w:t>
+        <w:t xml:space="preserve">"סֻכָּה שֶׁהִיא גְבוֹהָה לְמַעְלָה מֵעֶשְׂרִים אַמָּה – פְּסוּלָה; רַבִּי יְהוּדָה מַכְשִׁיר. וְשֶׁאֵינָהּ גְּבוֹהָה עֲשָׂרָה טְפָחִים, וְשֶׁאֵין לָהּ שְׁלֹשָׁה דְּפָנוֹת, וְשֶׁחַמָּתָהּ מְרֻבָּה מִצִּלָּתָהּ – פְּסוּלָה."</w:t>
+      </w:r>
+    </w:p>
+    <w:p>
+      <w:pPr>
+        <w:bidi/>
+        <w:spacing w:after="120" w:line="360" w:lineRule="auto"/>
+        <w:jc w:val="both"/>
+      </w:pPr>
+      <w:r>
+        <w:rPr>
+          <w:rFonts w:ascii="David" w:cs="David" w:eastAsia="David" w:hAnsi="David"/>
+          <w:b w:val="false"/>
+          <w:bCs w:val="false"/>
+          <w:i w:val="false"/>
+          <w:iCs w:val="false"/>
+          <w:sz w:val="24"/>
+          <w:szCs w:val="24"/>
+          <w:rtl/>
+        </w:rPr>
+        <w:t xml:space="preserve">במשנה קצרה זו ניכרים כל החידושים שמנינו: היא פותחת מסכת שלמה המוקדשת לנושא אחד – הסוכה – בלא זיקה לסדר הפסוקים; לשונה פסקנית ומדודה, קובעת שיעורים מספריים מדויקים בלא כל הנמקה; והיא משמרת בגוף ההלכה את דעת היחיד החולק – "רבי יהודה מכשיר" – בלא הכרעה מנומקת ובלא מחיקת הדעה שנדחתה. כך נראה השינוי שחוללה המשנה הלכה למעשה: חוק מקיף ומאורגן, שהמחלוקת אינה תקלה בו אלא חלק ממהותו – והוא שהזמין את הדורות הבאים, בתלמודים ואילך, להמשיך ולדון בו.</w:t>
       </w:r>
     </w:p>
     <w:p>
@@ -762,7 +762,7 @@
           <w:szCs w:val="24"/>
           <w:rtl/>
         </w:rPr>
-        <w:t xml:space="preserve">הקטע מבוסס על אגדת קמצא ובר קמצא, סיפור החורבן המפורסם שבתלמוד הבבלי, מסכת גיטין דף נה ע"ב – נו ע"א:</w:t>
+        <w:t xml:space="preserve">הקטע מבוסס על אגדת יציאתו של רבן יוחנן בן זכאי (ריב"ז) מירושלים הנצורה, תלמוד בבלי, מסכת גיטין דף נו ע"א–ע"ב, כפי שנלמדה ביחידה "צמיחה מתוך משבר". להלן החלקים הרלוונטיים בתרגום לעברית:</w:t>
       </w:r>
     </w:p>
     <w:p>
@@ -781,27 +781,7 @@
           <w:szCs w:val="24"/>
           <w:rtl/>
         </w:rPr>
-        <w:t xml:space="preserve">"אקמצא ובר קמצא חרוב ירושלים... ההוא גברא דרחמיה קמצא ובעל דבביה בר קמצא, עבד סעודתא. אמר ליה לשמעיה: זיל אייתי לי קמצא. אזל אייתי ליה בר קמצא. אתא, אשכחיה דהוה יתיב. אמר ליה: ...קום פוק! אמר ליה: הואיל ואתאי – שבקן, ויהיבנא לך דמי מה דאכילנא ושתינא... יהיבנא לך דמי פלגא דסעודתיך... יהיבנא לך דמי כולה סעודתיך! ...נקטיה בידיה ואוקמיה ואפקיה. אמר: הואיל והוו יתבי רבנן ולא מחו ביה – שמע מינה קא ניחא להו; איזיל איכול בהו קורצא בי מלכא."</w:t>
-      </w:r>
-    </w:p>
-    <w:p>
-      <w:pPr>
-        <w:bidi/>
-        <w:spacing w:after="120" w:line="360" w:lineRule="auto"/>
-        <w:jc w:val="both"/>
-      </w:pPr>
-      <w:r>
-        <w:rPr>
-          <w:rFonts w:ascii="David" w:cs="David" w:eastAsia="David" w:hAnsi="David"/>
-          <w:b w:val="false"/>
-          <w:bCs w:val="false"/>
-          <w:i w:val="false"/>
-          <w:iCs w:val="false"/>
-          <w:sz w:val="24"/>
-          <w:szCs w:val="24"/>
-          <w:rtl/>
-        </w:rPr>
-        <w:t xml:space="preserve">ובתרגום: בגלל קמצא ובר קמצא חרבה ירושלים. מעשה באדם שאוהבו נקרא קמצא ושונאו בר קמצא, שעשה סעודה ואמר לשמשו: לך הבא לי את קמצא. הלך השמש והביא בטעות את בר קמצא. כשמצאו המארח יושב בסעודה, ציווה עליו לקום ולצאת. ביקש בר קמצא: הואיל ובאתי – הניחני, ואשלם לך את דמי מה שאוכל ואשתה; ואף את דמי חצי הסעודה; ואף את דמי הסעודה כולה. המארח סירב, אחז בו והוציאו בבושת פנים. אמר בר קמצא: הואיל וישבו שם חכמים ולא מיחו בו – משמע שהדבר נוח להם; אלך ואלשין עליהם לפני הקיסר. מכאן מתגלגל הסיפור אל הקרבן ששלח הקיסר, אל המום שהטיל בו בר קמצא, ואל הכרעת החכמים שלא להקריבו – שעליה נאמר: "ענוותנותו של רבי זכריה בן אבקולס החריבה את ביתנו".</w:t>
+        <w:t xml:space="preserve">"אבא סיקרא, ראש בריוני ירושלים, בן אחותו של רבן יוחנן בן זכאי היה. שלח לו [רבן יוחנן]: בוא אלי בצנעה. בא. אמר לו: עד מתי תעשו כך ותהרגו את העולם ברעב? אמר לו: מה אעשה? שאם אומר להם כך – יהרגו אותי. אמר לו: אני רואה תקנה בשבילי, שאצא [מן העיר]; אפשר שתהיה בזה הצלה מועטה... עשה רבן יוחנן כך [העמיד פני מת]: נכנס תחתיו רבי אליעזר מצד אחד ורבי יהושע מצד אחר. כשהגיעו לפתח [השער] רצו [הבריונים] לדקור אותו. אמר להם: יאמרו "את רבם דקרו"!... פתחו את השער, יצא. כשהגיע לשם אמר: שלום עליך המלך, שלום עליך המלך!... [משנתבשר אספסיינוס כי הוכתר לקיסר, אמר:] הולך אני, ואיש אחר אשלח תחתיי; אלא בקש ממני דבר ואתן לך. אמר לו: תן לי יבנה וחכמיה, ושושלת רבן גמליאל, ורופאים שירפאו את רבי צדוק. קרא עליו רב יוסף, ויש אומרים רבי עקיבא: 'מֵשִׁיב חֲכָמִים אָחוֹר וְדַעְתָּם יְסַכֵּל' – היה לו לומר לו שיניח להם הפעם."</w:t>
       </w:r>
     </w:p>
     <w:p>
@@ -841,27 +821,27 @@
           <w:szCs w:val="24"/>
           <w:rtl/>
         </w:rPr>
-        <w:t xml:space="preserve">שלושה דמיונות: (1) הסרט נאמן לשלד העלילה של האגדה – טעות השליח בין קמצא לבר קמצא, גילוי האורח הלא־רצוי בסעודה וגירושו המשפיל; (2) שלוש הצעותיו המדורגות של בר קמצא – לשלם על מה שיאכל, על חצי הסעודה ועל כולה – מופיעות בסרט כלשונן, והן שמעצימות את אכזריות הסירוב; (3) שתיקת החכמים המסובים בסעודה, שאינם מוחים, היא בסרט כמו במדרש הרגע המכריע שמוליד את ההלשנה לשלטון הרומי ואת שרשרת האירועים המובילה לחורבן.</w:t>
-      </w:r>
-    </w:p>
-    <w:p>
-      <w:pPr>
-        <w:bidi/>
-        <w:spacing w:after="120" w:line="360" w:lineRule="auto"/>
-        <w:jc w:val="both"/>
-      </w:pPr>
-      <w:r>
-        <w:rPr>
-          <w:rFonts w:ascii="David" w:cs="David" w:eastAsia="David" w:hAnsi="David"/>
-          <w:b w:val="false"/>
-          <w:bCs w:val="false"/>
-          <w:i w:val="false"/>
-          <w:iCs w:val="false"/>
-          <w:sz w:val="24"/>
-          <w:szCs w:val="24"/>
-          <w:rtl/>
-        </w:rPr>
-        <w:t xml:space="preserve">שלושה הבדלים: (1) הטקסט התלמודי לקוני ואנונימי – בעל הסעודה אינו נקרא בשם ואיננו יודעים דבר על רקע האיבה; הסרט, לעומת זאת, מעניק לדמויות פנים, שמות ומניעים, ושוזר את הסעודה בתוך עלילה רחבה של ירושלים ערב המרד – הקנאים, העשירים והמנהיגות; (2) אמצעי המבע שונה בתכלית: המדרש הוא טקסט מילולי חסכני, ואילו הסרט מספר את הסיפור באנימציה ייחודית המבוססת על ציורי אמנות קלאסיים, ומוסיף מוזיקה, קול ודיאלוגים שאינם במקור; (3) מוקד האשמה: המדרש מדגיש את האחריות הדתית־מנהיגותית ("ענוותנותו של רבי זכריה בן אבקולס"), ואילו הסרט מבליט את הפער החברתי־מעמדי בין עשירי ירושלים הסועדים לבין העם, ואת ההקשר הפוליטי של ערב החורבן.</w:t>
+        <w:t xml:space="preserve">שלושה דמיונות: (1) הסרט נאמן לשלד העלילה של האגדה: הפגישה החשאית בין ריב"ז לבין בן אחותו, מנהיג הבריונים; ההכרה שהקנאות מרעיבה את העיר; והתחבולה – ריב"ז מעמיד פני מת ומוצא מן העיר בארון, הנישא בידי תלמידיו רבי אליעזר ורבי יהושע. (2) המתח בשער העיר – שומרי הבריונים המבקשים לוודא שאכן מת מוטל בארון, והבלימה בטענת כבוד הרב ("יאמרו: את רבם דקרו") – מומחז בסרט כרוחו של המקור. (3) המפגש עם אספסיינוס נבנה כבמדרש: הפנייה המפתיעה "שלום עליך המלך", בשורת ההכתרה המגיעה בעיצומו של המפגש והופכת את הנביא-לכאורה לבן שיח מועדף, והבקשה שבשיא הסצנה – "תן לי יבנה וחכמיה".</w:t>
+      </w:r>
+    </w:p>
+    <w:p>
+      <w:pPr>
+        <w:bidi/>
+        <w:spacing w:after="120" w:line="360" w:lineRule="auto"/>
+        <w:jc w:val="both"/>
+      </w:pPr>
+      <w:r>
+        <w:rPr>
+          <w:rFonts w:ascii="David" w:cs="David" w:eastAsia="David" w:hAnsi="David"/>
+          <w:b w:val="false"/>
+          <w:bCs w:val="false"/>
+          <w:i w:val="false"/>
+          <w:iCs w:val="false"/>
+          <w:sz w:val="24"/>
+          <w:szCs w:val="24"/>
+          <w:rtl/>
+        </w:rPr>
+        <w:t xml:space="preserve">שלושה הבדלים: (1) הדמויות: בבבלי האחיין הוא "אבא סיקרא", דמות לקונית המופיעה בתמונה אחת; הסרט (ההולך כאן בעקבות גרסת איכה רבה) קורא לו בן בטיח והופכו לגיבור ראשי בעל עלילה, פנים וקול – ובכלל, מה שהתלמוד מוסר במשפטים ספורים נפרש בסרט לדיאלוגים ולרגש. (2) ההקשר ואמצעי המבע: הסרט שוזר את הבריחה בעלילה רחבה של מלחמת האחים – שריפת האסמים והרעב מוצגים חזותית ובאכזריות – והכול מסופר בהנפשה ייחודית של ציורי אמנות קלאסיים בליווי מוזיקה; האגדה, לעומת זאת, חסכנית ומאופקת. (3) מה שהסרט משמיט: קול הביקורת הפנים־תלמודי – קריאתם של רב יוסף או רבי עקיבא "משיב חכמים אחור" על שלא ביקש על ירושלים עצמה – וכן פירוט שלוש הבקשות וסיפור ריפויו של רבי צדוק, מצטמצמים או נעדרים; הסרט מניח לצופה לשפוט בעצמו את הכרעת ריב"ז.</w:t>
       </w:r>
     </w:p>
     <w:p>
@@ -901,7 +881,7 @@
           <w:szCs w:val="24"/>
           <w:rtl/>
         </w:rPr>
-        <w:t xml:space="preserve">על פי המאמר שנלמד בקורס על אגדות החורבן [להשלים את שם המאמר מן הסילבוס], יש לקרוא את הסיפור לא כתיאור היסטורי של סיבת החורבן אלא כסיפור מכונן שבו חז"ל עורכים חשבון נפש פנימי. האשמה בסיפור אינה מופנית כלפי רומא וכוחה הצבאי – הרומאים כמעט שאינם נוכחים בו – אלא כלפי החברה היהודית עצמה: המארח שאינו מסוגל למחול, בר קמצא שכבודו הפגוע יקר לו מגורל עמו, והחכמים היושבים ושותקים. הביקורת החריפה ביותר מופנית דווקא כלפי עולמם של חז"ל עצמם: "הוו יתבי רבנן ולא מחו" – מנהיגות רוחנית שנכשלה בשעת מבחן מוסרית, ובהמשך גם נכשלה בהכרעה ההלכתית, כשהזהירות הפורמלית של רבי זכריה בן אבקולס גברה על שיקול הדעת ההצלתי. כך הופך הסיפור למדרש של אחריות: החורבן איננו גזירת גורל חיצונית אלא תוצר של שנאת חינם, של השפלה פומבית ושל שתיקת הרואים.</w:t>
+        <w:t xml:space="preserve">במאמרה "רבן יוחנן בן זכאי והקמת יבנה: ניתוח והערכת הסיפור בראי הזמן" מציעה דליה מרקס לקרוא את האגדה כ"סיפור של מעתק": רגע המעבר ממציאות שבה יש לעם מרכז פולחני בירושלים אל מציאות שדרשה מציאת קדושה בדרכים חדשות ומהפכניות – והאגדה, היא מדגישה, אינה רק מתארת את המעבר אלא יוצרת אותו ומְמַשמעת אותו. בעקבות ג'ונתן רוזן היא רואה במסע בארון המתים הוצאה אל הפועל, סמלית, של שינוי הצורה שעברה היהדות: היהודים "מתו" כעם של הגוף, של הארץ ושל פולחן המקדש – ונולדו מחדש כעם הספר. ריב"ז חייב למות מוות סמלי כדי שמשהו חדש יוכל להיוולד; היציאה בארון היא ההרפיה מן האחיזה בירושלים שדינה נגזר. על הבקשה "תן לי יבנה וחכמיה" מראה מרקס (בעקבות שרמר) כי היא מעמידה את שכבת החכמים כהנהגת העם: "יבנה וחכמיה" באה תחת "ירושלים ובית מקדשה", ומעתה האחריות לגורל העם מופקדת בידי החכמים. ואף הביקורת התלמודית משתלבת בקריאה זו: העמדת רב יוסף ורבי עקיבא – זה מבבל וזה מדור מרד בר כוכבא, שבחר בדרך ההפוכה – מציבה מול הכרעת ריב"ז שני עולמות חלופיים, ומלמדת שהתלמוד עצמו הנציח את הסיפור יחד עם המחלוקת עליו.</w:t>
       </w:r>
     </w:p>
     <w:p>
@@ -941,7 +921,7 @@
           <w:szCs w:val="24"/>
           <w:rtl/>
         </w:rPr>
-        <w:t xml:space="preserve">המדרש הזה הוא לדעתי הנלמד ביותר עד ימינו משום שהוא מעביר את שאלת החורבן מן המישור הצבאי־פוליטי אל המישור שבו לכל אדם יש אחריות: יחסים בין אדם לחברו. המסר שלו על־זמני – חברה שבה השפלה פומבית אפשרית, שבה שנאה אישית גוברת על טובת הכלל, ושבה הרוב הצופה שותק, היא חברה המכלה את עצמה מבפנים, גם בלא אויב חיצוני. בעידן של שיח ציבורי מקוטב ושל "סעודות" וירטואליות שבהן קל להשפיל אדם לעיני כול, השאלה "היכן היו היושבים ולמה לא מיחו" נוקבת מתמיד. הסיפור נלמד מדי שנה בתשעה באב ובמערכת החינוך דווקא משום שהוא אינו מרשיע את "האחר" אלא מציב מראה: החורבן מתחיל בסעודה אחת, בעלבון אחד, בשתיקה אחת.</w:t>
+        <w:t xml:space="preserve">המדרש הזה הוא בעיניי מן הנלמדים ביותר עד היום משום שהוא הסיפור המכונן של "צמיחה מתוך משבר" – הציר שסביבו נבנתה היהדות הרבנית כולה. יבנה הפכה, כדברי מרקס, לארכיטיפ תודעתי: כל מקום תורה שתלמידים נוהרים אליו הוא בחזקת יבנה. הסיפור מעמיד דגם מנהיגות על־זמני: מול הקנאות המקדשת מלחמה עד כלות, ריב"ז מציג פרגמטיזם מציל – היכולת לוותר על היקר מכול כדי להציל את מה שניתן, ולתרגם חורבן לבניין. לא במקרה, כפי שמראה מרקס, שבו דורות שונים ויצקו אל הסיפור את עולמם: מורים אחרי השואה ראו ביבנה את ניצחון הלימוד על הכוח, ובוויכוחים ציבוריים בישראל – עד ימינו – נאבקים תומכים ומבקרים על דמותו של ריב"ז, בין "מייסד יהדות בית המדרש" לבין מי שוויתר על ירושלים. ודווקא העמימות הזו, שהתלמוד עצמו שימר בביקורת "משיב חכמים אחור", היא סוד כוחו: הוא אינו מוסר חד־משמעי אלא מראה – לאומה ולכל יחיד המקים את חייו מן החורבות.</w:t>
       </w:r>
     </w:p>
     <w:p>
@@ -981,7 +961,7 @@
           <w:szCs w:val="24"/>
           <w:rtl/>
         </w:rPr>
-        <w:t xml:space="preserve">בחרתי במקור הראשון: סיפור תחילתו של רבי אליעזר בן הורקנוס (פרקי דרבי אליעזר, פרקים א–ב; ומקבילות באבות דרבי נתן נוסח א ובמדרשים נוספים).</w:t>
+        <w:t xml:space="preserve">בחרתי במקור הראשון: סיפור תחילתו של רבי אליעזר בן הורקנוס (פרקי דרבי אליעזר, פרקים א–ב, ומקבילות באבות דרבי נתן נוסח א ובמדרשים נוספים), שנלמד בדף החברותא "איך נעשים חכמ.ה".</w:t>
       </w:r>
     </w:p>
     <w:p>
@@ -1021,7 +1001,7 @@
           <w:szCs w:val="24"/>
           <w:rtl/>
         </w:rPr>
-        <w:t xml:space="preserve">הסיפור מתאר את ראשית דרכו של מי שיהיה מגדולי התנאים. אליעזר הוא בן עשרים ושתיים שלא למד תורה מעולם, בן לאב עשיר בעל שדות רבים. בעוד אחיו חורשים באדמה הפורייה ("על גבי המענה"), הוא נשלח לחרוש בקרקע הקשה, בטרשים – והוא יושב ובוכה. אביו סבור שהבכי הוא על תנאי העבודה ומיטיב עמו, אך הבכי נמשך, שכן מקורו אחר לגמרי: כמיהה ללמוד תורה. אליעזר עוזב את בית אביו ואת עושרו ובא לפני רבן יוחנן בן זכאי, שם הוא מודה בבושה שלא למד דבר מימיו, ומתחיל מבראשית – קריאת שמע, תפילה, ברכת המזון ושתי הלכות ביום – תוך מסירות קיצונית, עד כדי שמונה ימים בלא אוכל. שיא הסיפור בהיפוך הגמור: הבור שלא ידע דבר עומד ודורש "דברים שלא שמעתם אוזן מעולם", פניו מאירות כאור החמה וקרניו יוצאות כקרנותיו של משה. רבן יוחנן בן זכאי מנשקו על ראשו וקורא: "אשריכם אברהם יצחק ויעקב שיצא זה מחלציכם!" – והורקנוס האב, שנכח במעמד, מתקן: "אשרי אני שיצא זה מחלצי", ובכך מבטא את היפוך לבו: מאב שבנו נראה לו כפחוּת שבבניו, לאב המתגאה בו יותר מכול.</w:t>
+        <w:t xml:space="preserve">הסיפור מתאר את ראשית דרכו של מי שיהיה מגדולי התנאים – ומתחיל דווקא בכישלון: אליעזר הוא בן עשרים ושתיים שלא למד תורה מעולם, בן לאב עשיר בעל שדות. בעוד אחיו חורשים באדמה הפורייה, הוא נשלח לחרוש בטרשים – ובוכה. האב מפרש את הבכי כקובלנה על תנאי העבודה ומיטיב עמו, אך הבכי נמשך, שכן מקורו אחר: "שאני מבקש ללמוד תורה". האב לועג – בן עשרים ושתיים ואתה מבקש ללמוד?! – ואליעזר בורח מבית אביו אל בית מדרשו של רבן יוחנן בן זכאי בירושלים. שם הוא לומד מבראשית – קריאת שמע, תפילה, ברכת המזון, שתי הלכות ביום – ברעב ובמסירות קיצונית, שמונה ימים בלא מזון, עד שריח פיו מסגיר אותו והרב מגלה את גדול תלמידיו העתידי דווקא בתלמיד המורעב והבוש. שיא הסיפור בהיפוך כפול: הורקנוס עולה לירושלים להדיר את בנו מנכסיו, ומוצא אותו דורש "דברים שלא שמעתם אוזן מעולם", פניו מאירות "וקרנותיו יוצאות כקרנותיו של משה"; ריב"ז מנשקו וקורא "אשריכם אברהם יצחק ויעקב שיצא זה מחלציכם", והאב, שבא לנשל – עומד ומוריש לו את כל נכסיו. אליעזר, בתשובתו, מסרב לראות בנכסים תכלית: "לא ביקשתי מלפני הקדוש ברוך הוא אלא תורה בלבד".</w:t>
       </w:r>
     </w:p>
     <w:p>
@@ -1061,47 +1041,47 @@
           <w:szCs w:val="24"/>
           <w:rtl/>
         </w:rPr>
-        <w:t xml:space="preserve">ראשית, הקטע מבטא את המגמה המרכזית של התקופה: העמדת תלמוד התורה כערך עליון הפתוח לכול. הסמכות והכבוד בעולמם של חז"ל אינם נקנים בייחוס, בגיל או בממון – אליעזר מתחיל ללמוד בגיל עשרים ושתיים, יוצא מבית עשיר דווקא אל חיי רעב, והתורה היא שמעניקה לו את מעמדו. הסיפור אף מעמיד במפגיע את עולם הרכוש (שדות, חרישה, ירושה) מול עולם התורה, ומכריע לטובת האחרון.</w:t>
-      </w:r>
-    </w:p>
-    <w:p>
-      <w:pPr>
-        <w:bidi/>
-        <w:spacing w:after="120" w:line="360" w:lineRule="auto"/>
-        <w:jc w:val="both"/>
-      </w:pPr>
-      <w:r>
-        <w:rPr>
-          <w:rFonts w:ascii="David" w:cs="David" w:eastAsia="David" w:hAnsi="David"/>
-          <w:b w:val="false"/>
-          <w:bCs w:val="false"/>
-          <w:i w:val="false"/>
-          <w:iCs w:val="false"/>
-          <w:sz w:val="24"/>
-          <w:szCs w:val="24"/>
-          <w:rtl/>
-        </w:rPr>
-        <w:t xml:space="preserve">שנית, ניכרת בקטע מגמת עיצובו של החכם כדמות המופת החדשה, היורשת את דגמי ההנהגה הישנים: תיאורו של אליעזר הדורש – "פניו מאירות כאור החמה וקרנותיו יוצאות כקרנותיו של משה" – שואל במכוון את דמותו של משה היורד מסיני (שמות לד). החכם הדורש בבית המדרש מוצג כממשיכה של ההתגלות עצמה, וחידוש בתורה ("דברים שלא שמעתם אוזן מעולם") נתפס כערך דתי עליון.</w:t>
-      </w:r>
-    </w:p>
-    <w:p>
-      <w:pPr>
-        <w:bidi/>
-        <w:spacing w:after="120" w:line="360" w:lineRule="auto"/>
-        <w:jc w:val="both"/>
-      </w:pPr>
-      <w:r>
-        <w:rPr>
-          <w:rFonts w:ascii="David" w:cs="David" w:eastAsia="David" w:hAnsi="David"/>
-          <w:b w:val="false"/>
-          <w:bCs w:val="false"/>
-          <w:i w:val="false"/>
-          <w:iCs w:val="false"/>
-          <w:sz w:val="24"/>
-          <w:szCs w:val="24"/>
-          <w:rtl/>
-        </w:rPr>
-        <w:t xml:space="preserve">שלישית, הקטע משקף את התגבשות מוסד בית המדרש ויחסי הרב והתלמיד כמסגרת המרכזית של התקופה: הלימוד מדורג ושיטתי (מקריאת שמע ועד שתי הלכות ביום וחזרה עליהן בשבת), הרב קשוב לתלמידו ואף מריח את ריח פיו של התלמיד המורעב, והקשר ביניהם מתואר במונחים של קרבה משפחתית – נשיקה על הראש – עד שהרב כמו תופס את מקום האב.</w:t>
+        <w:t xml:space="preserve">ראשית, הסיפור מגלם את הציר המרכזי שנלמד בקורס – המרכז עובר מבית המקדש אל בית המדרש, וממוקד הקדושה שבמקום אל האדם (כניתוחו של יאיר לורברבוים במאמר "ממקדש לאדם"). גיבור הסיפור אינו כהן ואינו בעל אחוזה: הדרמה כולה מתרחשת בין שדה חרוש לבית מדרש, והקדושה מתגלה בלימודו של אדם אחד. הערכים המקודשים של העולם הישן – אדמה, ירושה, ממון – מוצבים במפורש מול התורה, ומוכרעים: "אילו קרקעות ביקשתי... אילו כסף וזהב ביקשתי... לא ביקשתי אלא תורה בלבד".</w:t>
+      </w:r>
+    </w:p>
+    <w:p>
+      <w:pPr>
+        <w:bidi/>
+        <w:spacing w:after="120" w:line="360" w:lineRule="auto"/>
+        <w:jc w:val="both"/>
+      </w:pPr>
+      <w:r>
+        <w:rPr>
+          <w:rFonts w:ascii="David" w:cs="David" w:eastAsia="David" w:hAnsi="David"/>
+          <w:b w:val="false"/>
+          <w:bCs w:val="false"/>
+          <w:i w:val="false"/>
+          <w:iCs w:val="false"/>
+          <w:sz w:val="24"/>
+          <w:szCs w:val="24"/>
+          <w:rtl/>
+        </w:rPr>
+        <w:t xml:space="preserve">שנית, ניכרת המגמה שנלמדה ביחידה "מנביא לחכם" – שינוי תפיסת ההנהגה ממלך, כהן ונביא אל תלמיד החכם. תיאורו של אליעזר הדורש – "פניו מאירות כאור החמה וקרנותיו יוצאות כקרנותיו של משה" – שואל במכוון את דמות משה היורד מסיני, ומעמיד את הדרשן בבית המדרש כממשיכה של ההתגלות: החכם, שנטלה הנבואה וניתנה לו, מחדש "דברים שלא שמעתם אוזן מעולם" – והחידוש הפרשני תופס את מקום ההתגלות הישירה.</w:t>
+      </w:r>
+    </w:p>
+    <w:p>
+      <w:pPr>
+        <w:bidi/>
+        <w:spacing w:after="120" w:line="360" w:lineRule="auto"/>
+        <w:jc w:val="both"/>
+      </w:pPr>
+      <w:r>
+        <w:rPr>
+          <w:rFonts w:ascii="David" w:cs="David" w:eastAsia="David" w:hAnsi="David"/>
+          <w:b w:val="false"/>
+          <w:bCs w:val="false"/>
+          <w:i w:val="false"/>
+          <w:iCs w:val="false"/>
+          <w:sz w:val="24"/>
+          <w:szCs w:val="24"/>
+          <w:rtl/>
+        </w:rPr>
+        <w:t xml:space="preserve">שלישית, הסיפור משקף את האתוס שמעמדו של חכם נקנה בלימוד ואינו עובר בירושה ואינו תלוי בגיל, בממון או בייחוס: אליעזר מתחיל מאפס בגיל עשרים ושתיים, בניגוד לרצון אביו העשיר, ומעמדו החדש נבנה כולו בתוך המסגרת המכוננת של התקופה – בית המדרש ויחסי הרב והתלמיד: לימוד מדורג ושיטתי, רב הקשוב לתלמידו עד כדי הבחנה בריח פיו, וקרבה הנמסרת בנשיקה על הראש – הרב כמו נעשה אב.</w:t>
       </w:r>
     </w:p>
     <w:p>
@@ -1121,67 +1101,172 @@
           <w:szCs w:val="24"/>
           <w:rtl/>
         </w:rPr>
-        <w:t xml:space="preserve">ג. הרחבה על דמות מן הקטע – רבן יוחנן בן זכאי</w:t>
-      </w:r>
-    </w:p>
-    <w:p>
-      <w:pPr>
-        <w:bidi/>
-        <w:spacing w:after="120" w:line="360" w:lineRule="auto"/>
-        <w:jc w:val="both"/>
-      </w:pPr>
-      <w:r>
-        <w:rPr>
-          <w:rFonts w:ascii="David" w:cs="David" w:eastAsia="David" w:hAnsi="David"/>
-          <w:b w:val="false"/>
-          <w:bCs w:val="false"/>
-          <w:i w:val="false"/>
-          <w:iCs w:val="false"/>
-          <w:sz w:val="24"/>
-          <w:szCs w:val="24"/>
-          <w:rtl/>
-        </w:rPr>
-        <w:t xml:space="preserve">רבן יוחנן בן זכאי (ריב"ז), רבו של אליעזר בסיפורנו, הוא מגדולי מעצביה של היהדות שלאחר החורבן, ודמותו נלמדה במפגשים ממקורות נוספים. באבות דרבי נתן (נוסח א, פרק ד) מסופר על יציאתו מירושלים הנצורה: כשראה שהקנאים אינם מניחים לצאת מן העיר, הוציאוהו תלמידיו רבי אליעזר ורבי יהושע בארון מתים, וכשהגיע אל אספסיינוס ניבא לו שעתיד הוא למלוך, וביקש ממנו את יבנה וחכמיה. זהו ריב"ז המנהיג הפרגמטי: בשעה שהקנאים בחרו במלחמה עד כלות, הוא בחר להציל את מה שניתן להציל – את עולם התורה – והקים ביבנה את המרכז שממנו קמה היהדות מחורבנה.</w:t>
-      </w:r>
-    </w:p>
-    <w:p>
-      <w:pPr>
-        <w:bidi/>
-        <w:spacing w:after="120" w:line="360" w:lineRule="auto"/>
-        <w:jc w:val="both"/>
-      </w:pPr>
-      <w:r>
-        <w:rPr>
-          <w:rFonts w:ascii="David" w:cs="David" w:eastAsia="David" w:hAnsi="David"/>
-          <w:b w:val="false"/>
-          <w:bCs w:val="false"/>
-          <w:i w:val="false"/>
-          <w:iCs w:val="false"/>
-          <w:sz w:val="24"/>
-          <w:szCs w:val="24"/>
-          <w:rtl/>
-        </w:rPr>
-        <w:t xml:space="preserve">באותו פרק באבות דרבי נתן מובא גם המעשה המכונן שלאחר החורבן: כשהיה רבי יהושע מצטער על בית המקדש החרב, מקום כפרת עוונותיהם של ישראל, אמר לו ריב"ז: "אל ירע לך – יש לנו כפרה אחת שהיא כמותה: גמילות חסדים, שנאמר כי חסד חפצתי ולא זבח". כאן ריב"ז הוא המנהיג הרוחני של המשבר, שאינו מכחיש את האובדן אלא מתרגם אותו: את עבודת הקרבנות מחליפים החסד, התפילה והלימוד.</w:t>
-      </w:r>
-    </w:p>
-    <w:p>
-      <w:pPr>
-        <w:bidi/>
-        <w:spacing w:after="120" w:line="360" w:lineRule="auto"/>
-        <w:jc w:val="both"/>
-      </w:pPr>
-      <w:r>
-        <w:rPr>
-          <w:rFonts w:ascii="David" w:cs="David" w:eastAsia="David" w:hAnsi="David"/>
-          <w:b w:val="false"/>
-          <w:bCs w:val="false"/>
-          <w:i w:val="false"/>
-          <w:iCs w:val="false"/>
-          <w:sz w:val="24"/>
-          <w:szCs w:val="24"/>
-          <w:rtl/>
-        </w:rPr>
-        <w:t xml:space="preserve">ולבסוף, במשנה אבות (פרק ב, משניות ח–ט) מצטייר ריב"ז המחנך: "חמישה תלמידים היו לו לרבן יוחנן בן זכאי", והוא מונה את שבחו הייחודי של כל אחד מהם – ובראשם דווקא גיבור סיפורנו: "אליעזר בן הורקנוס – בור סוּד שאינו מאבד טיפה". הרב שידע לקבל אל בית מדרשו בן עשרים ושתיים שלא למד דבר, יודע גם להגדיר במדויק את כישרונו של כל תלמיד. משלושת המקורות עולה דמות אחת עקבית: מנהיג של שעת משבר, המקדים חזון ארוך־טווח לכבוד רגעי, ומחנך הרואה את האדם היחיד – אותה רגישות עצמה שבזכותה הבחין בבכיו של חורש הטרשים והצמיח ממנו את גדול הדור.</w:t>
+        <w:t xml:space="preserve">ג. הרחבה על דמות מן הקטע – רבי אליעזר בן הורקנוס</w:t>
+      </w:r>
+    </w:p>
+    <w:p>
+      <w:pPr>
+        <w:bidi/>
+        <w:spacing w:after="120" w:line="360" w:lineRule="auto"/>
+        <w:jc w:val="both"/>
+      </w:pPr>
+      <w:r>
+        <w:rPr>
+          <w:rFonts w:ascii="David" w:cs="David" w:eastAsia="David" w:hAnsi="David"/>
+          <w:b w:val="false"/>
+          <w:bCs w:val="false"/>
+          <w:i w:val="false"/>
+          <w:iCs w:val="false"/>
+          <w:sz w:val="24"/>
+          <w:szCs w:val="24"/>
+          <w:rtl/>
+        </w:rPr>
+        <w:t xml:space="preserve">את דמותו של רבי אליעזר עצמו פגשנו במקורות נוספים במפגשים, והם מצטרפים לדיוקן עקבי ומרתק. במשנה, מסכת אבות פרק ב, משנה ח – שנלמדה ביחידה "צמיחה מתוך משבר" – מונה רבן יוחנן בן זכאי את חמשת תלמידיו ומגדיר את שבחו: "אליעזר בן הורקנוס – בור סוּד שאינו מאבד טיפה". הדימוי מתכתב להפליא עם סיפור תחילתו: כשנדרש לדרוש לפני רבו השיב "משל לבור שאינו יכול להוציא מים יותר ממה שהוא מכניס – כך אין אני יכול לומר דברי תורה יותר ממה שקיבלתי ממך". רבי אליעזר הוא אפוא איש המסורת בהתגלמותו: כוחו בשימור מדוקדק של מה שקיבל, לא בהמצאה. ובהמשך שם (משנה ט), כשנשאלים התלמידים "איזוהי דרך טובה שידבק בה האדם", תשובתו – "עין טובה".</w:t>
+      </w:r>
+    </w:p>
+    <w:p>
+      <w:pPr>
+        <w:bidi/>
+        <w:spacing w:after="120" w:line="360" w:lineRule="auto"/>
+        <w:jc w:val="both"/>
+      </w:pPr>
+      <w:r>
+        <w:rPr>
+          <w:rFonts w:ascii="David" w:cs="David" w:eastAsia="David" w:hAnsi="David"/>
+          <w:b w:val="false"/>
+          <w:bCs w:val="false"/>
+          <w:i w:val="false"/>
+          <w:iCs w:val="false"/>
+          <w:sz w:val="24"/>
+          <w:szCs w:val="24"/>
+          <w:rtl/>
+        </w:rPr>
+        <w:t xml:space="preserve">פן אחר, מעורר מחלוקת, פגשנו במפגש על לימוד תורה לנשים: במשנה סוטה פרק ג, משנה ד, מול בן עזאי הקובע "חייב אדם ללמד את בתו תורה", מציב רבי אליעזר את העמדה המחמירה: "כל המלמד את בתו תורה – כאילו מלמדה תפלות"; והבבלי (סוטה כא ע"ב) מטעים את דבריו בדרשת רבי אבהו "כיוון שנכנסה חכמה באדם נכנסה עמו ערמומית". בעקבות דיונו של דניאל בויארין בפרק "הבשר שברוח" למדנו לראות במחלוקת זו מאבק עקרוני על גבולות בית המדרש ועל השאלה מי שותף ל"תאוות הלימוד". וכאן מתחדד הפרדוקס של הדמות: האיש שפרץ בעצמו כל גבול כדי להיכנס לבית המדרש – בגיל מאוחר, נגד אביו, כנגד כל הסיכויים – הוא הנועל את שעריו בפני נשים; שומר הסף הגדול של המסורת, ה"בור הסוד", מבקש לשמר גם את גבולותיה החברתיים. ראוי להזכיר עוד כי בסיפור תחילתו של רבי עקיבא, שנלמד באותו דף חברותא, יושב רבי עקיבא שנים "לפני רבי אליעזר" – הבור הסוד נעשה בעצמו רבו של גדול הדרשנים; וכי אשתו, אמא שלום אחות רבן גמליאל, נזכרה אף היא במקורות שנלמדו במפגש על הנשים הלומדות.</w:t>
+      </w:r>
+    </w:p>
+    <w:p>
+      <w:r>
+        <w:br w:type="page"/>
+      </w:r>
+    </w:p>
+    <w:p>
+      <w:pPr>
+        <w:bidi/>
+        <w:spacing w:after="120" w:before="240" w:line="360" w:lineRule="auto"/>
+        <w:jc w:val="right"/>
+      </w:pPr>
+      <w:r>
+        <w:rPr>
+          <w:rFonts w:ascii="David" w:cs="David" w:eastAsia="David" w:hAnsi="David"/>
+          <w:b/>
+          <w:bCs/>
+          <w:i w:val="false"/>
+          <w:iCs w:val="false"/>
+          <w:sz w:val="28"/>
+          <w:szCs w:val="28"/>
+          <w:rtl/>
+        </w:rPr>
+        <w:t xml:space="preserve">ביבליוגרפיה</w:t>
+      </w:r>
+    </w:p>
+    <w:p>
+      <w:pPr>
+        <w:bidi/>
+        <w:spacing w:after="120" w:line="360" w:lineRule="auto"/>
+        <w:jc w:val="right"/>
+      </w:pPr>
+      <w:r>
+        <w:rPr>
+          <w:rFonts w:ascii="David" w:cs="David" w:eastAsia="David" w:hAnsi="David"/>
+          <w:b w:val="false"/>
+          <w:bCs w:val="false"/>
+          <w:i w:val="false"/>
+          <w:iCs w:val="false"/>
+          <w:sz w:val="24"/>
+          <w:szCs w:val="24"/>
+          <w:rtl/>
+        </w:rPr>
+        <w:t xml:space="preserve">בויארין, דניאל, "תאוות הלימוד: התורה כאישה אחרת", בתוך: הבשר שברוח – שיח המיניות בתלמוד, תל אביב: עם עובד, תשנ"ט, עמ' 170–183.</w:t>
+      </w:r>
+    </w:p>
+    <w:p>
+      <w:pPr>
+        <w:bidi/>
+        <w:spacing w:after="120" w:line="360" w:lineRule="auto"/>
+        <w:jc w:val="right"/>
+      </w:pPr>
+      <w:r>
+        <w:rPr>
+          <w:rFonts w:ascii="David" w:cs="David" w:eastAsia="David" w:hAnsi="David"/>
+          <w:b w:val="false"/>
+          <w:bCs w:val="false"/>
+          <w:i w:val="false"/>
+          <w:iCs w:val="false"/>
+          <w:sz w:val="24"/>
+          <w:szCs w:val="24"/>
+          <w:rtl/>
+        </w:rPr>
+        <w:t xml:space="preserve">הלברטל, משה, "מבוא למשנה", שישה סדרי משנה, סדרת עם הספר, תל אביב: ידיעות אחרונות.</w:t>
+      </w:r>
+    </w:p>
+    <w:p>
+      <w:pPr>
+        <w:bidi/>
+        <w:spacing w:after="120" w:line="360" w:lineRule="auto"/>
+        <w:jc w:val="right"/>
+      </w:pPr>
+      <w:r>
+        <w:rPr>
+          <w:rFonts w:ascii="David" w:cs="David" w:eastAsia="David" w:hAnsi="David"/>
+          <w:b w:val="false"/>
+          <w:bCs w:val="false"/>
+          <w:i w:val="false"/>
+          <w:iCs w:val="false"/>
+          <w:sz w:val="24"/>
+          <w:szCs w:val="24"/>
+          <w:rtl/>
+        </w:rPr>
+        <w:t xml:space="preserve">לורברבוים, יאיר, "ממקדש לאדם: תמורות במוקד הקדושה בספרות חז"ל", דעת: כתב עת לפילוסופיה יהודית וקבלה 86 (תשע"ט), עמ' 377–396.</w:t>
+      </w:r>
+    </w:p>
+    <w:p>
+      <w:pPr>
+        <w:bidi/>
+        <w:spacing w:after="120" w:line="360" w:lineRule="auto"/>
+        <w:jc w:val="right"/>
+      </w:pPr>
+      <w:r>
+        <w:rPr>
+          <w:rFonts w:ascii="David" w:cs="David" w:eastAsia="David" w:hAnsi="David"/>
+          <w:b w:val="false"/>
+          <w:bCs w:val="false"/>
+          <w:i w:val="false"/>
+          <w:iCs w:val="false"/>
+          <w:sz w:val="24"/>
+          <w:szCs w:val="24"/>
+          <w:rtl/>
+        </w:rPr>
+        <w:t xml:space="preserve">מרקס, דליה, "רבן יוחנן בן זכאי והקמת יבנה: ניתוח והערכת הסיפור בראי הזמן".</w:t>
+      </w:r>
+    </w:p>
+    <w:p>
+      <w:pPr>
+        <w:bidi/>
+        <w:spacing w:after="120" w:line="360" w:lineRule="auto"/>
+        <w:jc w:val="right"/>
+      </w:pPr>
+      <w:r>
+        <w:rPr>
+          <w:rFonts w:ascii="David" w:cs="David" w:eastAsia="David" w:hAnsi="David"/>
+          <w:b w:val="false"/>
+          <w:bCs w:val="false"/>
+          <w:i w:val="false"/>
+          <w:iCs w:val="false"/>
+          <w:sz w:val="24"/>
+          <w:szCs w:val="24"/>
+          <w:rtl/>
+        </w:rPr>
+        <w:t xml:space="preserve">דפי המקורות, דפי החברותא והמצגות מאתר הקורס: מפגשים 1–2 ("שתי תורות", עגלה ערופה), שיעורים 3–5 ("מנביא לחכם", משנה ותוספתא, דף חברותא מאפייני המשנה), היחידה "צמיחה מתוך משבר" (ריב"ז והיציאה מירושלים), דף חברותא "איך נעשים חכמ.ה", דף מקורות מפגש 11 (לימוד תורה לנשים).</w:t>
       </w:r>
     </w:p>
     <w:sectPr>

</xml_diff>

<commit_message>
Finalize paper: student details, film-accurate Q3, APA style pass
Filled in the cover page details, rewrote the Q3 similarities and
differences section based on the actual film transcript of the
1:03:30-1:10:00 segment (Ben Batich, Bar Giora's decree, the feigned
death ruse and the gate scene), added APA 7 in-text citations and a
properly formatted reference list, moved each question to a new page,
and applied the academic-writing style rules throughout.

Co-Authored-By: Claude Fable 5 <noreply@anthropic.com>
Claude-Session: https://claude.ai/code/session_01JB6bGJBwBnqBZeMysNqh8L
</commit_message>
<xml_diff>
--- a/עבודת-סיום-אדם-ספרות-ומעשה-בימי-חזל.docx
+++ b/עבודת-סיום-אדם-ספרות-ומעשה-בימי-חזל.docx
@@ -99,7 +99,7 @@
           <w:szCs w:val="28"/>
           <w:rtl/>
         </w:rPr>
-        <w:t xml:space="preserve">לימודים לתואר מוסמך</w:t>
+        <w:t xml:space="preserve">לימודים לתואר מוסמך (.M.A) ביהדות</w:t>
       </w:r>
     </w:p>
     <w:p>
@@ -319,7 +319,7 @@
           <w:szCs w:val="26"/>
           <w:rtl/>
         </w:rPr>
-        <w:t xml:space="preserve">שם הסטודנט/ית: ____________________</w:t>
+        <w:t xml:space="preserve">מגישה: מסאלחה חסאן</w:t>
       </w:r>
     </w:p>
     <w:p>
@@ -339,7 +339,47 @@
           <w:szCs w:val="26"/>
           <w:rtl/>
         </w:rPr>
-        <w:t xml:space="preserve">ת"ז: ____________________</w:t>
+        <w:t xml:space="preserve">ת"ז: 205513898</w:t>
+      </w:r>
+    </w:p>
+    <w:p>
+      <w:pPr>
+        <w:bidi/>
+        <w:spacing w:after="120" w:line="360" w:lineRule="auto"/>
+        <w:jc w:val="right"/>
+      </w:pPr>
+      <w:r>
+        <w:rPr>
+          <w:rFonts w:ascii="David" w:cs="David" w:eastAsia="David" w:hAnsi="David"/>
+          <w:b w:val="false"/>
+          <w:bCs w:val="false"/>
+          <w:i w:val="false"/>
+          <w:iCs w:val="false"/>
+          <w:sz w:val="24"/>
+          <w:szCs w:val="24"/>
+          <w:rtl/>
+        </w:rPr>
+        <w:t xml:space="preserve"/>
+      </w:r>
+    </w:p>
+    <w:p>
+      <w:pPr>
+        <w:bidi/>
+        <w:spacing w:after="120" w:line="360" w:lineRule="auto"/>
+        <w:jc w:val="center"/>
+      </w:pPr>
+      <w:r>
+        <w:rPr>
+          <w:rFonts w:ascii="David" w:cs="David" w:eastAsia="David" w:hAnsi="David"/>
+          <w:b w:val="false"/>
+          <w:bCs w:val="false"/>
+          <w:i w:val="false"/>
+          <w:iCs w:val="false"/>
+          <w:sz w:val="24"/>
+          <w:szCs w:val="24"/>
+          <w:rtl/>
+        </w:rPr>
+        <w:t xml:space="preserve">אב תשפ"ו, יולי 2026</w:t>
       </w:r>
     </w:p>
     <w:p>
@@ -404,7 +444,7 @@
           <w:szCs w:val="24"/>
           <w:rtl/>
         </w:rPr>
-        <w:t xml:space="preserve">נבחרתי לשאת דברים בפתיחת שנת פעילות של צוות שאני שותף בהובלתו, ובחרתי לבסס את דבריי על סוגיית עגלה ערופה שנלמדה במפגש הראשון – ובמרכזה משנה, מסכת סוטה פרק ט, משנה ו, והרחבתה בתלמוד הבבלי, סוטה דף מו ע"ב:</w:t>
+        <w:t xml:space="preserve">נבחרתי לשאת דברים בפתיחת שנת הפעילות של צוות שאני שותפה בהובלתו. בחרתי לבסס את הדברים על סוגיית עגלה ערופה שנלמדה במפגש הראשון, ובמרכזה משנה, מסכת סוטה פרק ט, משנה ו, עם הרחבתה בתלמוד הבבלי, סוטה מו ע"ב:</w:t>
       </w:r>
     </w:p>
     <w:p>
@@ -443,7 +483,7 @@
           <w:szCs w:val="24"/>
           <w:rtl/>
         </w:rPr>
-        <w:t xml:space="preserve">המשנה מפרשת את הטקס המקראי שבדברים כא: כאשר נמצא חלל בשדה ולא נודע מי הכהו, יוצאים זקני העיר הקרובה, עורפים עגלה בנחל ומצהירים "ידינו לא שפכו את הדם הזה". המשנה שואלת את השאלה המתבקשת – וכי מישהו חשד בזקני בית הדין שהם רצחו? – ותשובתה מפליגה: ההצהרה אינה על הרצח אלא על המחדל. הזקנים מעידים שהאיש לא יצא מעירם רעב ובלא ליווי. התלמוד מרחיב את הרעיון ומעמיד את הליווי כערך מכונן: "אמר רבי יוחנן משום רבי מאיר: כל שאינו מלוה ומתלוה – כאילו שופך דמים", ולצדו: "כל המלוה את חברו ארבע אמות בעיר – אינו ניזוק".</w:t>
+        <w:t xml:space="preserve">המשנה מפרשת את הטקס המקראי שבספר דברים, פרק כא: כאשר נמצא חלל בשדה ואין יודעים מי הכהו, יוצאים זקני העיר הקרובה, עורפים עגלה בנחל ומצהירים "ידינו לא שפכו את הדם הזה". המשנה שואלת את השאלה המתבקשת, וכי עלה על הדעת שזקני בית דין רוצחים, ותשובתה מרחיקת לכת: ההצהרה אינה על הרצח אלא על המחדל. הזקנים מעידים שהאיש לא יצא מעירם רעב ובלא ליווי. התלמוד שם ממשיך ומחריף: "אמר רבי יוחנן משום רבי מאיר: כל שאינו מלוה ומתלוה כאילו שופך דמים", ולצדו: "כל המלוה את חברו ארבע אמות בעיר אינו ניזוק".</w:t>
       </w:r>
     </w:p>
     <w:p>
@@ -483,7 +523,7 @@
           <w:szCs w:val="24"/>
           <w:rtl/>
         </w:rPr>
-        <w:t xml:space="preserve">מקור הטקסט במשנה, מסכת סוטה, בפרק העוסק בטקסים שבטלו, והרחבתו בסוגיית הבבלי שם. הדמויות המרכזיות הן זקני העיר והכוהנים – מנהיגי הציבור – והחלל האלמוני, אדם שאיש אינו יודע את שמו. הסיטואציה: מוות שאין לו אשם ידוע, שדווקא בו התורה וחז"ל מחייבים את ההנהגה כולה לצאת, להתכנס סביב הגופה ולתת דין וחשבון פומבי. הטקסט נלמד אצלנו כדוגמה לתנועה של חז"ל מן המקרא אל המשנה ואל התלמוד: מטקס כפרה פולחני – אל אמירה מוסרית על אחריות חברתית.</w:t>
+        <w:t xml:space="preserve">מקור הטקסט במשנה, מסכת סוטה, בפרק העוסק בטקסים שבטלו, והרחבתו בסוגיה בבבלי שם. הדמויות המרכזיות הן זקני העיר והכוהנים, כלומר ההנהגה, ומולם החלל האלמוני שאיש אינו יודע את שמו. הסיטואציה היא מוות שאין לו אשם ידוע, ודווקא בו מחייבים התורה וחז"ל את ההנהגה כולה לצאת אל הנחל ולתת דין וחשבון פומבי. בקורס נלמד המקור כדוגמה לתנועה של חז"ל מן המקרא אל המשנה ואל התלמוד: מטקס כפרה פולחני אל אמירה מוסרית על אחריות חברתית (סבאג ישראל, 2026).</w:t>
       </w:r>
     </w:p>
     <w:p>
@@ -523,7 +563,12 @@
           <w:szCs w:val="24"/>
           <w:rtl/>
         </w:rPr>
-        <w:t xml:space="preserve">בחרתי בטקסט הזה משום שהוא מנסח בדיוק את המסר שברצוני לחדד בפתיחת שנה של עשייה משותפת: המבחן של קבוצה אינו במה שהיא עושה לחבריה, אלא במה שהיא מניחה שלא לעשות. הזקנים אינם נחשדים ברצח – הם נתבעים על ליווי שלא ניתן ועל מזון שלא הוצע. חז"ל מלמדים שאחריות אינה רק הימנעות מפגיעה אלא חובת נוכחות פעילה: לראות את מי שבשוליים, ללוות את מי שיוצא לדרך, לא להניח לאיש "לצאת מן העיר" לבדו. בעיניי זהו מסר חד למנהיגות בכל ארגון וקהילה: תרבות של קבוצה נמדדת ברגעי הפרידה והמעבר של חבריה, ובשאלה אם מישהו נעלם – ואיש לא שם לב. האמירה "כל שאינו מלווה – כאילו שופך דמים" חריפה במתכוון, והחריפות הזאת היא שעושה אותה בלתי נשכחת עבור השומעים.</w:t>
+        <w:t xml:space="preserve">הטקסט מתאים לדעתי משום שהוא אומר בדיוק את מה שאני מבקשת לחדד: קבוצה נמדדת במה שקל לה להזניח. הזקנים אינם נחשדים ברצח. הם נתבעים על ליווי שלא ניתן ועל מזון שלא הוצע. אחריות, על פי חז"ל, אינה מסתכמת בהימנעות מפגיעה; היא חובת נוכחות פעילה: לראות את מי שבשוליים, ללוות את היוצא לדרך, לא להניח לאיש לצאת מן העיר לבדו. עבור צוות בתחילת שנה זו אמירה מעשית מאוד. תרבות של קבוצה מתגלה ברגעי הפרידה והמעבר של חבריה, ובשאלה אם מישהו נעלם ואיש לא שם לב. האמירה "כל שאינו מלווה כאילו שופך דמים" חריפה במתכוון, והחריפות הזאת היא שנחקקת בזיכרון השומעים.</w:t>
+      </w:r>
+    </w:p>
+    <w:p>
+      <w:r>
+        <w:br w:type="page"/>
       </w:r>
     </w:p>
     <w:p>
@@ -543,7 +588,7 @@
           <w:szCs w:val="28"/>
           <w:rtl/>
         </w:rPr>
-        <w:t xml:space="preserve">שאלה 2: החיבור המשמעותי ביותר בתקופת חז"ל – המשנה</w:t>
+        <w:t xml:space="preserve">שאלה 2: החיבור המשמעותי ביותר בתקופת חז"ל: המשנה</w:t>
       </w:r>
     </w:p>
     <w:p>
@@ -583,7 +628,7 @@
           <w:szCs w:val="24"/>
           <w:rtl/>
         </w:rPr>
-        <w:t xml:space="preserve">החיבור המשמעותי ביותר בעיניי מתקופת חז"ל הוא המשנה. המשנה נערכה בארץ ישראל בסביבות שנת 220 לספירה בידי רבי יהודה הנשיא ("רבי"), כסיכום ההלכה התנאית שהתפתחה בבתי המדרש מאז דורות בית הלל ובית שמאי, דרך משנת רבי עקיבא ותלמידיו. מאפייניה, כפי שלמדנו בעקבות מבואו של משה הלברטל: היקף עצום ויומרה לסכם את כלל הידע ההלכתי; ארגון ענייני-נושאי בשישה סדרים (זרעים, מועד, נשים, נזיקין, קדשים, טהרות) ולא לפי סדר פסוקי המקרא; עברית ייחודית – "לשון חכמים" – קצרה, מדודה וכמעט ללא הנמקות; ועריכה "כרצף מחלוקות", המשמרת דעות רבים ויחיד בשם אומריהן. המניעים לעריכתה, כפי שנידונו במפגשים: החשש מאובדן המסורת בתקופה סוערת שלאחר החורבן והמרידות, התרחבות הידע והקושי לשלוט בו, והצורך לשמר את המסורת בלא תלות במוסדות ריכוזיים שחרבו.</w:t>
+        <w:t xml:space="preserve">החיבור המשמעותי ביותר בעיניי מתקופת חז"ל הוא המשנה. המשנה נערכה בארץ ישראל בסביבות שנת 220 לספירה בידי רבי יהודה הנשיא ("רבי"), כסיכום ההלכה התנאית שהתפתחה בבתי המדרש מדורות בית הלל ובית שמאי, דרך משנת רבי עקיבא ותלמידיו, ועד דורו של העורך. מאפייניה, על פי מבואו של הלברטל (ל.ת.) וכפי שנלמדו במפגשים (סבאג ישראל, 2026): היקף עצום ויומרה לסכם את כלל הידע ההלכתי; ארגון ענייני בשישה סדרים (זרעים, מועד, נשים, נזיקין, קדשים, טהרות) ולא לפי סדר פסוקי המקרא; עברית ייחודית, "לשון חכמים", קצרה, מדודה וכמעט בלא הנמקות; ועריכה כרצף מחלוקות המשמרת דעות רבים ויחיד בשם אומריהן. המניעים לעריכה שנידונו בשיעור: חשש מאובדן המסורת בתקופה סוערת שלאחר החורבן והמרידות, התרחבות הידע והקושי לשלוט בו, והצורך לשמר את המסורת בלא תלות במוסדות ריכוזיים שחרבו (סבאג ישראל, 2026).</w:t>
       </w:r>
     </w:p>
     <w:p>
@@ -623,7 +668,7 @@
           <w:szCs w:val="24"/>
           <w:rtl/>
         </w:rPr>
-        <w:t xml:space="preserve">המשנה היא החיבור הראשון שהעלה את התורה שבעל־פה מאוסף מסורות מפוזרות לכדי קורפוס ערוך, מוסכם ומחייב – ובכך כונן מחדש את היהדות שלאחר החורבן. השינוי שחוללה כפול. ראשית, היא העמידה את לימוד הטקסט ואת בית המדרש במרכז החיים הדתיים: משחרב המקדש ובטלה עבודת הקרבנות, נעשתה המשנה הציר שסביבו מתארגנים הזיכרון, הסמכות והזהות – "הזיכרון המארגן" של עולם החכמים. שנית, היא יצרה שפה משותפת לעם כולו: המשנה היא התשתית שעליה נבנו שני התלמודים, הבבלי והירושלמי, וכל ספרות ההלכה שאחריהם עד ימינו. ולצד אלה חידוש שלישי, מהפכני לא פחות: בעצם עריכתה כרצף מחלוקות קיבעה המשנה את המחלוקת הלגיטימית – "מחלוקת לשם שמים" – כדרך המלך של התורה שבעל־פה. בניגוד לחתירה לאחידות שאפיינה את האמונה המקראית, בית המדרש מקדש ריבוי דעות וביקורת הדדית ככלי לבירור האמת.</w:t>
+        <w:t xml:space="preserve">המשנה היא החיבור הראשון שהעלה את התורה שבעל פה מאוסף מסורות מפוזרות לכדי קורפוס ערוך ומחייב, ומכאן עיקר כוחה. אחרי החורבן, משבטלה עבודת הקרבנות, נעשה לימוד הטקסט למרכז החיים הדתיים, והמשנה היא שהעניקה ללימוד הזה צורה: היא "הזיכרון המארגן" של עולם החכמים (סבאג ישראל, 2026). היא גם יצרה שפה משותפת לעם כולו. שני התלמודים, הבבלי והירושלמי, נבנו כפירוש עליה, וכל ספרות ההלכה שאחריהם נשענת עליה עד ימינו. ושינוי נוסף, מהפכני לא פחות: בעריכתה כרצף מחלוקות קיבעה המשנה את המחלוקת הלגיטימית כדרכה של תורה שבעל פה. בניגוד לחתירה לאחידות שאפיינה את האמונה המקראית, בית המדרש רואה בריבוי דעות ובביקורת הדדית את הדרך לבירור האמת (סבאג ישראל, 2026).</w:t>
       </w:r>
     </w:p>
     <w:p>
@@ -663,7 +708,7 @@
           <w:szCs w:val="24"/>
           <w:rtl/>
         </w:rPr>
-        <w:t xml:space="preserve">דוגמה הממחישה זאת, מתוך דף החברותא על מאפייני המשנה – משנה, מסכת סוכה פרק א, משנה א:</w:t>
+        <w:t xml:space="preserve">דוגמה הממחישה זאת, מתוך דף החברותא על מאפייני המשנה: משנה, מסכת סוכה פרק א, משנה א.</w:t>
       </w:r>
     </w:p>
     <w:p>
@@ -682,27 +727,32 @@
           <w:szCs w:val="24"/>
           <w:rtl/>
         </w:rPr>
-        <w:t xml:space="preserve">"סֻכָּה שֶׁהִיא גְבוֹהָה לְמַעְלָה מֵעֶשְׂרִים אַמָּה – פְּסוּלָה; רַבִּי יְהוּדָה מַכְשִׁיר. וְשֶׁאֵינָהּ גְּבוֹהָה עֲשָׂרָה טְפָחִים, וְשֶׁאֵין לָהּ שְׁלֹשָׁה דְּפָנוֹת, וְשֶׁחַמָּתָהּ מְרֻבָּה מִצִּלָּתָהּ – פְּסוּלָה."</w:t>
-      </w:r>
-    </w:p>
-    <w:p>
-      <w:pPr>
-        <w:bidi/>
-        <w:spacing w:after="120" w:line="360" w:lineRule="auto"/>
-        <w:jc w:val="both"/>
-      </w:pPr>
-      <w:r>
-        <w:rPr>
-          <w:rFonts w:ascii="David" w:cs="David" w:eastAsia="David" w:hAnsi="David"/>
-          <w:b w:val="false"/>
-          <w:bCs w:val="false"/>
-          <w:i w:val="false"/>
-          <w:iCs w:val="false"/>
-          <w:sz w:val="24"/>
-          <w:szCs w:val="24"/>
-          <w:rtl/>
-        </w:rPr>
-        <w:t xml:space="preserve">במשנה קצרה זו ניכרים כל החידושים שמנינו: היא פותחת מסכת שלמה המוקדשת לנושא אחד – הסוכה – בלא זיקה לסדר הפסוקים; לשונה פסקנית ומדודה, קובעת שיעורים מספריים מדויקים בלא כל הנמקה; והיא משמרת בגוף ההלכה את דעת היחיד החולק – "רבי יהודה מכשיר" – בלא הכרעה מנומקת ובלא מחיקת הדעה שנדחתה. כך נראה השינוי שחוללה המשנה הלכה למעשה: חוק מקיף ומאורגן, שהמחלוקת אינה תקלה בו אלא חלק ממהותו – והוא שהזמין את הדורות הבאים, בתלמודים ואילך, להמשיך ולדון בו.</w:t>
+        <w:t xml:space="preserve">"סֻכָּה שֶׁהִיא גְבוֹהָה לְמַעְלָה מֵעֶשְׂרִים אַמָּה, פְּסוּלָה. רַבִּי יְהוּדָה מַכְשִׁיר. וְשֶׁאֵינָהּ גְּבוֹהָה עֲשָׂרָה טְפָחִים, וְשֶׁאֵין לָהּ שְׁלֹשָׁה דְּפָנוֹת, וְשֶׁחַמָּתָהּ מְרֻבָּה מִצִּלָּתָהּ, פְּסוּלָה."</w:t>
+      </w:r>
+    </w:p>
+    <w:p>
+      <w:pPr>
+        <w:bidi/>
+        <w:spacing w:after="120" w:line="360" w:lineRule="auto"/>
+        <w:jc w:val="both"/>
+      </w:pPr>
+      <w:r>
+        <w:rPr>
+          <w:rFonts w:ascii="David" w:cs="David" w:eastAsia="David" w:hAnsi="David"/>
+          <w:b w:val="false"/>
+          <w:bCs w:val="false"/>
+          <w:i w:val="false"/>
+          <w:iCs w:val="false"/>
+          <w:sz w:val="24"/>
+          <w:szCs w:val="24"/>
+          <w:rtl/>
+        </w:rPr>
+        <w:t xml:space="preserve">במשנה קצרה זו ניכר כל מה שתואר לעיל. היא פותחת מסכת שלמה המוקדשת לנושא אחד, הסוכה, בלא זיקה לסדר הפסוקים. לשונה פסקנית, קובעת שיעורים מספריים מדויקים ואינה מנמקת. והיא משמרת בגוף ההלכה את דעת היחיד החולקת, "רבי יהודה מכשיר", בלא הכרעה מפורשת ובלא מחיקת הדעה שנדחתה. כך נראה השינוי שחוללה המשנה הלכה למעשה: חוק מקיף ומאורגן שהמחלוקת אינה תקלה בו אלא חלק ממהותו, והוא שהזמין את הדורות הבאים, בתלמודים ואילך, להמשיך ולדון בו.</w:t>
+      </w:r>
+    </w:p>
+    <w:p>
+      <w:r>
+        <w:br w:type="page"/>
       </w:r>
     </w:p>
     <w:p>
@@ -762,7 +812,7 @@
           <w:szCs w:val="24"/>
           <w:rtl/>
         </w:rPr>
-        <w:t xml:space="preserve">הקטע מבוסס על אגדת יציאתו של רבן יוחנן בן זכאי (ריב"ז) מירושלים הנצורה, תלמוד בבלי, מסכת גיטין דף נו ע"א–ע"ב, כפי שנלמדה ביחידה "צמיחה מתוך משבר". להלן החלקים הרלוונטיים בתרגום לעברית:</w:t>
+        <w:t xml:space="preserve">הקטע (דקות 01:03:30 עד 01:10:00) מבוסס על אגדת יציאתו של רבן יוחנן בן זכאי מירושלים הנצורה, תלמוד בבלי, מסכת גיטין דף נו ע"א-ע"ב, שנלמדה ביחידה "צמיחה מתוך משבר". להלן החלקים הרלוונטיים, בתרגום לעברית על פי דף המקורות של הקורס:</w:t>
       </w:r>
     </w:p>
     <w:p>
@@ -781,7 +831,7 @@
           <w:szCs w:val="24"/>
           <w:rtl/>
         </w:rPr>
-        <w:t xml:space="preserve">"אבא סיקרא, ראש בריוני ירושלים, בן אחותו של רבן יוחנן בן זכאי היה. שלח לו [רבן יוחנן]: בוא אלי בצנעה. בא. אמר לו: עד מתי תעשו כך ותהרגו את העולם ברעב? אמר לו: מה אעשה? שאם אומר להם כך – יהרגו אותי. אמר לו: אני רואה תקנה בשבילי, שאצא [מן העיר]; אפשר שתהיה בזה הצלה מועטה... עשה רבן יוחנן כך [העמיד פני מת]: נכנס תחתיו רבי אליעזר מצד אחד ורבי יהושע מצד אחר. כשהגיעו לפתח [השער] רצו [הבריונים] לדקור אותו. אמר להם: יאמרו "את רבם דקרו"!... פתחו את השער, יצא. כשהגיע לשם אמר: שלום עליך המלך, שלום עליך המלך!... [משנתבשר אספסיינוס כי הוכתר לקיסר, אמר:] הולך אני, ואיש אחר אשלח תחתיי; אלא בקש ממני דבר ואתן לך. אמר לו: תן לי יבנה וחכמיה, ושושלת רבן גמליאל, ורופאים שירפאו את רבי צדוק. קרא עליו רב יוסף, ויש אומרים רבי עקיבא: 'מֵשִׁיב חֲכָמִים אָחוֹר וְדַעְתָּם יְסַכֵּל' – היה לו לומר לו שיניח להם הפעם."</w:t>
+        <w:t xml:space="preserve">"אבא סיקרא, ראש בריוני ירושלים, בן אחותו של רבן יוחנן בן זכאי היה. שלח לו [רבן יוחנן]: בוא אלי בצנעה. בא. אמר לו: עד מתי תעשו כך ותהרגו את העולם ברעב? אמר לו: מה אעשה? שאם אומר להם כך, יהרגו אותי. אמר לו: אני רואה תקנה בשבילי, שאצא [מן העיר]; אפשר שתהיה בזה הצלה מועטה... עשה רבן יוחנן כך [העמיד פני מת]: נכנס תחתיו רבי אליעזר מצד אחד ורבי יהושע מצד אחר. כשהגיעו לפתח [השער] רצו [הבריונים] לדקור אותו. אמר להם: יאמרו 'את רבם דקרו'!... פתחו את השער, יצא. כשהגיע לשם אמר: שלום עליך המלך, שלום עליך המלך!... [משנתבשר אספסיינוס כי הוכתר לקיסר, אמר:] בקש ממני דבר ואתן לך. אמר לו: תן לי יבנה וחכמיה, ושושלת רבן גמליאל, ורופאים שירפאו את רבי צדוק. קרא עליו רב יוסף, ויש אומרים רבי עקיבא: 'מֵשִׁיב חֲכָמִים אָחוֹר וְדַעְתָּם יְסַכֵּל', שהיה לו לומר לו שיניח להם הפעם."</w:t>
       </w:r>
     </w:p>
     <w:p>
@@ -801,47 +851,47 @@
           <w:szCs w:val="24"/>
           <w:rtl/>
         </w:rPr>
-        <w:t xml:space="preserve">ב. בין המדרש לסרט – דמיונות והבדלים</w:t>
-      </w:r>
-    </w:p>
-    <w:p>
-      <w:pPr>
-        <w:bidi/>
-        <w:spacing w:after="120" w:line="360" w:lineRule="auto"/>
-        <w:jc w:val="both"/>
-      </w:pPr>
-      <w:r>
-        <w:rPr>
-          <w:rFonts w:ascii="David" w:cs="David" w:eastAsia="David" w:hAnsi="David"/>
-          <w:b w:val="false"/>
-          <w:bCs w:val="false"/>
-          <w:i w:val="false"/>
-          <w:iCs w:val="false"/>
-          <w:sz w:val="24"/>
-          <w:szCs w:val="24"/>
-          <w:rtl/>
-        </w:rPr>
-        <w:t xml:space="preserve">שלושה דמיונות: (1) הסרט נאמן לשלד העלילה של האגדה: הפגישה החשאית בין ריב"ז לבין בן אחותו, מנהיג הבריונים; ההכרה שהקנאות מרעיבה את העיר; והתחבולה – ריב"ז מעמיד פני מת ומוצא מן העיר בארון, הנישא בידי תלמידיו רבי אליעזר ורבי יהושע. (2) המתח בשער העיר – שומרי הבריונים המבקשים לוודא שאכן מת מוטל בארון, והבלימה בטענת כבוד הרב ("יאמרו: את רבם דקרו") – מומחז בסרט כרוחו של המקור. (3) המפגש עם אספסיינוס נבנה כבמדרש: הפנייה המפתיעה "שלום עליך המלך", בשורת ההכתרה המגיעה בעיצומו של המפגש והופכת את הנביא-לכאורה לבן שיח מועדף, והבקשה שבשיא הסצנה – "תן לי יבנה וחכמיה".</w:t>
-      </w:r>
-    </w:p>
-    <w:p>
-      <w:pPr>
-        <w:bidi/>
-        <w:spacing w:after="120" w:line="360" w:lineRule="auto"/>
-        <w:jc w:val="both"/>
-      </w:pPr>
-      <w:r>
-        <w:rPr>
-          <w:rFonts w:ascii="David" w:cs="David" w:eastAsia="David" w:hAnsi="David"/>
-          <w:b w:val="false"/>
-          <w:bCs w:val="false"/>
-          <w:i w:val="false"/>
-          <w:iCs w:val="false"/>
-          <w:sz w:val="24"/>
-          <w:szCs w:val="24"/>
-          <w:rtl/>
-        </w:rPr>
-        <w:t xml:space="preserve">שלושה הבדלים: (1) הדמויות: בבבלי האחיין הוא "אבא סיקרא", דמות לקונית המופיעה בתמונה אחת; הסרט (ההולך כאן בעקבות גרסת איכה רבה) קורא לו בן בטיח והופכו לגיבור ראשי בעל עלילה, פנים וקול – ובכלל, מה שהתלמוד מוסר במשפטים ספורים נפרש בסרט לדיאלוגים ולרגש. (2) ההקשר ואמצעי המבע: הסרט שוזר את הבריחה בעלילה רחבה של מלחמת האחים – שריפת האסמים והרעב מוצגים חזותית ובאכזריות – והכול מסופר בהנפשה ייחודית של ציורי אמנות קלאסיים בליווי מוזיקה; האגדה, לעומת זאת, חסכנית ומאופקת. (3) מה שהסרט משמיט: קול הביקורת הפנים־תלמודי – קריאתם של רב יוסף או רבי עקיבא "משיב חכמים אחור" על שלא ביקש על ירושלים עצמה – וכן פירוט שלוש הבקשות וסיפור ריפויו של רבי צדוק, מצטמצמים או נעדרים; הסרט מניח לצופה לשפוט בעצמו את הכרעת ריב"ז.</w:t>
+        <w:t xml:space="preserve">ב. בין המדרש לסרט: דמיונות והבדלים</w:t>
+      </w:r>
+    </w:p>
+    <w:p>
+      <w:pPr>
+        <w:bidi/>
+        <w:spacing w:after="120" w:line="360" w:lineRule="auto"/>
+        <w:jc w:val="both"/>
+      </w:pPr>
+      <w:r>
+        <w:rPr>
+          <w:rFonts w:ascii="David" w:cs="David" w:eastAsia="David" w:hAnsi="David"/>
+          <w:b w:val="false"/>
+          <w:bCs w:val="false"/>
+          <w:i w:val="false"/>
+          <w:iCs w:val="false"/>
+          <w:sz w:val="24"/>
+          <w:szCs w:val="24"/>
+          <w:rtl/>
+        </w:rPr>
+        <w:t xml:space="preserve">שלושה דמיונות. האחד, שלד העלילה: פגישה חשאית בין רבן יוחנן לבין בן אחותו העומד בראש הקנאים, הכרה משותפת שהרעב מכלה את העיר, ותחבולת המוות המדומה, שבה מוצא הרב מירושלים בארון קבורה הנישא בידי תלמידיו. השני, סצנת השער: השומרים דורשים לדקור את הארון כדי לוודא שהמת אכן מת, והאחיין בולם אותם בטיעון של האגדה עצמה, שלא יאמרו כי הקנאים פגעו ברבם ("יאמרו: את רבם דקרו"); בסרט הם נסוגים בקריאה "תנו כבוד לתורה". השלישי, מטרת היציאה: בסרט כבמדרש, ההצלה איננה הצלת העיר. רבן יוחנן אומר לבן בטיח במפורש שהוא דואג "שלא תאבד התורה שבעל פה מישראל", ניסוח קולנועי של מה שיבשיל אצל אספסיינוס לבקשה "תן לי יבנה וחכמיה".</w:t>
+      </w:r>
+    </w:p>
+    <w:p>
+      <w:pPr>
+        <w:bidi/>
+        <w:spacing w:after="120" w:line="360" w:lineRule="auto"/>
+        <w:jc w:val="both"/>
+      </w:pPr>
+      <w:r>
+        <w:rPr>
+          <w:rFonts w:ascii="David" w:cs="David" w:eastAsia="David" w:hAnsi="David"/>
+          <w:b w:val="false"/>
+          <w:bCs w:val="false"/>
+          <w:i w:val="false"/>
+          <w:iCs w:val="false"/>
+          <w:sz w:val="24"/>
+          <w:szCs w:val="24"/>
+          <w:rtl/>
+        </w:rPr>
+        <w:t xml:space="preserve">ושלושה הבדלים. ראשית, דמות האחיין: בבבלי זהו אבא סיקרא, דמות לקונית המופיעה בתמונה אחת בלבד; בסרט, ההולך כאן בעקבות גרסת איכה רבה, זהו בן בטיח, גיבור ראשי בעל עלילה שלמה, והמפגש עם הדוד נטען ברגש אישי: הוא מגיע אליו אָבֵל על אמו ומיוסר על שריפת המחסנים שהמיטה את הרעב. שנית, כיוון ההאשמה מתהפך: בבבלי רבן יוחנן הוא שמוכיח את אחיינו, "עד מתי תעשו כך ותהרגו את העולם ברעב"; בסרט דווקא רבן יוחנן מרגיע את בן בטיח וקובע שהרעב היה גזרה משמיים ובן בטיח לא היה אלא שליחהּ, תיאולוגיה מפורשת שאין לה זכר באגדה. שלישית, פרטי התחבולה ומה שהושמט: הסרט מוסיף את גזרתו של בר גיורא שאיש לא ייצא מן החומות מלבד המתים, את העמדת פני החולה ואת הדבר המצחין שהונח במיטה כדי לשכנע במותו (פרטים ממסורת איכה רבה שאינם בבבלי); ומנגד, קול הביקורת התלמודי, קריאת רב יוסף או רבי עקיבא "משיב חכמים אחור", נעדר מן הקטע כליל, והצופה נותר לשפוט בעצמו.</w:t>
       </w:r>
     </w:p>
     <w:p>
@@ -881,7 +931,7 @@
           <w:szCs w:val="24"/>
           <w:rtl/>
         </w:rPr>
-        <w:t xml:space="preserve">במאמרה "רבן יוחנן בן זכאי והקמת יבנה: ניתוח והערכת הסיפור בראי הזמן" מציעה דליה מרקס לקרוא את האגדה כ"סיפור של מעתק": רגע המעבר ממציאות שבה יש לעם מרכז פולחני בירושלים אל מציאות שדרשה מציאת קדושה בדרכים חדשות ומהפכניות – והאגדה, היא מדגישה, אינה רק מתארת את המעבר אלא יוצרת אותו ומְמַשמעת אותו. בעקבות ג'ונתן רוזן היא רואה במסע בארון המתים הוצאה אל הפועל, סמלית, של שינוי הצורה שעברה היהדות: היהודים "מתו" כעם של הגוף, של הארץ ושל פולחן המקדש – ונולדו מחדש כעם הספר. ריב"ז חייב למות מוות סמלי כדי שמשהו חדש יוכל להיוולד; היציאה בארון היא ההרפיה מן האחיזה בירושלים שדינה נגזר. על הבקשה "תן לי יבנה וחכמיה" מראה מרקס (בעקבות שרמר) כי היא מעמידה את שכבת החכמים כהנהגת העם: "יבנה וחכמיה" באה תחת "ירושלים ובית מקדשה", ומעתה האחריות לגורל העם מופקדת בידי החכמים. ואף הביקורת התלמודית משתלבת בקריאה זו: העמדת רב יוסף ורבי עקיבא – זה מבבל וזה מדור מרד בר כוכבא, שבחר בדרך ההפוכה – מציבה מול הכרעת ריב"ז שני עולמות חלופיים, ומלמדת שהתלמוד עצמו הנציח את הסיפור יחד עם המחלוקת עליו.</w:t>
+        <w:t xml:space="preserve">במאמרה על הסיפור מציעה דליה מרקס (ל.ת.) לקרוא את האגדה כסיפור של מעתק: רגע המעבר ממציאות שבה יש לעם מרכז פולחני בירושלים אל מציאות שנדרשה למצוא קדושה בדרכים חדשות. האגדה, היא מדגישה, אינה מתארת את המעבר בלבד; היא יוצרת אותו ומעניקה לו משמעות. בעקבות רוזן (כפי שמצוטט אצל מרקס, ל.ת.) היא רואה במסע בארון המתים ביצוע סמלי של שינוי הצורה שעברה היהדות: היהודים מתו כעם של הגוף, של הארץ ושל פולחן המקדש, ונולדו מחדש כעם הספר. רבן יוחנן חייב למות מוות סמלי כדי שדבר חדש יוכל להיוולד, והיציאה בארון היא הרפיה מאחיזה בירושלים שדינה נגזר. הקריאה הזאת מאירה היטב את הקטע: בן בטיח עסוק באבנים, בעצים ובאשמת המתים, ואילו רבן יוחנן כבר חי את המציאות הבאה. על הבקשה "תן לי יבנה וחכמיה" מראה מרקס, בעקבות שרמר (כפי שמצוטט אצל מרקס, ל.ת.), שהיא מעמידה את שכבת החכמים כהנהגתו החדשה של העם: יבנה וחכמיה תחת ירושלים ובית מקדשה. גם המסורת המגנה את רבן יוחנן נקראת אצלה כהעמדה מכוונת של שני עולמות זה מול זה, רב יוסף הצופה מבבל מזה, ורבי עקיבא, שבחר בדור בר כוכבא בדרך ההפוכה, מזה. התלמוד הנציח את הסיפור יחד עם המחלוקת עליו (מרקס, ל.ת.).</w:t>
       </w:r>
     </w:p>
     <w:p>
@@ -921,7 +971,12 @@
           <w:szCs w:val="24"/>
           <w:rtl/>
         </w:rPr>
-        <w:t xml:space="preserve">המדרש הזה הוא בעיניי מן הנלמדים ביותר עד היום משום שהוא הסיפור המכונן של "צמיחה מתוך משבר" – הציר שסביבו נבנתה היהדות הרבנית כולה. יבנה הפכה, כדברי מרקס, לארכיטיפ תודעתי: כל מקום תורה שתלמידים נוהרים אליו הוא בחזקת יבנה. הסיפור מעמיד דגם מנהיגות על־זמני: מול הקנאות המקדשת מלחמה עד כלות, ריב"ז מציג פרגמטיזם מציל – היכולת לוותר על היקר מכול כדי להציל את מה שניתן, ולתרגם חורבן לבניין. לא במקרה, כפי שמראה מרקס, שבו דורות שונים ויצקו אל הסיפור את עולמם: מורים אחרי השואה ראו ביבנה את ניצחון הלימוד על הכוח, ובוויכוחים ציבוריים בישראל – עד ימינו – נאבקים תומכים ומבקרים על דמותו של ריב"ז, בין "מייסד יהדות בית המדרש" לבין מי שוויתר על ירושלים. ודווקא העמימות הזו, שהתלמוד עצמו שימר בביקורת "משיב חכמים אחור", היא סוד כוחו: הוא אינו מוסר חד־משמעי אלא מראה – לאומה ולכל יחיד המקים את חייו מן החורבות.</w:t>
+        <w:t xml:space="preserve">זהו בעיניי המדרש הנלמד ביותר משום שהוא הסיפור המכונן של צמיחה מתוך משבר, הציר שעליו נבנתה היהדות הרבנית כולה. יבנה נעשתה ארכיטיפ תודעתי, וכל מקום תורה שתלמידים נוהרים אליו הוא בחזקת יבנה (מרקס, ל.ת.). הסיפור מעמיד דגם מנהיגות שממשיך לדבר אל קוראיו: מול קנאות הנלחמת עד כלות, פרגמטיזם שמציל את מה שאפשר להציל ומתרגם חורבן לבניין. מרקס (ל.ת.) מראה כיצד דורות שונים יצקו אל הסיפור את עולמם, ממורים שראו בו אחרי השואה את ניצחון הלימוד על הכוח ועד ויכוחים ציבוריים בישראל שבהם נאבקים על דמותו של רבן יוחנן תומכים ומבקרים כאחד. דווקא העמימות, שהתלמוד עצמו שימר בביקורת "משיב חכמים אחור", היא סוד כוחו. הוא אינו מוסר חד משמעי אלא מראָה, לאומה וגם לכל אדם המקים את חייו מן החורבות.</w:t>
+      </w:r>
+    </w:p>
+    <w:p>
+      <w:r>
+        <w:br w:type="page"/>
       </w:r>
     </w:p>
     <w:p>
@@ -941,27 +996,27 @@
           <w:szCs w:val="28"/>
           <w:rtl/>
         </w:rPr>
-        <w:t xml:space="preserve">שאלה 4: ניתוח מקור – תחילתו של רבי אליעזר בן הורקנוס</w:t>
-      </w:r>
-    </w:p>
-    <w:p>
-      <w:pPr>
-        <w:bidi/>
-        <w:spacing w:after="120" w:line="360" w:lineRule="auto"/>
-        <w:jc w:val="both"/>
-      </w:pPr>
-      <w:r>
-        <w:rPr>
-          <w:rFonts w:ascii="David" w:cs="David" w:eastAsia="David" w:hAnsi="David"/>
-          <w:b w:val="false"/>
-          <w:bCs w:val="false"/>
-          <w:i w:val="false"/>
-          <w:iCs w:val="false"/>
-          <w:sz w:val="24"/>
-          <w:szCs w:val="24"/>
-          <w:rtl/>
-        </w:rPr>
-        <w:t xml:space="preserve">בחרתי במקור הראשון: סיפור תחילתו של רבי אליעזר בן הורקנוס (פרקי דרבי אליעזר, פרקים א–ב, ומקבילות באבות דרבי נתן נוסח א ובמדרשים נוספים), שנלמד בדף החברותא "איך נעשים חכמ.ה".</w:t>
+        <w:t xml:space="preserve">שאלה 4: ניתוח מקור: תחילתו של רבי אליעזר בן הורקנוס</w:t>
+      </w:r>
+    </w:p>
+    <w:p>
+      <w:pPr>
+        <w:bidi/>
+        <w:spacing w:after="120" w:line="360" w:lineRule="auto"/>
+        <w:jc w:val="both"/>
+      </w:pPr>
+      <w:r>
+        <w:rPr>
+          <w:rFonts w:ascii="David" w:cs="David" w:eastAsia="David" w:hAnsi="David"/>
+          <w:b w:val="false"/>
+          <w:bCs w:val="false"/>
+          <w:i w:val="false"/>
+          <w:iCs w:val="false"/>
+          <w:sz w:val="24"/>
+          <w:szCs w:val="24"/>
+          <w:rtl/>
+        </w:rPr>
+        <w:t xml:space="preserve">בחרתי במקור הראשון: סיפור תחילתו של רבי אליעזר בן הורקנוס (פרקי דרבי אליעזר, פרקים א-ב, ומקבילות באבות דרבי נתן נוסח א ובמדרשים נוספים), שנלמד בדף החברותא "איך נעשים חכמ.ה".</w:t>
       </w:r>
     </w:p>
     <w:p>
@@ -1001,7 +1056,7 @@
           <w:szCs w:val="24"/>
           <w:rtl/>
         </w:rPr>
-        <w:t xml:space="preserve">הסיפור מתאר את ראשית דרכו של מי שיהיה מגדולי התנאים – ומתחיל דווקא בכישלון: אליעזר הוא בן עשרים ושתיים שלא למד תורה מעולם, בן לאב עשיר בעל שדות. בעוד אחיו חורשים באדמה הפורייה, הוא נשלח לחרוש בטרשים – ובוכה. האב מפרש את הבכי כקובלנה על תנאי העבודה ומיטיב עמו, אך הבכי נמשך, שכן מקורו אחר: "שאני מבקש ללמוד תורה". האב לועג – בן עשרים ושתיים ואתה מבקש ללמוד?! – ואליעזר בורח מבית אביו אל בית מדרשו של רבן יוחנן בן זכאי בירושלים. שם הוא לומד מבראשית – קריאת שמע, תפילה, ברכת המזון, שתי הלכות ביום – ברעב ובמסירות קיצונית, שמונה ימים בלא מזון, עד שריח פיו מסגיר אותו והרב מגלה את גדול תלמידיו העתידי דווקא בתלמיד המורעב והבוש. שיא הסיפור בהיפוך כפול: הורקנוס עולה לירושלים להדיר את בנו מנכסיו, ומוצא אותו דורש "דברים שלא שמעתם אוזן מעולם", פניו מאירות "וקרנותיו יוצאות כקרנותיו של משה"; ריב"ז מנשקו וקורא "אשריכם אברהם יצחק ויעקב שיצא זה מחלציכם", והאב, שבא לנשל – עומד ומוריש לו את כל נכסיו. אליעזר, בתשובתו, מסרב לראות בנכסים תכלית: "לא ביקשתי מלפני הקדוש ברוך הוא אלא תורה בלבד".</w:t>
+        <w:t xml:space="preserve">הסיפור מתאר את ראשית דרכו של מי שיהיה מגדולי התנאים, והוא מתחיל דווקא בכישלון. אליעזר הוא בן עשרים ושתיים שלא למד תורה מעולם, בן לאב עשיר בעל שדות. בעוד אחיו חורשים באדמה הפורייה, הוא נשלח לחרוש בטרשים, והוא בוכה. האב מפרש את הבכי כקובלנה על תנאי העבודה ומיטיב עמו, אך הבכי נמשך, שכן מקורו אחר: "שאני מבקש ללמוד תורה". האב לועג לו, בן עשרים ושתיים ואתה מבקש ללמוד?! אליעזר בורח מבית אביו אל בית מדרשו של רבן יוחנן בן זכאי בירושלים, ושם מתחיל מבראשית: קריאת שמע, תפילה, ברכת המזון, שתי הלכות ביום. הוא לומד ברעב ובמסירות קיצונית, שמונה ימים בלא מזון, עד שריח פיו מסגיר אותו, והרב מגלה את גדול תלמידיו העתידי דווקא בתלמיד המורעב והבוש. שיא הסיפור בהיפוך כפול. הורקנוס עולה לירושלים להדיר את בנו מנכסיו, ומוצא אותו דורש "דברים שלא שמעתם אוזן מעולם", פניו מאירות "וקרנותיו יוצאות כקרנותיו של משה". רבן יוחנן מנשקו וקורא "אשריכם אברהם יצחק ויעקב שיצא זה מחלציכם", והאב שבא לנשל עומד ומוריש לבנו את כל נכסיו. אליעזר מסרב לראות בנכסים תכלית: "לא ביקשתי מלפני הקדוש ברוך הוא אלא תורה בלבד".</w:t>
       </w:r>
     </w:p>
     <w:p>
@@ -1041,47 +1096,47 @@
           <w:szCs w:val="24"/>
           <w:rtl/>
         </w:rPr>
-        <w:t xml:space="preserve">ראשית, הסיפור מגלם את הציר המרכזי שנלמד בקורס – המרכז עובר מבית המקדש אל בית המדרש, וממוקד הקדושה שבמקום אל האדם (כניתוחו של יאיר לורברבוים במאמר "ממקדש לאדם"). גיבור הסיפור אינו כהן ואינו בעל אחוזה: הדרמה כולה מתרחשת בין שדה חרוש לבית מדרש, והקדושה מתגלה בלימודו של אדם אחד. הערכים המקודשים של העולם הישן – אדמה, ירושה, ממון – מוצבים במפורש מול התורה, ומוכרעים: "אילו קרקעות ביקשתי... אילו כסף וזהב ביקשתי... לא ביקשתי אלא תורה בלבד".</w:t>
-      </w:r>
-    </w:p>
-    <w:p>
-      <w:pPr>
-        <w:bidi/>
-        <w:spacing w:after="120" w:line="360" w:lineRule="auto"/>
-        <w:jc w:val="both"/>
-      </w:pPr>
-      <w:r>
-        <w:rPr>
-          <w:rFonts w:ascii="David" w:cs="David" w:eastAsia="David" w:hAnsi="David"/>
-          <w:b w:val="false"/>
-          <w:bCs w:val="false"/>
-          <w:i w:val="false"/>
-          <w:iCs w:val="false"/>
-          <w:sz w:val="24"/>
-          <w:szCs w:val="24"/>
-          <w:rtl/>
-        </w:rPr>
-        <w:t xml:space="preserve">שנית, ניכרת המגמה שנלמדה ביחידה "מנביא לחכם" – שינוי תפיסת ההנהגה ממלך, כהן ונביא אל תלמיד החכם. תיאורו של אליעזר הדורש – "פניו מאירות כאור החמה וקרנותיו יוצאות כקרנותיו של משה" – שואל במכוון את דמות משה היורד מסיני, ומעמיד את הדרשן בבית המדרש כממשיכה של ההתגלות: החכם, שנטלה הנבואה וניתנה לו, מחדש "דברים שלא שמעתם אוזן מעולם" – והחידוש הפרשני תופס את מקום ההתגלות הישירה.</w:t>
-      </w:r>
-    </w:p>
-    <w:p>
-      <w:pPr>
-        <w:bidi/>
-        <w:spacing w:after="120" w:line="360" w:lineRule="auto"/>
-        <w:jc w:val="both"/>
-      </w:pPr>
-      <w:r>
-        <w:rPr>
-          <w:rFonts w:ascii="David" w:cs="David" w:eastAsia="David" w:hAnsi="David"/>
-          <w:b w:val="false"/>
-          <w:bCs w:val="false"/>
-          <w:i w:val="false"/>
-          <w:iCs w:val="false"/>
-          <w:sz w:val="24"/>
-          <w:szCs w:val="24"/>
-          <w:rtl/>
-        </w:rPr>
-        <w:t xml:space="preserve">שלישית, הסיפור משקף את האתוס שמעמדו של חכם נקנה בלימוד ואינו עובר בירושה ואינו תלוי בגיל, בממון או בייחוס: אליעזר מתחיל מאפס בגיל עשרים ושתיים, בניגוד לרצון אביו העשיר, ומעמדו החדש נבנה כולו בתוך המסגרת המכוננת של התקופה – בית המדרש ויחסי הרב והתלמיד: לימוד מדורג ושיטתי, רב הקשוב לתלמידו עד כדי הבחנה בריח פיו, וקרבה הנמסרת בנשיקה על הראש – הרב כמו נעשה אב.</w:t>
+        <w:t xml:space="preserve">המגמה הראשונה היא הציר המרכזי שנלמד בקורס: המרכז עובר מבית המקדש אל בית המדרש, וממוקד הקדושה שבמקום אל האדם (לורברבוים, 2018). גיבור הסיפור אינו כהן ואינו יורש אחוזה. הדרמה כולה מתרחשת בין שדה חרוש לבית מדרש, והקדושה מתגלה בלימודו של אדם אחד. הערכים המקודשים של העולם הישן, אדמה, ירושה וממון, מוצבים במפורש מול התורה ומוכרעים: "אילו קרקעות ביקשתי... אילו כסף וזהב ביקשתי... לא ביקשתי אלא תורה בלבד".</w:t>
+      </w:r>
+    </w:p>
+    <w:p>
+      <w:pPr>
+        <w:bidi/>
+        <w:spacing w:after="120" w:line="360" w:lineRule="auto"/>
+        <w:jc w:val="both"/>
+      </w:pPr>
+      <w:r>
+        <w:rPr>
+          <w:rFonts w:ascii="David" w:cs="David" w:eastAsia="David" w:hAnsi="David"/>
+          <w:b w:val="false"/>
+          <w:bCs w:val="false"/>
+          <w:i w:val="false"/>
+          <w:iCs w:val="false"/>
+          <w:sz w:val="24"/>
+          <w:szCs w:val="24"/>
+          <w:rtl/>
+        </w:rPr>
+        <w:t xml:space="preserve">מגמה שנייה נלמדה ביחידה "מנביא לחכם": שינוי תפיסת ההנהגה ממלך, כהן ונביא אל תלמיד החכם (סבאג ישראל, 2026). תיאורו של אליעזר הדורש, "פניו מאירות כאור החמה וקרנותיו יוצאות כקרנותיו של משה", שואל במכוון את דמות משה היורד מסיני, ומעמיד את הדרשן בבית המדרש כממשיכה של ההתגלות. החכם מחדש "דברים שלא שמעתם אוזן מעולם", והחידוש הפרשני בא במקומה של הנבואה.</w:t>
+      </w:r>
+    </w:p>
+    <w:p>
+      <w:pPr>
+        <w:bidi/>
+        <w:spacing w:after="120" w:line="360" w:lineRule="auto"/>
+        <w:jc w:val="both"/>
+      </w:pPr>
+      <w:r>
+        <w:rPr>
+          <w:rFonts w:ascii="David" w:cs="David" w:eastAsia="David" w:hAnsi="David"/>
+          <w:b w:val="false"/>
+          <w:bCs w:val="false"/>
+          <w:i w:val="false"/>
+          <w:iCs w:val="false"/>
+          <w:sz w:val="24"/>
+          <w:szCs w:val="24"/>
+          <w:rtl/>
+        </w:rPr>
+        <w:t xml:space="preserve">ולצד אלה משתקף בקטע האתוס שלפיו מעמדו של חכם נקנה בלימוד: הוא אינו עובר בירושה ואינו תלוי בגיל, בממון או בייחוס. אליעזר מתחיל מאפס בגיל עשרים ושתיים, בניגוד לרצון אביו העשיר, ומעמדו נבנה כולו בתוך המסגרת המכוננת של התקופה, בית המדרש ויחסי הרב והתלמיד: לימוד מדורג ושיטתי, רב הקשוב לתלמידו עד כדי הבחנה בריח פיו, וקרבה הנחתמת בנשיקה על הראש. הרב נעשה מעין אב.</w:t>
       </w:r>
     </w:p>
     <w:p>
@@ -1101,47 +1156,47 @@
           <w:szCs w:val="24"/>
           <w:rtl/>
         </w:rPr>
-        <w:t xml:space="preserve">ג. הרחבה על דמות מן הקטע – רבי אליעזר בן הורקנוס</w:t>
-      </w:r>
-    </w:p>
-    <w:p>
-      <w:pPr>
-        <w:bidi/>
-        <w:spacing w:after="120" w:line="360" w:lineRule="auto"/>
-        <w:jc w:val="both"/>
-      </w:pPr>
-      <w:r>
-        <w:rPr>
-          <w:rFonts w:ascii="David" w:cs="David" w:eastAsia="David" w:hAnsi="David"/>
-          <w:b w:val="false"/>
-          <w:bCs w:val="false"/>
-          <w:i w:val="false"/>
-          <w:iCs w:val="false"/>
-          <w:sz w:val="24"/>
-          <w:szCs w:val="24"/>
-          <w:rtl/>
-        </w:rPr>
-        <w:t xml:space="preserve">את דמותו של רבי אליעזר עצמו פגשנו במקורות נוספים במפגשים, והם מצטרפים לדיוקן עקבי ומרתק. במשנה, מסכת אבות פרק ב, משנה ח – שנלמדה ביחידה "צמיחה מתוך משבר" – מונה רבן יוחנן בן זכאי את חמשת תלמידיו ומגדיר את שבחו: "אליעזר בן הורקנוס – בור סוּד שאינו מאבד טיפה". הדימוי מתכתב להפליא עם סיפור תחילתו: כשנדרש לדרוש לפני רבו השיב "משל לבור שאינו יכול להוציא מים יותר ממה שהוא מכניס – כך אין אני יכול לומר דברי תורה יותר ממה שקיבלתי ממך". רבי אליעזר הוא אפוא איש המסורת בהתגלמותו: כוחו בשימור מדוקדק של מה שקיבל, לא בהמצאה. ובהמשך שם (משנה ט), כשנשאלים התלמידים "איזוהי דרך טובה שידבק בה האדם", תשובתו – "עין טובה".</w:t>
-      </w:r>
-    </w:p>
-    <w:p>
-      <w:pPr>
-        <w:bidi/>
-        <w:spacing w:after="120" w:line="360" w:lineRule="auto"/>
-        <w:jc w:val="both"/>
-      </w:pPr>
-      <w:r>
-        <w:rPr>
-          <w:rFonts w:ascii="David" w:cs="David" w:eastAsia="David" w:hAnsi="David"/>
-          <w:b w:val="false"/>
-          <w:bCs w:val="false"/>
-          <w:i w:val="false"/>
-          <w:iCs w:val="false"/>
-          <w:sz w:val="24"/>
-          <w:szCs w:val="24"/>
-          <w:rtl/>
-        </w:rPr>
-        <w:t xml:space="preserve">פן אחר, מעורר מחלוקת, פגשנו במפגש על לימוד תורה לנשים: במשנה סוטה פרק ג, משנה ד, מול בן עזאי הקובע "חייב אדם ללמד את בתו תורה", מציב רבי אליעזר את העמדה המחמירה: "כל המלמד את בתו תורה – כאילו מלמדה תפלות"; והבבלי (סוטה כא ע"ב) מטעים את דבריו בדרשת רבי אבהו "כיוון שנכנסה חכמה באדם נכנסה עמו ערמומית". בעקבות דיונו של דניאל בויארין בפרק "הבשר שברוח" למדנו לראות במחלוקת זו מאבק עקרוני על גבולות בית המדרש ועל השאלה מי שותף ל"תאוות הלימוד". וכאן מתחדד הפרדוקס של הדמות: האיש שפרץ בעצמו כל גבול כדי להיכנס לבית המדרש – בגיל מאוחר, נגד אביו, כנגד כל הסיכויים – הוא הנועל את שעריו בפני נשים; שומר הסף הגדול של המסורת, ה"בור הסוד", מבקש לשמר גם את גבולותיה החברתיים. ראוי להזכיר עוד כי בסיפור תחילתו של רבי עקיבא, שנלמד באותו דף חברותא, יושב רבי עקיבא שנים "לפני רבי אליעזר" – הבור הסוד נעשה בעצמו רבו של גדול הדרשנים; וכי אשתו, אמא שלום אחות רבן גמליאל, נזכרה אף היא במקורות שנלמדו במפגש על הנשים הלומדות.</w:t>
+        <w:t xml:space="preserve">ג. הרחבה על דמות מן הקטע: רבי אליעזר בן הורקנוס</w:t>
+      </w:r>
+    </w:p>
+    <w:p>
+      <w:pPr>
+        <w:bidi/>
+        <w:spacing w:after="120" w:line="360" w:lineRule="auto"/>
+        <w:jc w:val="both"/>
+      </w:pPr>
+      <w:r>
+        <w:rPr>
+          <w:rFonts w:ascii="David" w:cs="David" w:eastAsia="David" w:hAnsi="David"/>
+          <w:b w:val="false"/>
+          <w:bCs w:val="false"/>
+          <w:i w:val="false"/>
+          <w:iCs w:val="false"/>
+          <w:sz w:val="24"/>
+          <w:szCs w:val="24"/>
+          <w:rtl/>
+        </w:rPr>
+        <w:t xml:space="preserve">את רבי אליעזר עצמו פגשנו במקורות נוספים במפגשים, והם מצטרפים לדיוקן עקבי. במשנה, מסכת אבות פרק ב, משנה ח, שנלמדה ביחידה "צמיחה מתוך משבר", מונה רבן יוחנן בן זכאי את חמשת תלמידיו ומגדיר את שבחו: "אליעזר בן הורקנוס, בור סוּד שאינו מאבד טיפה". הדימוי מתכתב להפליא עם סיפור תחילתו. כשנדרש שם לדרוש לפני רבו השיב: "משל לבור שאינו יכול להוציא מים יותר ממה שהוא מכניס, כך אין אני יכול לומר דברי תורה יותר ממה שקיבלתי ממך". רבי אליעזר הוא איש המסורת בהתגלמותו, וכוחו בשימור מדוקדק של מה שקיבל. בהמשך שם (משנה ט), כשנשאלים התלמידים איזוהי דרך טובה שידבק בה האדם, תשובתו היא "עין טובה".</w:t>
+      </w:r>
+    </w:p>
+    <w:p>
+      <w:pPr>
+        <w:bidi/>
+        <w:spacing w:after="120" w:line="360" w:lineRule="auto"/>
+        <w:jc w:val="both"/>
+      </w:pPr>
+      <w:r>
+        <w:rPr>
+          <w:rFonts w:ascii="David" w:cs="David" w:eastAsia="David" w:hAnsi="David"/>
+          <w:b w:val="false"/>
+          <w:bCs w:val="false"/>
+          <w:i w:val="false"/>
+          <w:iCs w:val="false"/>
+          <w:sz w:val="24"/>
+          <w:szCs w:val="24"/>
+          <w:rtl/>
+        </w:rPr>
+        <w:t xml:space="preserve">פן אחר, שנוי במחלוקת, נלמד במפגש על לימוד תורה לנשים. במשנה סוטה פרק ג, משנה ד, מול בן עזאי הקובע "חייב אדם ללמד את בתו תורה", מציב רבי אליעזר את העמדה המחמירה: "כל המלמד את בתו תורה, כאילו מלמדה תפלות". הבבלי (סוטה כא ע"ב) מטעים את דבריו בדרשת רבי אבהו, "כיוון שנכנסה חכמה באדם נכנסה עמו ערמומית". בעקבות דיונו של בויארין (1999) נלמדה המחלוקת הזאת כמאבק עקרוני על גבולות בית המדרש ועל השאלה מי שותף לתאוות הלימוד. וכאן מתחדד פרדוקס בדמותו: האיש שפרץ בעצמו כל גבול כדי להיכנס לבית המדרש, בגיל מאוחר, נגד אביו וכנגד כל הסיכויים, הוא הנועל את שעריו בפני נשים. שומר הסף של המסורת מבקש לשמור גם על גבולותיה החברתיים. ראוי להוסיף כי בסיפור תחילתו של רבי עקיבא, שנלמד באותו דף חברותא, יושב רבי עקיבא שנים לפני רבי אליעזר ולומד מפיו: הבור הסוד נעשה בעצמו רבו של גדול הדרשנים.</w:t>
       </w:r>
     </w:p>
     <w:p>
@@ -1166,107 +1221,92 @@
           <w:szCs w:val="28"/>
           <w:rtl/>
         </w:rPr>
-        <w:t xml:space="preserve">ביבליוגרפיה</w:t>
-      </w:r>
-    </w:p>
-    <w:p>
-      <w:pPr>
-        <w:bidi/>
-        <w:spacing w:after="120" w:line="360" w:lineRule="auto"/>
-        <w:jc w:val="right"/>
-      </w:pPr>
-      <w:r>
-        <w:rPr>
-          <w:rFonts w:ascii="David" w:cs="David" w:eastAsia="David" w:hAnsi="David"/>
-          <w:b w:val="false"/>
-          <w:bCs w:val="false"/>
-          <w:i w:val="false"/>
-          <w:iCs w:val="false"/>
-          <w:sz w:val="24"/>
-          <w:szCs w:val="24"/>
-          <w:rtl/>
-        </w:rPr>
-        <w:t xml:space="preserve">בויארין, דניאל, "תאוות הלימוד: התורה כאישה אחרת", בתוך: הבשר שברוח – שיח המיניות בתלמוד, תל אביב: עם עובד, תשנ"ט, עמ' 170–183.</w:t>
-      </w:r>
-    </w:p>
-    <w:p>
-      <w:pPr>
-        <w:bidi/>
-        <w:spacing w:after="120" w:line="360" w:lineRule="auto"/>
-        <w:jc w:val="right"/>
-      </w:pPr>
-      <w:r>
-        <w:rPr>
-          <w:rFonts w:ascii="David" w:cs="David" w:eastAsia="David" w:hAnsi="David"/>
-          <w:b w:val="false"/>
-          <w:bCs w:val="false"/>
-          <w:i w:val="false"/>
-          <w:iCs w:val="false"/>
-          <w:sz w:val="24"/>
-          <w:szCs w:val="24"/>
-          <w:rtl/>
-        </w:rPr>
-        <w:t xml:space="preserve">הלברטל, משה, "מבוא למשנה", שישה סדרי משנה, סדרת עם הספר, תל אביב: ידיעות אחרונות.</w:t>
-      </w:r>
-    </w:p>
-    <w:p>
-      <w:pPr>
-        <w:bidi/>
-        <w:spacing w:after="120" w:line="360" w:lineRule="auto"/>
-        <w:jc w:val="right"/>
-      </w:pPr>
-      <w:r>
-        <w:rPr>
-          <w:rFonts w:ascii="David" w:cs="David" w:eastAsia="David" w:hAnsi="David"/>
-          <w:b w:val="false"/>
-          <w:bCs w:val="false"/>
-          <w:i w:val="false"/>
-          <w:iCs w:val="false"/>
-          <w:sz w:val="24"/>
-          <w:szCs w:val="24"/>
-          <w:rtl/>
-        </w:rPr>
-        <w:t xml:space="preserve">לורברבוים, יאיר, "ממקדש לאדם: תמורות במוקד הקדושה בספרות חז"ל", דעת: כתב עת לפילוסופיה יהודית וקבלה 86 (תשע"ט), עמ' 377–396.</w:t>
-      </w:r>
-    </w:p>
-    <w:p>
-      <w:pPr>
-        <w:bidi/>
-        <w:spacing w:after="120" w:line="360" w:lineRule="auto"/>
-        <w:jc w:val="right"/>
-      </w:pPr>
-      <w:r>
-        <w:rPr>
-          <w:rFonts w:ascii="David" w:cs="David" w:eastAsia="David" w:hAnsi="David"/>
-          <w:b w:val="false"/>
-          <w:bCs w:val="false"/>
-          <w:i w:val="false"/>
-          <w:iCs w:val="false"/>
-          <w:sz w:val="24"/>
-          <w:szCs w:val="24"/>
-          <w:rtl/>
-        </w:rPr>
-        <w:t xml:space="preserve">מרקס, דליה, "רבן יוחנן בן זכאי והקמת יבנה: ניתוח והערכת הסיפור בראי הזמן".</w:t>
-      </w:r>
-    </w:p>
-    <w:p>
-      <w:pPr>
-        <w:bidi/>
-        <w:spacing w:after="120" w:line="360" w:lineRule="auto"/>
-        <w:jc w:val="right"/>
-      </w:pPr>
-      <w:r>
-        <w:rPr>
-          <w:rFonts w:ascii="David" w:cs="David" w:eastAsia="David" w:hAnsi="David"/>
-          <w:b w:val="false"/>
-          <w:bCs w:val="false"/>
-          <w:i w:val="false"/>
-          <w:iCs w:val="false"/>
-          <w:sz w:val="24"/>
-          <w:szCs w:val="24"/>
-          <w:rtl/>
-        </w:rPr>
-        <w:t xml:space="preserve">דפי המקורות, דפי החברותא והמצגות מאתר הקורס: מפגשים 1–2 ("שתי תורות", עגלה ערופה), שיעורים 3–5 ("מנביא לחכם", משנה ותוספתא, דף חברותא מאפייני המשנה), היחידה "צמיחה מתוך משבר" (ריב"ז והיציאה מירושלים), דף חברותא "איך נעשים חכמ.ה", דף מקורות מפגש 11 (לימוד תורה לנשים).</w:t>
+        <w:t xml:space="preserve">רשימת מקורות</w:t>
+      </w:r>
+    </w:p>
+    <w:p>
+      <w:pPr>
+        <w:bidi/>
+        <w:spacing w:after="120" w:line="360" w:lineRule="auto"/>
+        <w:ind w:right="709" w:hanging="709"/>
+        <w:jc w:val="right"/>
+      </w:pPr>
+      <w:r>
+        <w:rPr>
+          <w:rFonts w:ascii="David" w:cs="David" w:eastAsia="David" w:hAnsi="David"/>
+          <w:sz w:val="24"/>
+          <w:szCs w:val="24"/>
+          <w:rtl/>
+        </w:rPr>
+        <w:t xml:space="preserve">בויארין, ד' (1999). תאוות הלימוד: התורה כאישה אחרת. בתוך הבשר שברוח: שיח המיניות בתלמוד (עמ' 170-183). עם עובד.</w:t>
+      </w:r>
+    </w:p>
+    <w:p>
+      <w:pPr>
+        <w:bidi/>
+        <w:spacing w:after="120" w:line="360" w:lineRule="auto"/>
+        <w:ind w:right="709" w:hanging="709"/>
+        <w:jc w:val="right"/>
+      </w:pPr>
+      <w:r>
+        <w:rPr>
+          <w:rFonts w:ascii="David" w:cs="David" w:eastAsia="David" w:hAnsi="David"/>
+          <w:sz w:val="24"/>
+          <w:szCs w:val="24"/>
+          <w:rtl/>
+        </w:rPr>
+        <w:t xml:space="preserve">הלברטל, מ' (ל.ת.). מבוא למשנה. בתוך שישה סדרי משנה (סדרת עם הספר). ידיעות אחרונות.</w:t>
+      </w:r>
+    </w:p>
+    <w:p>
+      <w:pPr>
+        <w:bidi/>
+        <w:spacing w:after="120" w:line="360" w:lineRule="auto"/>
+        <w:ind w:right="709" w:hanging="709"/>
+        <w:jc w:val="right"/>
+      </w:pPr>
+      <w:r>
+        <w:rPr>
+          <w:rFonts w:ascii="David" w:cs="David" w:eastAsia="David" w:hAnsi="David"/>
+          <w:sz w:val="24"/>
+          <w:szCs w:val="24"/>
+          <w:rtl/>
+        </w:rPr>
+        <w:t xml:space="preserve">לורברבוים, י' (2018). ממקדש לאדם: תמורות במוקד הקדושה בספרות חז"ל. דעת: כתב עת לפילוסופיה יהודית וקבלה, 86, 377-396.</w:t>
+      </w:r>
+    </w:p>
+    <w:p>
+      <w:pPr>
+        <w:bidi/>
+        <w:spacing w:after="120" w:line="360" w:lineRule="auto"/>
+        <w:ind w:right="709" w:hanging="709"/>
+        <w:jc w:val="right"/>
+      </w:pPr>
+      <w:r>
+        <w:rPr>
+          <w:rFonts w:ascii="David" w:cs="David" w:eastAsia="David" w:hAnsi="David"/>
+          <w:sz w:val="24"/>
+          <w:szCs w:val="24"/>
+          <w:rtl/>
+        </w:rPr>
+        <w:t xml:space="preserve">מרקס, ד' (ל.ת.). רבן יוחנן בן זכאי והקמת יבנה: ניתוח והערכת הסיפור בראי הזמן.</w:t>
+      </w:r>
+    </w:p>
+    <w:p>
+      <w:pPr>
+        <w:bidi/>
+        <w:spacing w:after="120" w:line="360" w:lineRule="auto"/>
+        <w:ind w:right="709" w:hanging="709"/>
+        <w:jc w:val="right"/>
+      </w:pPr>
+      <w:r>
+        <w:rPr>
+          <w:rFonts w:ascii="David" w:cs="David" w:eastAsia="David" w:hAnsi="David"/>
+          <w:sz w:val="24"/>
+          <w:szCs w:val="24"/>
+          <w:rtl/>
+        </w:rPr>
+        <w:t xml:space="preserve">סבאג ישראל, ח' (2026). מצגות, דפי מקורות ודפי חברותא בקורס אדם, ספרות ומעשה בימי חז"ל [חומרי קורס].</w:t>
       </w:r>
     </w:p>
     <w:sectPr>

</xml_diff>

<commit_message>
Apply course citation rules: footnotes and quote cap
Moved all source references from in-text APA citations to real Word
footnotes (24 notes), trimmed quotations, especially the long Gittin
passage, and paraphrased repeats so quoted text is about 8.4% of the
body, under the course's 10% cap.

Co-Authored-By: Claude Fable 5 <noreply@anthropic.com>
Claude-Session: https://claude.ai/code/session_01JB6bGJBwBnqBZeMysNqh8L
</commit_message>
<xml_diff>
--- a/עבודת-סיום-אדם-ספרות-ומעשה-בימי-חזל.docx
+++ b/עבודת-סיום-אדם-ספרות-ומעשה-בימי-חזל.docx
@@ -13,8 +13,6 @@
           <w:rFonts w:ascii="David" w:cs="David" w:eastAsia="David" w:hAnsi="David"/>
           <w:b w:val="false"/>
           <w:bCs w:val="false"/>
-          <w:i w:val="false"/>
-          <w:iCs w:val="false"/>
           <w:sz w:val="24"/>
           <w:szCs w:val="24"/>
           <w:rtl/>
@@ -33,8 +31,6 @@
           <w:rFonts w:ascii="David" w:cs="David" w:eastAsia="David" w:hAnsi="David"/>
           <w:b w:val="false"/>
           <w:bCs w:val="false"/>
-          <w:i w:val="false"/>
-          <w:iCs w:val="false"/>
           <w:sz w:val="24"/>
           <w:szCs w:val="24"/>
           <w:rtl/>
@@ -53,8 +49,6 @@
           <w:rFonts w:ascii="David" w:cs="David" w:eastAsia="David" w:hAnsi="David"/>
           <w:b w:val="false"/>
           <w:bCs w:val="false"/>
-          <w:i w:val="false"/>
-          <w:iCs w:val="false"/>
           <w:sz w:val="24"/>
           <w:szCs w:val="24"/>
           <w:rtl/>
@@ -73,8 +67,6 @@
           <w:rFonts w:ascii="David" w:cs="David" w:eastAsia="David" w:hAnsi="David"/>
           <w:b/>
           <w:bCs/>
-          <w:i w:val="false"/>
-          <w:iCs w:val="false"/>
           <w:sz w:val="32"/>
           <w:szCs w:val="32"/>
           <w:rtl/>
@@ -93,8 +85,6 @@
           <w:rFonts w:ascii="David" w:cs="David" w:eastAsia="David" w:hAnsi="David"/>
           <w:b w:val="false"/>
           <w:bCs w:val="false"/>
-          <w:i w:val="false"/>
-          <w:iCs w:val="false"/>
           <w:sz w:val="28"/>
           <w:szCs w:val="28"/>
           <w:rtl/>
@@ -113,8 +103,6 @@
           <w:rFonts w:ascii="David" w:cs="David" w:eastAsia="David" w:hAnsi="David"/>
           <w:b w:val="false"/>
           <w:bCs w:val="false"/>
-          <w:i w:val="false"/>
-          <w:iCs w:val="false"/>
           <w:sz w:val="24"/>
           <w:szCs w:val="24"/>
           <w:rtl/>
@@ -133,8 +121,6 @@
           <w:rFonts w:ascii="David" w:cs="David" w:eastAsia="David" w:hAnsi="David"/>
           <w:b w:val="false"/>
           <w:bCs w:val="false"/>
-          <w:i w:val="false"/>
-          <w:iCs w:val="false"/>
           <w:sz w:val="24"/>
           <w:szCs w:val="24"/>
           <w:rtl/>
@@ -153,8 +139,6 @@
           <w:rFonts w:ascii="David" w:cs="David" w:eastAsia="David" w:hAnsi="David"/>
           <w:b w:val="false"/>
           <w:bCs w:val="false"/>
-          <w:i w:val="false"/>
-          <w:iCs w:val="false"/>
           <w:sz w:val="28"/>
           <w:szCs w:val="28"/>
           <w:rtl/>
@@ -173,8 +157,6 @@
           <w:rFonts w:ascii="David" w:cs="David" w:eastAsia="David" w:hAnsi="David"/>
           <w:b/>
           <w:bCs/>
-          <w:i w:val="false"/>
-          <w:iCs w:val="false"/>
           <w:sz w:val="36"/>
           <w:szCs w:val="36"/>
           <w:rtl/>
@@ -193,8 +175,6 @@
           <w:rFonts w:ascii="David" w:cs="David" w:eastAsia="David" w:hAnsi="David"/>
           <w:b w:val="false"/>
           <w:bCs w:val="false"/>
-          <w:i w:val="false"/>
-          <w:iCs w:val="false"/>
           <w:sz w:val="24"/>
           <w:szCs w:val="24"/>
           <w:rtl/>
@@ -213,8 +193,6 @@
           <w:rFonts w:ascii="David" w:cs="David" w:eastAsia="David" w:hAnsi="David"/>
           <w:b w:val="false"/>
           <w:bCs w:val="false"/>
-          <w:i w:val="false"/>
-          <w:iCs w:val="false"/>
           <w:sz w:val="26"/>
           <w:szCs w:val="26"/>
           <w:rtl/>
@@ -233,8 +211,6 @@
           <w:rFonts w:ascii="David" w:cs="David" w:eastAsia="David" w:hAnsi="David"/>
           <w:b w:val="false"/>
           <w:bCs w:val="false"/>
-          <w:i w:val="false"/>
-          <w:iCs w:val="false"/>
           <w:sz w:val="26"/>
           <w:szCs w:val="26"/>
           <w:rtl/>
@@ -253,8 +229,6 @@
           <w:rFonts w:ascii="David" w:cs="David" w:eastAsia="David" w:hAnsi="David"/>
           <w:b w:val="false"/>
           <w:bCs w:val="false"/>
-          <w:i w:val="false"/>
-          <w:iCs w:val="false"/>
           <w:sz w:val="24"/>
           <w:szCs w:val="24"/>
           <w:rtl/>
@@ -273,8 +247,6 @@
           <w:rFonts w:ascii="David" w:cs="David" w:eastAsia="David" w:hAnsi="David"/>
           <w:b w:val="false"/>
           <w:bCs w:val="false"/>
-          <w:i w:val="false"/>
-          <w:iCs w:val="false"/>
           <w:sz w:val="24"/>
           <w:szCs w:val="24"/>
           <w:rtl/>
@@ -293,8 +265,6 @@
           <w:rFonts w:ascii="David" w:cs="David" w:eastAsia="David" w:hAnsi="David"/>
           <w:b w:val="false"/>
           <w:bCs w:val="false"/>
-          <w:i w:val="false"/>
-          <w:iCs w:val="false"/>
           <w:sz w:val="24"/>
           <w:szCs w:val="24"/>
           <w:rtl/>
@@ -313,8 +283,6 @@
           <w:rFonts w:ascii="David" w:cs="David" w:eastAsia="David" w:hAnsi="David"/>
           <w:b w:val="false"/>
           <w:bCs w:val="false"/>
-          <w:i w:val="false"/>
-          <w:iCs w:val="false"/>
           <w:sz w:val="26"/>
           <w:szCs w:val="26"/>
           <w:rtl/>
@@ -333,8 +301,6 @@
           <w:rFonts w:ascii="David" w:cs="David" w:eastAsia="David" w:hAnsi="David"/>
           <w:b w:val="false"/>
           <w:bCs w:val="false"/>
-          <w:i w:val="false"/>
-          <w:iCs w:val="false"/>
           <w:sz w:val="26"/>
           <w:szCs w:val="26"/>
           <w:rtl/>
@@ -353,8 +319,6 @@
           <w:rFonts w:ascii="David" w:cs="David" w:eastAsia="David" w:hAnsi="David"/>
           <w:b w:val="false"/>
           <w:bCs w:val="false"/>
-          <w:i w:val="false"/>
-          <w:iCs w:val="false"/>
           <w:sz w:val="24"/>
           <w:szCs w:val="24"/>
           <w:rtl/>
@@ -373,8 +337,6 @@
           <w:rFonts w:ascii="David" w:cs="David" w:eastAsia="David" w:hAnsi="David"/>
           <w:b w:val="false"/>
           <w:bCs w:val="false"/>
-          <w:i w:val="false"/>
-          <w:iCs w:val="false"/>
           <w:sz w:val="24"/>
           <w:szCs w:val="24"/>
           <w:rtl/>
@@ -398,8 +360,6 @@
           <w:rFonts w:ascii="David" w:cs="David" w:eastAsia="David" w:hAnsi="David"/>
           <w:b/>
           <w:bCs/>
-          <w:i w:val="false"/>
-          <w:iCs w:val="false"/>
           <w:sz w:val="28"/>
           <w:szCs w:val="28"/>
           <w:rtl/>
@@ -418,8 +378,6 @@
           <w:rFonts w:ascii="David" w:cs="David" w:eastAsia="David" w:hAnsi="David"/>
           <w:b/>
           <w:bCs/>
-          <w:i w:val="false"/>
-          <w:iCs w:val="false"/>
           <w:sz w:val="24"/>
           <w:szCs w:val="24"/>
           <w:rtl/>
@@ -438,13 +396,11 @@
           <w:rFonts w:ascii="David" w:cs="David" w:eastAsia="David" w:hAnsi="David"/>
           <w:b w:val="false"/>
           <w:bCs w:val="false"/>
-          <w:i w:val="false"/>
-          <w:iCs w:val="false"/>
-          <w:sz w:val="24"/>
-          <w:szCs w:val="24"/>
-          <w:rtl/>
-        </w:rPr>
-        <w:t xml:space="preserve">נבחרתי לשאת דברים בפתיחת שנת הפעילות של צוות שאני שותפה בהובלתו. בחרתי לבסס את הדברים על סוגיית עגלה ערופה שנלמדה במפגש הראשון, ובמרכזה משנה, מסכת סוטה פרק ט, משנה ו, עם הרחבתה בתלמוד הבבלי, סוטה מו ע"ב:</w:t>
+          <w:sz w:val="24"/>
+          <w:szCs w:val="24"/>
+          <w:rtl/>
+        </w:rPr>
+        <w:t xml:space="preserve">נבחרתי לשאת דברים בפתיחת שנת הפעילות של צוות שאני שותפה בהובלתו, ובחרתי לבסס את הדברים על סוגיית עגלה ערופה שנלמדה במפגש הראשון. התורה (דברים כא) קובעת שכאשר נמצא חלל בשדה ואין יודעים מי הכהו, יוצאים זקני העיר הקרובה אל נחל איתן, עורפים שם עגלה ומצהירים שידיהם לא שפכו את הדם הזה. המשנה שואלת את השאלה המתבקשת, וכי עלה על הדעת שזקני בית דין רוצחים, ומשיבה:</w:t>
       </w:r>
     </w:p>
     <w:p>
@@ -463,7 +419,13 @@
           <w:szCs w:val="24"/>
           <w:rtl/>
         </w:rPr>
-        <w:t xml:space="preserve">"זקני אותה העיר רוחצין את ידיהן במים במקום עריפה של עגלה, ואומרים: ידינו לא שפכה את הדם הזה ועינינו לא ראו. וכי על דעתנו עלתה, שזקני בית דין שופכי דמים הן?! אלא: שלא בא לידינו ופטרנוהו בלא מזון, ולא ראינוהו והנחנוהו בלא לויה."</w:t>
+        <w:t xml:space="preserve">"אלא: שלא בא לידינו ופטרנוהו בלא מזון, ולא ראינוהו והנחנוהו בלא לויה."</w:t>
+      </w:r>
+      <w:r>
+        <w:rPr>
+          <w:rStyle w:val="FootnoteReference"/>
+        </w:rPr>
+        <w:footnoteReference w:id="1"/>
       </w:r>
     </w:p>
     <w:p>
@@ -475,15 +437,26 @@
       <w:r>
         <w:rPr>
           <w:rFonts w:ascii="David" w:cs="David" w:eastAsia="David" w:hAnsi="David"/>
-          <w:b w:val="false"/>
-          <w:bCs w:val="false"/>
-          <w:i w:val="false"/>
-          <w:iCs w:val="false"/>
-          <w:sz w:val="24"/>
-          <w:szCs w:val="24"/>
-          <w:rtl/>
-        </w:rPr>
-        <w:t xml:space="preserve">המשנה מפרשת את הטקס המקראי שבספר דברים, פרק כא: כאשר נמצא חלל בשדה ואין יודעים מי הכהו, יוצאים זקני העיר הקרובה, עורפים עגלה בנחל ומצהירים "ידינו לא שפכו את הדם הזה". המשנה שואלת את השאלה המתבקשת, וכי עלה על הדעת שזקני בית דין רוצחים, ותשובתה מרחיקת לכת: ההצהרה אינה על הרצח אלא על המחדל. הזקנים מעידים שהאיש לא יצא מעירם רעב ובלא ליווי. התלמוד שם ממשיך ומחריף: "אמר רבי יוחנן משום רבי מאיר: כל שאינו מלוה ומתלוה כאילו שופך דמים", ולצדו: "כל המלוה את חברו ארבע אמות בעיר אינו ניזוק".</w:t>
+          <w:sz w:val="24"/>
+          <w:szCs w:val="24"/>
+          <w:rtl/>
+        </w:rPr>
+        <w:t xml:space="preserve">ההצהרה, מתברר, אינה על הרצח אלא על המחדל: הזקנים מעידים שהאיש לא יצא מעירם רעב ובלא ליווי. התלמוד מרחיב את הרעיון ומחריף אותו: "כל שאינו מלוה ומתלוה כאילו שופך דמים"</w:t>
+      </w:r>
+      <w:r>
+        <w:rPr>
+          <w:rStyle w:val="FootnoteReference"/>
+        </w:rPr>
+        <w:footnoteReference w:id="2"/>
+      </w:r>
+      <w:r>
+        <w:rPr>
+          <w:rFonts w:ascii="David" w:cs="David" w:eastAsia="David" w:hAnsi="David"/>
+          <w:sz w:val="24"/>
+          <w:szCs w:val="24"/>
+          <w:rtl/>
+        </w:rPr>
+        <w:t xml:space="preserve">, ולצד האזהרה מובאת שם גם הבטחה, שהמלווה את חברו ארבע אמות בעיר שוב אינו ניזוק.</w:t>
       </w:r>
     </w:p>
     <w:p>
@@ -497,8 +470,6 @@
           <w:rFonts w:ascii="David" w:cs="David" w:eastAsia="David" w:hAnsi="David"/>
           <w:b/>
           <w:bCs/>
-          <w:i w:val="false"/>
-          <w:iCs w:val="false"/>
           <w:sz w:val="24"/>
           <w:szCs w:val="24"/>
           <w:rtl/>
@@ -515,15 +486,26 @@
       <w:r>
         <w:rPr>
           <w:rFonts w:ascii="David" w:cs="David" w:eastAsia="David" w:hAnsi="David"/>
-          <w:b w:val="false"/>
-          <w:bCs w:val="false"/>
-          <w:i w:val="false"/>
-          <w:iCs w:val="false"/>
-          <w:sz w:val="24"/>
-          <w:szCs w:val="24"/>
-          <w:rtl/>
-        </w:rPr>
-        <w:t xml:space="preserve">מקור הטקסט במשנה, מסכת סוטה, בפרק העוסק בטקסים שבטלו, והרחבתו בסוגיה בבבלי שם. הדמויות המרכזיות הן זקני העיר והכוהנים, כלומר ההנהגה, ומולם החלל האלמוני שאיש אינו יודע את שמו. הסיטואציה היא מוות שאין לו אשם ידוע, ודווקא בו מחייבים התורה וחז"ל את ההנהגה כולה לצאת אל הנחל ולתת דין וחשבון פומבי. בקורס נלמד המקור כדוגמה לתנועה של חז"ל מן המקרא אל המשנה ואל התלמוד: מטקס כפרה פולחני אל אמירה מוסרית על אחריות חברתית (סבאג ישראל, 2026).</w:t>
+          <w:sz w:val="24"/>
+          <w:szCs w:val="24"/>
+          <w:rtl/>
+        </w:rPr>
+        <w:t xml:space="preserve">מקור הטקסט במשנה, מסכת סוטה, בפרק העוסק בטקסים שבטלו, והרחבתו בסוגיה בבבלי שם. הדמויות המרכזיות הן זקני העיר והכוהנים, כלומר ההנהגה, ומולם החלל האלמוני שאיש אינו יודע את שמו. הסיטואציה היא מוות שאין לו אשם ידוע, ודווקא בו מחייבים התורה וחז"ל את ההנהגה כולה לצאת אל הנחל ולתת דין וחשבון פומבי. בקורס נלמד המקור כדוגמה לתנועה של חז"ל מן המקרא אל המשנה ואל התלמוד: מטקס כפרה פולחני אל אמירה מוסרית על אחריות חברתית</w:t>
+      </w:r>
+      <w:r>
+        <w:rPr>
+          <w:rStyle w:val="FootnoteReference"/>
+        </w:rPr>
+        <w:footnoteReference w:id="3"/>
+      </w:r>
+      <w:r>
+        <w:rPr>
+          <w:rFonts w:ascii="David" w:cs="David" w:eastAsia="David" w:hAnsi="David"/>
+          <w:sz w:val="24"/>
+          <w:szCs w:val="24"/>
+          <w:rtl/>
+        </w:rPr>
+        <w:t xml:space="preserve">.</w:t>
       </w:r>
     </w:p>
     <w:p>
@@ -537,8 +519,6 @@
           <w:rFonts w:ascii="David" w:cs="David" w:eastAsia="David" w:hAnsi="David"/>
           <w:b/>
           <w:bCs/>
-          <w:i w:val="false"/>
-          <w:iCs w:val="false"/>
           <w:sz w:val="24"/>
           <w:szCs w:val="24"/>
           <w:rtl/>
@@ -557,13 +537,11 @@
           <w:rFonts w:ascii="David" w:cs="David" w:eastAsia="David" w:hAnsi="David"/>
           <w:b w:val="false"/>
           <w:bCs w:val="false"/>
-          <w:i w:val="false"/>
-          <w:iCs w:val="false"/>
-          <w:sz w:val="24"/>
-          <w:szCs w:val="24"/>
-          <w:rtl/>
-        </w:rPr>
-        <w:t xml:space="preserve">הטקסט מתאים לדעתי משום שהוא אומר בדיוק את מה שאני מבקשת לחדד: קבוצה נמדדת במה שקל לה להזניח. הזקנים אינם נחשדים ברצח. הם נתבעים על ליווי שלא ניתן ועל מזון שלא הוצע. אחריות, על פי חז"ל, אינה מסתכמת בהימנעות מפגיעה; היא חובת נוכחות פעילה: לראות את מי שבשוליים, ללוות את היוצא לדרך, לא להניח לאיש לצאת מן העיר לבדו. עבור צוות בתחילת שנה זו אמירה מעשית מאוד. תרבות של קבוצה מתגלה ברגעי הפרידה והמעבר של חבריה, ובשאלה אם מישהו נעלם ואיש לא שם לב. האמירה "כל שאינו מלווה כאילו שופך דמים" חריפה במתכוון, והחריפות הזאת היא שנחקקת בזיכרון השומעים.</w:t>
+          <w:sz w:val="24"/>
+          <w:szCs w:val="24"/>
+          <w:rtl/>
+        </w:rPr>
+        <w:t xml:space="preserve">הטקסט מתאים לדעתי משום שהוא אומר בדיוק את מה שאני מבקשת לחדד: קבוצה נמדדת במה שקל לה להזניח. הזקנים אינם נחשדים ברצח. הם נתבעים על ליווי שלא ניתן ועל מזון שלא הוצע. אחריות, על פי חז"ל, אינה מסתכמת בהימנעות מפגיעה; היא חובת נוכחות פעילה: לראות את מי שבשוליים, ללוות את היוצא לדרך, לא להניח לאיש לצאת מן העיר לבדו. עבור צוות בתחילת שנה זו אמירה מעשית מאוד. תרבות של קבוצה מתגלה ברגעי הפרידה והמעבר של חבריה, ובשאלה אם מישהו נעלם ואיש לא שם לב. האמירה שהובאה לעיל, שמי שאינו מלווה כמוהו כשופך דמים, חריפה במתכוון, והחריפות הזאת היא שנחקקת בזיכרון השומעים.</w:t>
       </w:r>
     </w:p>
     <w:p>
@@ -582,8 +560,6 @@
           <w:rFonts w:ascii="David" w:cs="David" w:eastAsia="David" w:hAnsi="David"/>
           <w:b/>
           <w:bCs/>
-          <w:i w:val="false"/>
-          <w:iCs w:val="false"/>
           <w:sz w:val="28"/>
           <w:szCs w:val="28"/>
           <w:rtl/>
@@ -602,8 +578,6 @@
           <w:rFonts w:ascii="David" w:cs="David" w:eastAsia="David" w:hAnsi="David"/>
           <w:b/>
           <w:bCs/>
-          <w:i w:val="false"/>
-          <w:iCs w:val="false"/>
           <w:sz w:val="24"/>
           <w:szCs w:val="24"/>
           <w:rtl/>
@@ -620,15 +594,41 @@
       <w:r>
         <w:rPr>
           <w:rFonts w:ascii="David" w:cs="David" w:eastAsia="David" w:hAnsi="David"/>
-          <w:b w:val="false"/>
-          <w:bCs w:val="false"/>
-          <w:i w:val="false"/>
-          <w:iCs w:val="false"/>
-          <w:sz w:val="24"/>
-          <w:szCs w:val="24"/>
-          <w:rtl/>
-        </w:rPr>
-        <w:t xml:space="preserve">החיבור המשמעותי ביותר בעיניי מתקופת חז"ל הוא המשנה. המשנה נערכה בארץ ישראל בסביבות שנת 220 לספירה בידי רבי יהודה הנשיא ("רבי"), כסיכום ההלכה התנאית שהתפתחה בבתי המדרש מדורות בית הלל ובית שמאי, דרך משנת רבי עקיבא ותלמידיו, ועד דורו של העורך. מאפייניה, על פי מבואו של הלברטל (ל.ת.) וכפי שנלמדו במפגשים (סבאג ישראל, 2026): היקף עצום ויומרה לסכם את כלל הידע ההלכתי; ארגון ענייני בשישה סדרים (זרעים, מועד, נשים, נזיקין, קדשים, טהרות) ולא לפי סדר פסוקי המקרא; עברית ייחודית, "לשון חכמים", קצרה, מדודה וכמעט בלא הנמקות; ועריכה כרצף מחלוקות המשמרת דעות רבים ויחיד בשם אומריהן. המניעים לעריכה שנידונו בשיעור: חשש מאובדן המסורת בתקופה סוערת שלאחר החורבן והמרידות, התרחבות הידע והקושי לשלוט בו, והצורך לשמר את המסורת בלא תלות במוסדות ריכוזיים שחרבו (סבאג ישראל, 2026).</w:t>
+          <w:sz w:val="24"/>
+          <w:szCs w:val="24"/>
+          <w:rtl/>
+        </w:rPr>
+        <w:t xml:space="preserve">החיבור המשמעותי ביותר בעיניי מתקופת חז"ל הוא המשנה. המשנה נערכה בארץ ישראל בסביבות שנת 220 לספירה בידי רבי יהודה הנשיא ("רבי"), כסיכום ההלכה התנאית שהתפתחה בבתי המדרש מדורות בית הלל ובית שמאי, דרך משנת רבי עקיבא ותלמידיו, ועד דורו של העורך. מאפייניה, כפי שנלמדו בעקבות מבואו של הלברטל</w:t>
+      </w:r>
+      <w:r>
+        <w:rPr>
+          <w:rStyle w:val="FootnoteReference"/>
+        </w:rPr>
+        <w:footnoteReference w:id="4"/>
+      </w:r>
+      <w:r>
+        <w:rPr>
+          <w:rFonts w:ascii="David" w:cs="David" w:eastAsia="David" w:hAnsi="David"/>
+          <w:sz w:val="24"/>
+          <w:szCs w:val="24"/>
+          <w:rtl/>
+        </w:rPr>
+        <w:t xml:space="preserve">: היקף עצום ויומרה לסכם את כלל הידע ההלכתי; ארגון ענייני בשישה סדרים (זרעים, מועד, נשים, נזיקין, קדשים, טהרות) ולא לפי סדר פסוקי המקרא; עברית ייחודית, "לשון חכמים", קצרה, מדודה וכמעט בלא הנמקות; ועריכה כרצף מחלוקות המשמרת דעות רבים ויחיד בשם אומריהן. המניעים לעריכה שנידונו בשיעור: חשש מאובדן המסורת בתקופה סוערת שלאחר החורבן והמרידות, התרחבות הידע והקושי לשלוט בו, והצורך לשמר את המסורת בלא תלות במוסדות ריכוזיים שחרבו</w:t>
+      </w:r>
+      <w:r>
+        <w:rPr>
+          <w:rStyle w:val="FootnoteReference"/>
+        </w:rPr>
+        <w:footnoteReference w:id="5"/>
+      </w:r>
+      <w:r>
+        <w:rPr>
+          <w:rFonts w:ascii="David" w:cs="David" w:eastAsia="David" w:hAnsi="David"/>
+          <w:sz w:val="24"/>
+          <w:szCs w:val="24"/>
+          <w:rtl/>
+        </w:rPr>
+        <w:t xml:space="preserve">.</w:t>
       </w:r>
     </w:p>
     <w:p>
@@ -642,8 +642,6 @@
           <w:rFonts w:ascii="David" w:cs="David" w:eastAsia="David" w:hAnsi="David"/>
           <w:b/>
           <w:bCs/>
-          <w:i w:val="false"/>
-          <w:iCs w:val="false"/>
           <w:sz w:val="24"/>
           <w:szCs w:val="24"/>
           <w:rtl/>
@@ -660,15 +658,26 @@
       <w:r>
         <w:rPr>
           <w:rFonts w:ascii="David" w:cs="David" w:eastAsia="David" w:hAnsi="David"/>
-          <w:b w:val="false"/>
-          <w:bCs w:val="false"/>
-          <w:i w:val="false"/>
-          <w:iCs w:val="false"/>
-          <w:sz w:val="24"/>
-          <w:szCs w:val="24"/>
-          <w:rtl/>
-        </w:rPr>
-        <w:t xml:space="preserve">המשנה היא החיבור הראשון שהעלה את התורה שבעל פה מאוסף מסורות מפוזרות לכדי קורפוס ערוך ומחייב, ומכאן עיקר כוחה. אחרי החורבן, משבטלה עבודת הקרבנות, נעשה לימוד הטקסט למרכז החיים הדתיים, והמשנה היא שהעניקה ללימוד הזה צורה: היא "הזיכרון המארגן" של עולם החכמים (סבאג ישראל, 2026). היא גם יצרה שפה משותפת לעם כולו. שני התלמודים, הבבלי והירושלמי, נבנו כפירוש עליה, וכל ספרות ההלכה שאחריהם נשענת עליה עד ימינו. ושינוי נוסף, מהפכני לא פחות: בעריכתה כרצף מחלוקות קיבעה המשנה את המחלוקת הלגיטימית כדרכה של תורה שבעל פה. בניגוד לחתירה לאחידות שאפיינה את האמונה המקראית, בית המדרש רואה בריבוי דעות ובביקורת הדדית את הדרך לבירור האמת (סבאג ישראל, 2026).</w:t>
+          <w:sz w:val="24"/>
+          <w:szCs w:val="24"/>
+          <w:rtl/>
+        </w:rPr>
+        <w:t xml:space="preserve">המשנה היא החיבור הראשון שהעלה את התורה שבעל פה מאוסף מסורות מפוזרות לכדי קורפוס ערוך ומחייב, ומכאן עיקר כוחה. אחרי החורבן, משבטלה עבודת הקרבנות, נעשה לימוד הטקסט למרכז החיים הדתיים, והמשנה היא שהעניקה ללימוד הזה צורה: בלשון מצגת הקורס, היא "הזיכרון המארגן" של עולם החכמים</w:t>
+      </w:r>
+      <w:r>
+        <w:rPr>
+          <w:rStyle w:val="FootnoteReference"/>
+        </w:rPr>
+        <w:footnoteReference w:id="6"/>
+      </w:r>
+      <w:r>
+        <w:rPr>
+          <w:rFonts w:ascii="David" w:cs="David" w:eastAsia="David" w:hAnsi="David"/>
+          <w:sz w:val="24"/>
+          <w:szCs w:val="24"/>
+          <w:rtl/>
+        </w:rPr>
+        <w:t xml:space="preserve">. היא גם יצרה שפה משותפת לעם כולו. שני התלמודים, הבבלי והירושלמי, נבנו כפירוש עליה, וכל ספרות ההלכה שאחריהם נשענת עליה עד ימינו. ושינוי נוסף, מהפכני לא פחות: בעריכתה כרצף מחלוקות קיבעה המשנה את המחלוקת הלגיטימית כדרכה של תורה שבעל פה. בניגוד לחתירה לאחידות שאפיינה את האמונה המקראית, בית המדרש רואה בריבוי דעות ובביקורת הדדית את הדרך לבירור האמת.</w:t>
       </w:r>
     </w:p>
     <w:p>
@@ -682,8 +691,6 @@
           <w:rFonts w:ascii="David" w:cs="David" w:eastAsia="David" w:hAnsi="David"/>
           <w:b/>
           <w:bCs/>
-          <w:i w:val="false"/>
-          <w:iCs w:val="false"/>
           <w:sz w:val="24"/>
           <w:szCs w:val="24"/>
           <w:rtl/>
@@ -702,8 +709,6 @@
           <w:rFonts w:ascii="David" w:cs="David" w:eastAsia="David" w:hAnsi="David"/>
           <w:b w:val="false"/>
           <w:bCs w:val="false"/>
-          <w:i w:val="false"/>
-          <w:iCs w:val="false"/>
           <w:sz w:val="24"/>
           <w:szCs w:val="24"/>
           <w:rtl/>
@@ -729,6 +734,12 @@
         </w:rPr>
         <w:t xml:space="preserve">"סֻכָּה שֶׁהִיא גְבוֹהָה לְמַעְלָה מֵעֶשְׂרִים אַמָּה, פְּסוּלָה. רַבִּי יְהוּדָה מַכְשִׁיר. וְשֶׁאֵינָהּ גְּבוֹהָה עֲשָׂרָה טְפָחִים, וְשֶׁאֵין לָהּ שְׁלֹשָׁה דְּפָנוֹת, וְשֶׁחַמָּתָהּ מְרֻבָּה מִצִּלָּתָהּ, פְּסוּלָה."</w:t>
       </w:r>
+      <w:r>
+        <w:rPr>
+          <w:rStyle w:val="FootnoteReference"/>
+        </w:rPr>
+        <w:footnoteReference w:id="7"/>
+      </w:r>
     </w:p>
     <w:p>
       <w:pPr>
@@ -741,13 +752,11 @@
           <w:rFonts w:ascii="David" w:cs="David" w:eastAsia="David" w:hAnsi="David"/>
           <w:b w:val="false"/>
           <w:bCs w:val="false"/>
-          <w:i w:val="false"/>
-          <w:iCs w:val="false"/>
-          <w:sz w:val="24"/>
-          <w:szCs w:val="24"/>
-          <w:rtl/>
-        </w:rPr>
-        <w:t xml:space="preserve">במשנה קצרה זו ניכר כל מה שתואר לעיל. היא פותחת מסכת שלמה המוקדשת לנושא אחד, הסוכה, בלא זיקה לסדר הפסוקים. לשונה פסקנית, קובעת שיעורים מספריים מדויקים ואינה מנמקת. והיא משמרת בגוף ההלכה את דעת היחיד החולקת, "רבי יהודה מכשיר", בלא הכרעה מפורשת ובלא מחיקת הדעה שנדחתה. כך נראה השינוי שחוללה המשנה הלכה למעשה: חוק מקיף ומאורגן שהמחלוקת אינה תקלה בו אלא חלק ממהותו, והוא שהזמין את הדורות הבאים, בתלמודים ואילך, להמשיך ולדון בו.</w:t>
+          <w:sz w:val="24"/>
+          <w:szCs w:val="24"/>
+          <w:rtl/>
+        </w:rPr>
+        <w:t xml:space="preserve">במשנה קצרה זו ניכר כל מה שתואר לעיל. היא פותחת מסכת שלמה המוקדשת לנושא אחד, הסוכה, בלא זיקה לסדר הפסוקים. לשונה פסקנית, קובעת שיעורים מספריים מדויקים ואינה מנמקת. והיא משמרת בגוף ההלכה את דעת היחיד החולקת, זו של רבי יהודה, בלא הכרעה מפורשת ובלא מחיקת הדעה שנדחתה. כך נראה השינוי שחוללה המשנה הלכה למעשה: חוק מקיף ומאורגן שהמחלוקת אינה תקלה בו אלא חלק ממהותו, והוא שהזמין את הדורות הבאים, בתלמודים ואילך, להמשיך ולדון בו.</w:t>
       </w:r>
     </w:p>
     <w:p>
@@ -766,8 +775,6 @@
           <w:rFonts w:ascii="David" w:cs="David" w:eastAsia="David" w:hAnsi="David"/>
           <w:b/>
           <w:bCs/>
-          <w:i w:val="false"/>
-          <w:iCs w:val="false"/>
           <w:sz w:val="28"/>
           <w:szCs w:val="28"/>
           <w:rtl/>
@@ -786,8 +793,6 @@
           <w:rFonts w:ascii="David" w:cs="David" w:eastAsia="David" w:hAnsi="David"/>
           <w:b/>
           <w:bCs/>
-          <w:i w:val="false"/>
-          <w:iCs w:val="false"/>
           <w:sz w:val="24"/>
           <w:szCs w:val="24"/>
           <w:rtl/>
@@ -806,13 +811,11 @@
           <w:rFonts w:ascii="David" w:cs="David" w:eastAsia="David" w:hAnsi="David"/>
           <w:b w:val="false"/>
           <w:bCs w:val="false"/>
-          <w:i w:val="false"/>
-          <w:iCs w:val="false"/>
-          <w:sz w:val="24"/>
-          <w:szCs w:val="24"/>
-          <w:rtl/>
-        </w:rPr>
-        <w:t xml:space="preserve">הקטע (דקות 01:03:30 עד 01:10:00) מבוסס על אגדת יציאתו של רבן יוחנן בן זכאי מירושלים הנצורה, תלמוד בבלי, מסכת גיטין דף נו ע"א-ע"ב, שנלמדה ביחידה "צמיחה מתוך משבר". להלן החלקים הרלוונטיים, בתרגום לעברית על פי דף המקורות של הקורס:</w:t>
+          <w:sz w:val="24"/>
+          <w:szCs w:val="24"/>
+          <w:rtl/>
+        </w:rPr>
+        <w:t xml:space="preserve">הקטע (דקות 01:03:30 עד 01:10:00) מבוסס על אגדת יציאתו של רבן יוחנן בן זכאי מירושלים הנצורה, שנלמדה ביחידה "צמיחה מתוך משבר". להלן החלק הרלוונטי, בתרגום לעברית על פי דף המקורות של הקורס:</w:t>
       </w:r>
     </w:p>
     <w:p>
@@ -831,7 +834,13 @@
           <w:szCs w:val="24"/>
           <w:rtl/>
         </w:rPr>
-        <w:t xml:space="preserve">"אבא סיקרא, ראש בריוני ירושלים, בן אחותו של רבן יוחנן בן זכאי היה. שלח לו [רבן יוחנן]: בוא אלי בצנעה. בא. אמר לו: עד מתי תעשו כך ותהרגו את העולם ברעב? אמר לו: מה אעשה? שאם אומר להם כך, יהרגו אותי. אמר לו: אני רואה תקנה בשבילי, שאצא [מן העיר]; אפשר שתהיה בזה הצלה מועטה... עשה רבן יוחנן כך [העמיד פני מת]: נכנס תחתיו רבי אליעזר מצד אחד ורבי יהושע מצד אחר. כשהגיעו לפתח [השער] רצו [הבריונים] לדקור אותו. אמר להם: יאמרו 'את רבם דקרו'!... פתחו את השער, יצא. כשהגיע לשם אמר: שלום עליך המלך, שלום עליך המלך!... [משנתבשר אספסיינוס כי הוכתר לקיסר, אמר:] בקש ממני דבר ואתן לך. אמר לו: תן לי יבנה וחכמיה, ושושלת רבן גמליאל, ורופאים שירפאו את רבי צדוק. קרא עליו רב יוסף, ויש אומרים רבי עקיבא: 'מֵשִׁיב חֲכָמִים אָחוֹר וְדַעְתָּם יְסַכֵּל', שהיה לו לומר לו שיניח להם הפעם."</w:t>
+        <w:t xml:space="preserve">"אבא סיקרא, ראש בריוני ירושלים, בן אחותו של רבן יוחנן בן זכאי היה. שלח לו: בוא אלי בצנעה... אמר לו: עד מתי תעשו כך ותהרגו את העולם ברעב?... אמר לו: אני רואה תקנה בשבילי, שאצא [מן העיר]; אפשר שתהיה בזה הצלה מועטה... נכנס תחתיו [לארון] רבי אליעזר מצד אחד ורבי יהושע מצד אחר... רצו [הבריונים] לדקור אותו. אמר להם: יאמרו 'את רבם דקרו'!... אמר לו: תן לי יבנה וחכמיה, ושושלת רבן גמליאל, ורופאים שירפאו את רבי צדוק. קרא עליו רב יוסף, ויש אומרים רבי עקיבא: 'משיב חכמים אחור ודעתם יסכל'."</w:t>
+      </w:r>
+      <w:r>
+        <w:rPr>
+          <w:rStyle w:val="FootnoteReference"/>
+        </w:rPr>
+        <w:footnoteReference w:id="8"/>
       </w:r>
     </w:p>
     <w:p>
@@ -845,8 +854,6 @@
           <w:rFonts w:ascii="David" w:cs="David" w:eastAsia="David" w:hAnsi="David"/>
           <w:b/>
           <w:bCs/>
-          <w:i w:val="false"/>
-          <w:iCs w:val="false"/>
           <w:sz w:val="24"/>
           <w:szCs w:val="24"/>
           <w:rtl/>
@@ -863,15 +870,26 @@
       <w:r>
         <w:rPr>
           <w:rFonts w:ascii="David" w:cs="David" w:eastAsia="David" w:hAnsi="David"/>
-          <w:b w:val="false"/>
-          <w:bCs w:val="false"/>
-          <w:i w:val="false"/>
-          <w:iCs w:val="false"/>
-          <w:sz w:val="24"/>
-          <w:szCs w:val="24"/>
-          <w:rtl/>
-        </w:rPr>
-        <w:t xml:space="preserve">שלושה דמיונות. האחד, שלד העלילה: פגישה חשאית בין רבן יוחנן לבין בן אחותו העומד בראש הקנאים, הכרה משותפת שהרעב מכלה את העיר, ותחבולת המוות המדומה, שבה מוצא הרב מירושלים בארון קבורה הנישא בידי תלמידיו. השני, סצנת השער: השומרים דורשים לדקור את הארון כדי לוודא שהמת אכן מת, והאחיין בולם אותם בטיעון של האגדה עצמה, שלא יאמרו כי הקנאים פגעו ברבם ("יאמרו: את רבם דקרו"); בסרט הם נסוגים בקריאה "תנו כבוד לתורה". השלישי, מטרת היציאה: בסרט כבמדרש, ההצלה איננה הצלת העיר. רבן יוחנן אומר לבן בטיח במפורש שהוא דואג "שלא תאבד התורה שבעל פה מישראל", ניסוח קולנועי של מה שיבשיל אצל אספסיינוס לבקשה "תן לי יבנה וחכמיה".</w:t>
+          <w:sz w:val="24"/>
+          <w:szCs w:val="24"/>
+          <w:rtl/>
+        </w:rPr>
+        <w:t xml:space="preserve">שלושה דמיונות. האחד, שלד העלילה: פגישה חשאית בין רבן יוחנן לבין בן אחותו העומד בראש הקנאים, הכרה משותפת שהרעב מכלה את העיר, ותחבולת המוות המדומה, שבה מוצא הרב מירושלים בארון קבורה הנישא בידי תלמידיו. השני, סצנת השער: השומרים דורשים לדקור את הארון כדי לוודא שהמת אכן מת, והאחיין בולם אותם בטיעון של האגדה עצמה, שלא ייאמר כי הקנאים פגעו ברבם, והם נסוגים מתוך יראת כבוד לתורה. השלישי, מטרת היציאה: בסרט כבמדרש, ההצלה איננה הצלת העיר. רבן יוחנן אומר לבן בטיח שדאגתו נתונה לכך "שלא תאבד התורה שבעל פה מישראל"</w:t>
+      </w:r>
+      <w:r>
+        <w:rPr>
+          <w:rStyle w:val="FootnoteReference"/>
+        </w:rPr>
+        <w:footnoteReference w:id="9"/>
+      </w:r>
+      <w:r>
+        <w:rPr>
+          <w:rFonts w:ascii="David" w:cs="David" w:eastAsia="David" w:hAnsi="David"/>
+          <w:sz w:val="24"/>
+          <w:szCs w:val="24"/>
+          <w:rtl/>
+        </w:rPr>
+        <w:t xml:space="preserve">, ניסוח קולנועי של מה שיבשיל אצל אספסיינוס לבקשה על יבנה וחכמיה.</w:t>
       </w:r>
     </w:p>
     <w:p>
@@ -885,13 +903,11 @@
           <w:rFonts w:ascii="David" w:cs="David" w:eastAsia="David" w:hAnsi="David"/>
           <w:b w:val="false"/>
           <w:bCs w:val="false"/>
-          <w:i w:val="false"/>
-          <w:iCs w:val="false"/>
-          <w:sz w:val="24"/>
-          <w:szCs w:val="24"/>
-          <w:rtl/>
-        </w:rPr>
-        <w:t xml:space="preserve">ושלושה הבדלים. ראשית, דמות האחיין: בבבלי זהו אבא סיקרא, דמות לקונית המופיעה בתמונה אחת בלבד; בסרט, ההולך כאן בעקבות גרסת איכה רבה, זהו בן בטיח, גיבור ראשי בעל עלילה שלמה, והמפגש עם הדוד נטען ברגש אישי: הוא מגיע אליו אָבֵל על אמו ומיוסר על שריפת המחסנים שהמיטה את הרעב. שנית, כיוון ההאשמה מתהפך: בבבלי רבן יוחנן הוא שמוכיח את אחיינו, "עד מתי תעשו כך ותהרגו את העולם ברעב"; בסרט דווקא רבן יוחנן מרגיע את בן בטיח וקובע שהרעב היה גזרה משמיים ובן בטיח לא היה אלא שליחהּ, תיאולוגיה מפורשת שאין לה זכר באגדה. שלישית, פרטי התחבולה ומה שהושמט: הסרט מוסיף את גזרתו של בר גיורא שאיש לא ייצא מן החומות מלבד המתים, את העמדת פני החולה ואת הדבר המצחין שהונח במיטה כדי לשכנע במותו (פרטים ממסורת איכה רבה שאינם בבבלי); ומנגד, קול הביקורת התלמודי, קריאת רב יוסף או רבי עקיבא "משיב חכמים אחור", נעדר מן הקטע כליל, והצופה נותר לשפוט בעצמו.</w:t>
+          <w:sz w:val="24"/>
+          <w:szCs w:val="24"/>
+          <w:rtl/>
+        </w:rPr>
+        <w:t xml:space="preserve">ושלושה הבדלים. ראשית, דמות האחיין: בבבלי זהו אבא סיקרא, דמות לקונית המופיעה בתמונה אחת בלבד; בסרט, ההולך כאן בעקבות גרסת איכה רבה, זהו בן בטיח, גיבור ראשי בעל עלילה שלמה, והמפגש עם הדוד נטען ברגש אישי: הוא מגיע אליו אבל על אמו ומיוסר על שריפת המחסנים שהמיטה את הרעב. שנית, כיוון ההאשמה מתהפך: בבבלי רבן יוחנן הוא שמוכיח את אחיינו על שהקנאים מרעיבים את העולם; בסרט דווקא רבן יוחנן מרגיע את בן בטיח וקובע שהרעב היה גזרה משמיים ובן בטיח לא היה אלא שליחה, תיאולוגיה מפורשת שאין לה זכר באגדה. שלישית, פרטי התחבולה ומה שהושמט: הסרט מוסיף את גזרתו של בר גיורא שאיש לא ייצא מן החומות מלבד המתים, את העמדת פני החולה ואת הדבר המצחין שהונח במיטה כדי לשכנע במותו, פרטים ממסורת איכה רבה שאינם בבבלי; ומנגד, קול הביקורת התלמודי, קריאתם של רב יוסף או רבי עקיבא נגד הבקשה הצנועה, נעדר מן הקטע כליל, והצופה נותר לשפוט בעצמו.</w:t>
       </w:r>
     </w:p>
     <w:p>
@@ -905,8 +921,6 @@
           <w:rFonts w:ascii="David" w:cs="David" w:eastAsia="David" w:hAnsi="David"/>
           <w:b/>
           <w:bCs/>
-          <w:i w:val="false"/>
-          <w:iCs w:val="false"/>
           <w:sz w:val="24"/>
           <w:szCs w:val="24"/>
           <w:rtl/>
@@ -923,15 +937,56 @@
       <w:r>
         <w:rPr>
           <w:rFonts w:ascii="David" w:cs="David" w:eastAsia="David" w:hAnsi="David"/>
-          <w:b w:val="false"/>
-          <w:bCs w:val="false"/>
-          <w:i w:val="false"/>
-          <w:iCs w:val="false"/>
-          <w:sz w:val="24"/>
-          <w:szCs w:val="24"/>
-          <w:rtl/>
-        </w:rPr>
-        <w:t xml:space="preserve">במאמרה על הסיפור מציעה דליה מרקס (ל.ת.) לקרוא את האגדה כסיפור של מעתק: רגע המעבר ממציאות שבה יש לעם מרכז פולחני בירושלים אל מציאות שנדרשה למצוא קדושה בדרכים חדשות. האגדה, היא מדגישה, אינה מתארת את המעבר בלבד; היא יוצרת אותו ומעניקה לו משמעות. בעקבות רוזן (כפי שמצוטט אצל מרקס, ל.ת.) היא רואה במסע בארון המתים ביצוע סמלי של שינוי הצורה שעברה היהדות: היהודים מתו כעם של הגוף, של הארץ ושל פולחן המקדש, ונולדו מחדש כעם הספר. רבן יוחנן חייב למות מוות סמלי כדי שדבר חדש יוכל להיוולד, והיציאה בארון היא הרפיה מאחיזה בירושלים שדינה נגזר. הקריאה הזאת מאירה היטב את הקטע: בן בטיח עסוק באבנים, בעצים ובאשמת המתים, ואילו רבן יוחנן כבר חי את המציאות הבאה. על הבקשה "תן לי יבנה וחכמיה" מראה מרקס, בעקבות שרמר (כפי שמצוטט אצל מרקס, ל.ת.), שהיא מעמידה את שכבת החכמים כהנהגתו החדשה של העם: יבנה וחכמיה תחת ירושלים ובית מקדשה. גם המסורת המגנה את רבן יוחנן נקראת אצלה כהעמדה מכוונת של שני עולמות זה מול זה, רב יוסף הצופה מבבל מזה, ורבי עקיבא, שבחר בדור בר כוכבא בדרך ההפוכה, מזה. התלמוד הנציח את הסיפור יחד עם המחלוקת עליו (מרקס, ל.ת.).</w:t>
+          <w:sz w:val="24"/>
+          <w:szCs w:val="24"/>
+          <w:rtl/>
+        </w:rPr>
+        <w:t xml:space="preserve">במאמרה על הסיפור מציעה דליה מרקס לקרוא את האגדה כסיפור של מעתק: רגע המעבר ממציאות שבה יש לעם מרכז פולחני בירושלים אל מציאות שנדרשה למצוא קדושה בדרכים חדשות. האגדה, היא מדגישה, אינה מתארת את המעבר בלבד; היא יוצרת אותו ומעניקה לו משמעות</w:t>
+      </w:r>
+      <w:r>
+        <w:rPr>
+          <w:rStyle w:val="FootnoteReference"/>
+        </w:rPr>
+        <w:footnoteReference w:id="10"/>
+      </w:r>
+      <w:r>
+        <w:rPr>
+          <w:rFonts w:ascii="David" w:cs="David" w:eastAsia="David" w:hAnsi="David"/>
+          <w:sz w:val="24"/>
+          <w:szCs w:val="24"/>
+          <w:rtl/>
+        </w:rPr>
+        <w:t xml:space="preserve">. בעקבות דבריו של ג'ונתן רוזן, המובאים בפתח המאמר, רואה מרקס במסע בארון המתים ביצוע סמלי של שינוי הצורה שעברה היהדות: היהודים מתו כעם של הגוף, של הארץ ושל פולחן המקדש, ונולדו מחדש כעם הספר</w:t>
+      </w:r>
+      <w:r>
+        <w:rPr>
+          <w:rStyle w:val="FootnoteReference"/>
+        </w:rPr>
+        <w:footnoteReference w:id="11"/>
+      </w:r>
+      <w:r>
+        <w:rPr>
+          <w:rFonts w:ascii="David" w:cs="David" w:eastAsia="David" w:hAnsi="David"/>
+          <w:sz w:val="24"/>
+          <w:szCs w:val="24"/>
+          <w:rtl/>
+        </w:rPr>
+        <w:t xml:space="preserve">. רבן יוחנן חייב למות מוות סמלי כדי שדבר חדש יוכל להיוולד, והיציאה בארון היא הרפיה מאחיזה בירושלים שדינה נגזר. הקריאה הזאת מאירה היטב את הקטע: בן בטיח עסוק באבנים, בעצים ובאשמת המתים, ואילו רבן יוחנן כבר חי את המציאות הבאה. את הבקשה על יבנה וחכמיה מסבירה מרקס, בעקבות שרמר, כהעמדת שכבת החכמים בראש העם: יבנה וחכמיה באות תחת ירושלים ובית מקדשה</w:t>
+      </w:r>
+      <w:r>
+        <w:rPr>
+          <w:rStyle w:val="FootnoteReference"/>
+        </w:rPr>
+        <w:footnoteReference w:id="12"/>
+      </w:r>
+      <w:r>
+        <w:rPr>
+          <w:rFonts w:ascii="David" w:cs="David" w:eastAsia="David" w:hAnsi="David"/>
+          <w:sz w:val="24"/>
+          <w:szCs w:val="24"/>
+          <w:rtl/>
+        </w:rPr>
+        <w:t xml:space="preserve">. גם המסורת המגנה את רבן יוחנן נקראת אצלה כהעמדה מכוונת של שני עולמות זה מול זה, רב יוסף הצופה מבבל מזה, ורבי עקיבא, שבחר בדור בר כוכבא בדרך ההפוכה, מזה. התלמוד הנציח את הסיפור יחד עם המחלוקת עליו.</w:t>
       </w:r>
     </w:p>
     <w:p>
@@ -945,8 +1000,6 @@
           <w:rFonts w:ascii="David" w:cs="David" w:eastAsia="David" w:hAnsi="David"/>
           <w:b/>
           <w:bCs/>
-          <w:i w:val="false"/>
-          <w:iCs w:val="false"/>
           <w:sz w:val="24"/>
           <w:szCs w:val="24"/>
           <w:rtl/>
@@ -963,15 +1016,26 @@
       <w:r>
         <w:rPr>
           <w:rFonts w:ascii="David" w:cs="David" w:eastAsia="David" w:hAnsi="David"/>
-          <w:b w:val="false"/>
-          <w:bCs w:val="false"/>
-          <w:i w:val="false"/>
-          <w:iCs w:val="false"/>
-          <w:sz w:val="24"/>
-          <w:szCs w:val="24"/>
-          <w:rtl/>
-        </w:rPr>
-        <w:t xml:space="preserve">זהו בעיניי המדרש הנלמד ביותר משום שהוא הסיפור המכונן של צמיחה מתוך משבר, הציר שעליו נבנתה היהדות הרבנית כולה. יבנה נעשתה ארכיטיפ תודעתי, וכל מקום תורה שתלמידים נוהרים אליו הוא בחזקת יבנה (מרקס, ל.ת.). הסיפור מעמיד דגם מנהיגות שממשיך לדבר אל קוראיו: מול קנאות הנלחמת עד כלות, פרגמטיזם שמציל את מה שאפשר להציל ומתרגם חורבן לבניין. מרקס (ל.ת.) מראה כיצד דורות שונים יצקו אל הסיפור את עולמם, ממורים שראו בו אחרי השואה את ניצחון הלימוד על הכוח ועד ויכוחים ציבוריים בישראל שבהם נאבקים על דמותו של רבן יוחנן תומכים ומבקרים כאחד. דווקא העמימות, שהתלמוד עצמו שימר בביקורת "משיב חכמים אחור", היא סוד כוחו. הוא אינו מוסר חד משמעי אלא מראָה, לאומה וגם לכל אדם המקים את חייו מן החורבות.</w:t>
+          <w:sz w:val="24"/>
+          <w:szCs w:val="24"/>
+          <w:rtl/>
+        </w:rPr>
+        <w:t xml:space="preserve">זהו בעיניי המדרש הנלמד ביותר משום שהוא הסיפור המכונן של צמיחה מתוך משבר, הציר שעליו נבנתה היהדות הרבנית כולה. יבנה נעשתה, כדברי מרקס, ארכיטיפ תודעתי, וכל מקום תורה שתלמידים נוהרים אליו הוא בחזקת יבנה</w:t>
+      </w:r>
+      <w:r>
+        <w:rPr>
+          <w:rStyle w:val="FootnoteReference"/>
+        </w:rPr>
+        <w:footnoteReference w:id="13"/>
+      </w:r>
+      <w:r>
+        <w:rPr>
+          <w:rFonts w:ascii="David" w:cs="David" w:eastAsia="David" w:hAnsi="David"/>
+          <w:sz w:val="24"/>
+          <w:szCs w:val="24"/>
+          <w:rtl/>
+        </w:rPr>
+        <w:t xml:space="preserve">. הסיפור מעמיד דגם מנהיגות שממשיך לדבר אל קוראיו: מול קנאות הנלחמת עד כלות, פרגמטיזם שמציל את מה שאפשר להציל ומתרגם חורבן לבניין. מרקס מראה כיצד דורות שונים יצקו אל הסיפור את עולמם, ממורים שראו בו אחרי השואה את ניצחון הלימוד על הכוח ועד ויכוחים ציבוריים בישראל שבהם נאבקים על דמותו של רבן יוחנן תומכים ומבקרים כאחד. דווקא העמימות, שהתלמוד עצמו שימר בביקורת על הבקשה הצנועה, היא סוד כוחו. הוא אינו מוסר חד משמעי אלא מראה, לאומה וגם לכל אדם המקים את חייו מן החורבות.</w:t>
       </w:r>
     </w:p>
     <w:p>
@@ -990,8 +1054,6 @@
           <w:rFonts w:ascii="David" w:cs="David" w:eastAsia="David" w:hAnsi="David"/>
           <w:b/>
           <w:bCs/>
-          <w:i w:val="false"/>
-          <w:iCs w:val="false"/>
           <w:sz w:val="28"/>
           <w:szCs w:val="28"/>
           <w:rtl/>
@@ -1008,15 +1070,26 @@
       <w:r>
         <w:rPr>
           <w:rFonts w:ascii="David" w:cs="David" w:eastAsia="David" w:hAnsi="David"/>
-          <w:b w:val="false"/>
-          <w:bCs w:val="false"/>
-          <w:i w:val="false"/>
-          <w:iCs w:val="false"/>
-          <w:sz w:val="24"/>
-          <w:szCs w:val="24"/>
-          <w:rtl/>
-        </w:rPr>
-        <w:t xml:space="preserve">בחרתי במקור הראשון: סיפור תחילתו של רבי אליעזר בן הורקנוס (פרקי דרבי אליעזר, פרקים א-ב, ומקבילות באבות דרבי נתן נוסח א ובמדרשים נוספים), שנלמד בדף החברותא "איך נעשים חכמ.ה".</w:t>
+          <w:sz w:val="24"/>
+          <w:szCs w:val="24"/>
+          <w:rtl/>
+        </w:rPr>
+        <w:t xml:space="preserve">בחרתי במקור הראשון: סיפור תחילתו של רבי אליעזר בן הורקנוס, שנלמד בדף החברותא "איך נעשים חכמ.ה"</w:t>
+      </w:r>
+      <w:r>
+        <w:rPr>
+          <w:rStyle w:val="FootnoteReference"/>
+        </w:rPr>
+        <w:footnoteReference w:id="14"/>
+      </w:r>
+      <w:r>
+        <w:rPr>
+          <w:rFonts w:ascii="David" w:cs="David" w:eastAsia="David" w:hAnsi="David"/>
+          <w:sz w:val="24"/>
+          <w:szCs w:val="24"/>
+          <w:rtl/>
+        </w:rPr>
+        <w:t xml:space="preserve">.</w:t>
       </w:r>
     </w:p>
     <w:p>
@@ -1030,8 +1103,6 @@
           <w:rFonts w:ascii="David" w:cs="David" w:eastAsia="David" w:hAnsi="David"/>
           <w:b/>
           <w:bCs/>
-          <w:i w:val="false"/>
-          <w:iCs w:val="false"/>
           <w:sz w:val="24"/>
           <w:szCs w:val="24"/>
           <w:rtl/>
@@ -1048,15 +1119,26 @@
       <w:r>
         <w:rPr>
           <w:rFonts w:ascii="David" w:cs="David" w:eastAsia="David" w:hAnsi="David"/>
-          <w:b w:val="false"/>
-          <w:bCs w:val="false"/>
-          <w:i w:val="false"/>
-          <w:iCs w:val="false"/>
-          <w:sz w:val="24"/>
-          <w:szCs w:val="24"/>
-          <w:rtl/>
-        </w:rPr>
-        <w:t xml:space="preserve">הסיפור מתאר את ראשית דרכו של מי שיהיה מגדולי התנאים, והוא מתחיל דווקא בכישלון. אליעזר הוא בן עשרים ושתיים שלא למד תורה מעולם, בן לאב עשיר בעל שדות. בעוד אחיו חורשים באדמה הפורייה, הוא נשלח לחרוש בטרשים, והוא בוכה. האב מפרש את הבכי כקובלנה על תנאי העבודה ומיטיב עמו, אך הבכי נמשך, שכן מקורו אחר: "שאני מבקש ללמוד תורה". האב לועג לו, בן עשרים ושתיים ואתה מבקש ללמוד?! אליעזר בורח מבית אביו אל בית מדרשו של רבן יוחנן בן זכאי בירושלים, ושם מתחיל מבראשית: קריאת שמע, תפילה, ברכת המזון, שתי הלכות ביום. הוא לומד ברעב ובמסירות קיצונית, שמונה ימים בלא מזון, עד שריח פיו מסגיר אותו, והרב מגלה את גדול תלמידיו העתידי דווקא בתלמיד המורעב והבוש. שיא הסיפור בהיפוך כפול. הורקנוס עולה לירושלים להדיר את בנו מנכסיו, ומוצא אותו דורש "דברים שלא שמעתם אוזן מעולם", פניו מאירות "וקרנותיו יוצאות כקרנותיו של משה". רבן יוחנן מנשקו וקורא "אשריכם אברהם יצחק ויעקב שיצא זה מחלציכם", והאב שבא לנשל עומד ומוריש לבנו את כל נכסיו. אליעזר מסרב לראות בנכסים תכלית: "לא ביקשתי מלפני הקדוש ברוך הוא אלא תורה בלבד".</w:t>
+          <w:sz w:val="24"/>
+          <w:szCs w:val="24"/>
+          <w:rtl/>
+        </w:rPr>
+        <w:t xml:space="preserve">הסיפור מתאר את ראשית דרכו של מי שיהיה מגדולי התנאים, והוא מתחיל דווקא בכישלון. אליעזר הוא בן עשרים ושתיים שלא למד תורה מעולם, בן לאב עשיר בעל שדות. בעוד אחיו חורשים באדמה הפורייה, הוא נשלח לחרוש בטרשים, והוא בוכה. האב מפרש את הבכי כקובלנה על תנאי העבודה ומיטיב עמו, אך הבכי נמשך, שכן מקורו אחר לגמרי: הרצון ללמוד תורה. האב לועג לו, בן עשרים ושתיים ואתה מבקש ללמוד?! אליעזר בורח מבית אביו אל בית מדרשו של רבן יוחנן בן זכאי בירושלים, ושם מתחיל מבראשית: קריאת שמע, תפילה, ברכת המזון, שתי הלכות ביום. הוא לומד ברעב ובמסירות קיצונית, שמונה ימים בלא מזון, עד שריח פיו מסגיר אותו, והרב מגלה את גדול תלמידיו העתידי דווקא בתלמיד המורעב והבוש. שיא הסיפור בהיפוך כפול. הורקנוס עולה לירושלים כדי להדיר את בנו מנכסיו, ומוצא אותו דורש דברים חדשים שלא שמעה אוזן, "פָּנָיו מְאִירוֹת כְּאוֹר הַחַמָּה וְקַרְנוֹתָיו יוֹצְאוֹת כְּקַרְנוֹתָיו שֶׁל מֹשֶׁה"</w:t>
+      </w:r>
+      <w:r>
+        <w:rPr>
+          <w:rStyle w:val="FootnoteReference"/>
+        </w:rPr>
+        <w:footnoteReference w:id="15"/>
+      </w:r>
+      <w:r>
+        <w:rPr>
+          <w:rFonts w:ascii="David" w:cs="David" w:eastAsia="David" w:hAnsi="David"/>
+          <w:sz w:val="24"/>
+          <w:szCs w:val="24"/>
+          <w:rtl/>
+        </w:rPr>
+        <w:t xml:space="preserve">. רבן יוחנן מנשקו על ראשו ומברך את האבות שיצא זה מחלציהם, והאב שבא לנשל עומד ומכריז שכל נכסיו נתונים לבנו זה. אליעזר מצדו מסרב לראות בנכסים תכלית.</w:t>
       </w:r>
     </w:p>
     <w:p>
@@ -1070,8 +1152,6 @@
           <w:rFonts w:ascii="David" w:cs="David" w:eastAsia="David" w:hAnsi="David"/>
           <w:b/>
           <w:bCs/>
-          <w:i w:val="false"/>
-          <w:iCs w:val="false"/>
           <w:sz w:val="24"/>
           <w:szCs w:val="24"/>
           <w:rtl/>
@@ -1088,15 +1168,41 @@
       <w:r>
         <w:rPr>
           <w:rFonts w:ascii="David" w:cs="David" w:eastAsia="David" w:hAnsi="David"/>
-          <w:b w:val="false"/>
-          <w:bCs w:val="false"/>
-          <w:i w:val="false"/>
-          <w:iCs w:val="false"/>
-          <w:sz w:val="24"/>
-          <w:szCs w:val="24"/>
-          <w:rtl/>
-        </w:rPr>
-        <w:t xml:space="preserve">המגמה הראשונה היא הציר המרכזי שנלמד בקורס: המרכז עובר מבית המקדש אל בית המדרש, וממוקד הקדושה שבמקום אל האדם (לורברבוים, 2018). גיבור הסיפור אינו כהן ואינו יורש אחוזה. הדרמה כולה מתרחשת בין שדה חרוש לבית מדרש, והקדושה מתגלה בלימודו של אדם אחד. הערכים המקודשים של העולם הישן, אדמה, ירושה וממון, מוצבים במפורש מול התורה ומוכרעים: "אילו קרקעות ביקשתי... אילו כסף וזהב ביקשתי... לא ביקשתי אלא תורה בלבד".</w:t>
+          <w:sz w:val="24"/>
+          <w:szCs w:val="24"/>
+          <w:rtl/>
+        </w:rPr>
+        <w:t xml:space="preserve">המגמה הראשונה היא הציר המרכזי שנלמד בקורס: המרכז עובר מבית המקדש אל בית המדרש, וממוקד הקדושה שבמקום אל האדם, כפי שהראה לורברבוים במאמר שנלמד</w:t>
+      </w:r>
+      <w:r>
+        <w:rPr>
+          <w:rStyle w:val="FootnoteReference"/>
+        </w:rPr>
+        <w:footnoteReference w:id="16"/>
+      </w:r>
+      <w:r>
+        <w:rPr>
+          <w:rFonts w:ascii="David" w:cs="David" w:eastAsia="David" w:hAnsi="David"/>
+          <w:sz w:val="24"/>
+          <w:szCs w:val="24"/>
+          <w:rtl/>
+        </w:rPr>
+        <w:t xml:space="preserve">. גיבור הסיפור אינו כהן ואינו יורש אחוזה. הדרמה כולה מתרחשת בין שדה חרוש לבית מדרש, והקדושה מתגלה בלימודו של אדם אחד. הערכים המקודשים של העולם הישן, אדמה, ירושה וממון, מוצבים במפורש מול התורה ומוכרעים בסוף הסיפור: "לֹא בִּקַּשְׁתִּי מִלִּפְנֵי הַקָּדוֹשׁ בָּרוּךְ הוּא אֶלָּא תּוֹרָה בִּלְבַד"</w:t>
+      </w:r>
+      <w:r>
+        <w:rPr>
+          <w:rStyle w:val="FootnoteReference"/>
+        </w:rPr>
+        <w:footnoteReference w:id="17"/>
+      </w:r>
+      <w:r>
+        <w:rPr>
+          <w:rFonts w:ascii="David" w:cs="David" w:eastAsia="David" w:hAnsi="David"/>
+          <w:sz w:val="24"/>
+          <w:szCs w:val="24"/>
+          <w:rtl/>
+        </w:rPr>
+        <w:t xml:space="preserve">.</w:t>
       </w:r>
     </w:p>
     <w:p>
@@ -1108,15 +1214,26 @@
       <w:r>
         <w:rPr>
           <w:rFonts w:ascii="David" w:cs="David" w:eastAsia="David" w:hAnsi="David"/>
-          <w:b w:val="false"/>
-          <w:bCs w:val="false"/>
-          <w:i w:val="false"/>
-          <w:iCs w:val="false"/>
-          <w:sz w:val="24"/>
-          <w:szCs w:val="24"/>
-          <w:rtl/>
-        </w:rPr>
-        <w:t xml:space="preserve">מגמה שנייה נלמדה ביחידה "מנביא לחכם": שינוי תפיסת ההנהגה ממלך, כהן ונביא אל תלמיד החכם (סבאג ישראל, 2026). תיאורו של אליעזר הדורש, "פניו מאירות כאור החמה וקרנותיו יוצאות כקרנותיו של משה", שואל במכוון את דמות משה היורד מסיני, ומעמיד את הדרשן בבית המדרש כממשיכה של ההתגלות. החכם מחדש "דברים שלא שמעתם אוזן מעולם", והחידוש הפרשני בא במקומה של הנבואה.</w:t>
+          <w:sz w:val="24"/>
+          <w:szCs w:val="24"/>
+          <w:rtl/>
+        </w:rPr>
+        <w:t xml:space="preserve">מגמה שנייה נלמדה ביחידה "מנביא לחכם": שינוי תפיסת ההנהגה ממלך, כהן ונביא אל תלמיד החכם</w:t>
+      </w:r>
+      <w:r>
+        <w:rPr>
+          <w:rStyle w:val="FootnoteReference"/>
+        </w:rPr>
+        <w:footnoteReference w:id="18"/>
+      </w:r>
+      <w:r>
+        <w:rPr>
+          <w:rFonts w:ascii="David" w:cs="David" w:eastAsia="David" w:hAnsi="David"/>
+          <w:sz w:val="24"/>
+          <w:szCs w:val="24"/>
+          <w:rtl/>
+        </w:rPr>
+        <w:t xml:space="preserve">. תיאורו של אליעזר הדורש, שפניו מאירות וקרני הוד יוצאות ממנו כקרני ההוד של משה, שואל במכוון את דמות משה היורד מסיני, ומעמיד את הדרשן בבית המדרש כממשיכה של ההתגלות. החכם מחדש דברים שלא נשמעו מעולם, והחידוש הפרשני בא במקומה של הנבואה.</w:t>
       </w:r>
     </w:p>
     <w:p>
@@ -1130,13 +1247,11 @@
           <w:rFonts w:ascii="David" w:cs="David" w:eastAsia="David" w:hAnsi="David"/>
           <w:b w:val="false"/>
           <w:bCs w:val="false"/>
-          <w:i w:val="false"/>
-          <w:iCs w:val="false"/>
-          <w:sz w:val="24"/>
-          <w:szCs w:val="24"/>
-          <w:rtl/>
-        </w:rPr>
-        <w:t xml:space="preserve">ולצד אלה משתקף בקטע האתוס שלפיו מעמדו של חכם נקנה בלימוד: הוא אינו עובר בירושה ואינו תלוי בגיל, בממון או בייחוס. אליעזר מתחיל מאפס בגיל עשרים ושתיים, בניגוד לרצון אביו העשיר, ומעמדו נבנה כולו בתוך המסגרת המכוננת של התקופה, בית המדרש ויחסי הרב והתלמיד: לימוד מדורג ושיטתי, רב הקשוב לתלמידו עד כדי הבחנה בריח פיו, וקרבה הנחתמת בנשיקה על הראש. הרב נעשה מעין אב.</w:t>
+          <w:sz w:val="24"/>
+          <w:szCs w:val="24"/>
+          <w:rtl/>
+        </w:rPr>
+        <w:t xml:space="preserve">ולצד אלה משתקף בקטע האתוס שלפיו מעמד של חכם נקנה בלימוד: הוא אינו עובר בירושה ואינו תלוי בגיל, בממון או בייחוס. אליעזר מתחיל מאפס בגיל עשרים ושתיים, בניגוד לרצון אביו העשיר, ומעמדו נבנה כולו בתוך המסגרת המכוננת של התקופה, בית המדרש ויחסי הרב והתלמיד: לימוד מדורג ושיטתי, רב הקשוב לתלמידו עד כדי הבחנה בריח פיו, וקרבה הנחתמת בנשיקה על הראש. הרב נעשה מעין אב.</w:t>
       </w:r>
     </w:p>
     <w:p>
@@ -1150,8 +1265,6 @@
           <w:rFonts w:ascii="David" w:cs="David" w:eastAsia="David" w:hAnsi="David"/>
           <w:b/>
           <w:bCs/>
-          <w:i w:val="false"/>
-          <w:iCs w:val="false"/>
           <w:sz w:val="24"/>
           <w:szCs w:val="24"/>
           <w:rtl/>
@@ -1168,15 +1281,56 @@
       <w:r>
         <w:rPr>
           <w:rFonts w:ascii="David" w:cs="David" w:eastAsia="David" w:hAnsi="David"/>
-          <w:b w:val="false"/>
-          <w:bCs w:val="false"/>
-          <w:i w:val="false"/>
-          <w:iCs w:val="false"/>
-          <w:sz w:val="24"/>
-          <w:szCs w:val="24"/>
-          <w:rtl/>
-        </w:rPr>
-        <w:t xml:space="preserve">את רבי אליעזר עצמו פגשנו במקורות נוספים במפגשים, והם מצטרפים לדיוקן עקבי. במשנה, מסכת אבות פרק ב, משנה ח, שנלמדה ביחידה "צמיחה מתוך משבר", מונה רבן יוחנן בן זכאי את חמשת תלמידיו ומגדיר את שבחו: "אליעזר בן הורקנוס, בור סוּד שאינו מאבד טיפה". הדימוי מתכתב להפליא עם סיפור תחילתו. כשנדרש שם לדרוש לפני רבו השיב: "משל לבור שאינו יכול להוציא מים יותר ממה שהוא מכניס, כך אין אני יכול לומר דברי תורה יותר ממה שקיבלתי ממך". רבי אליעזר הוא איש המסורת בהתגלמותו, וכוחו בשימור מדוקדק של מה שקיבל. בהמשך שם (משנה ט), כשנשאלים התלמידים איזוהי דרך טובה שידבק בה האדם, תשובתו היא "עין טובה".</w:t>
+          <w:sz w:val="24"/>
+          <w:szCs w:val="24"/>
+          <w:rtl/>
+        </w:rPr>
+        <w:t xml:space="preserve">את רבי אליעזר עצמו פגשנו במקורות נוספים במפגשים, והם מצטרפים לדיוקן עקבי. במשנה מונה רבן יוחנן בן זכאי את חמשת תלמידיו ומגדיר את שבחו של אליעזר: "בּוֹר סוּד שֶׁאֵינוֹ מְאַבֵּד טִפָּה"</w:t>
+      </w:r>
+      <w:r>
+        <w:rPr>
+          <w:rStyle w:val="FootnoteReference"/>
+        </w:rPr>
+        <w:footnoteReference w:id="19"/>
+      </w:r>
+      <w:r>
+        <w:rPr>
+          <w:rFonts w:ascii="David" w:cs="David" w:eastAsia="David" w:hAnsi="David"/>
+          <w:sz w:val="24"/>
+          <w:szCs w:val="24"/>
+          <w:rtl/>
+        </w:rPr>
+        <w:t xml:space="preserve">. הדימוי מתכתב להפליא עם סיפור תחילתו. כשנדרש שם לדרוש לפני רבו, השיב אליעזר שהוא כבור שאינו יכול להוציא מים יותר משהוכנס לתוכו, וכך אין הוא יכול לומר דברי תורה יותר ממה שקיבל מרבו</w:t>
+      </w:r>
+      <w:r>
+        <w:rPr>
+          <w:rStyle w:val="FootnoteReference"/>
+        </w:rPr>
+        <w:footnoteReference w:id="20"/>
+      </w:r>
+      <w:r>
+        <w:rPr>
+          <w:rFonts w:ascii="David" w:cs="David" w:eastAsia="David" w:hAnsi="David"/>
+          <w:sz w:val="24"/>
+          <w:szCs w:val="24"/>
+          <w:rtl/>
+        </w:rPr>
+        <w:t xml:space="preserve">. רבי אליעזר הוא איש המסורת בהתגלמותו, וכוחו בשימור מדוקדק של מה שקיבל. בהמשך אותו פרק, כשנשאלים התלמידים איזוהי דרך טובה שידבק בה האדם, תשובתו היא "עַיִן טוֹבָה"</w:t>
+      </w:r>
+      <w:r>
+        <w:rPr>
+          <w:rStyle w:val="FootnoteReference"/>
+        </w:rPr>
+        <w:footnoteReference w:id="21"/>
+      </w:r>
+      <w:r>
+        <w:rPr>
+          <w:rFonts w:ascii="David" w:cs="David" w:eastAsia="David" w:hAnsi="David"/>
+          <w:sz w:val="24"/>
+          <w:szCs w:val="24"/>
+          <w:rtl/>
+        </w:rPr>
+        <w:t xml:space="preserve">.</w:t>
       </w:r>
     </w:p>
     <w:p>
@@ -1188,15 +1342,56 @@
       <w:r>
         <w:rPr>
           <w:rFonts w:ascii="David" w:cs="David" w:eastAsia="David" w:hAnsi="David"/>
-          <w:b w:val="false"/>
-          <w:bCs w:val="false"/>
-          <w:i w:val="false"/>
-          <w:iCs w:val="false"/>
-          <w:sz w:val="24"/>
-          <w:szCs w:val="24"/>
-          <w:rtl/>
-        </w:rPr>
-        <w:t xml:space="preserve">פן אחר, שנוי במחלוקת, נלמד במפגש על לימוד תורה לנשים. במשנה סוטה פרק ג, משנה ד, מול בן עזאי הקובע "חייב אדם ללמד את בתו תורה", מציב רבי אליעזר את העמדה המחמירה: "כל המלמד את בתו תורה, כאילו מלמדה תפלות". הבבלי (סוטה כא ע"ב) מטעים את דבריו בדרשת רבי אבהו, "כיוון שנכנסה חכמה באדם נכנסה עמו ערמומית". בעקבות דיונו של בויארין (1999) נלמדה המחלוקת הזאת כמאבק עקרוני על גבולות בית המדרש ועל השאלה מי שותף לתאוות הלימוד. וכאן מתחדד פרדוקס בדמותו: האיש שפרץ בעצמו כל גבול כדי להיכנס לבית המדרש, בגיל מאוחר, נגד אביו וכנגד כל הסיכויים, הוא הנועל את שעריו בפני נשים. שומר הסף של המסורת מבקש לשמור גם על גבולותיה החברתיים. ראוי להוסיף כי בסיפור תחילתו של רבי עקיבא, שנלמד באותו דף חברותא, יושב רבי עקיבא שנים לפני רבי אליעזר ולומד מפיו: הבור הסוד נעשה בעצמו רבו של גדול הדרשנים.</w:t>
+          <w:sz w:val="24"/>
+          <w:szCs w:val="24"/>
+          <w:rtl/>
+        </w:rPr>
+        <w:t xml:space="preserve">פן אחר, שנוי במחלוקת, נלמד במפגש על לימוד תורה לנשים. מול בן עזאי, הסבור שאדם חייב ללמד את בתו תורה, מציב רבי אליעזר את העמדה המחמירה: "כָּל הַמְלַמֵּד אֶת בִּתּוֹ תוֹרָה, כְּאִלּוּ מְלַמְּדָהּ תִּפְלוּת"</w:t>
+      </w:r>
+      <w:r>
+        <w:rPr>
+          <w:rStyle w:val="FootnoteReference"/>
+        </w:rPr>
+        <w:footnoteReference w:id="22"/>
+      </w:r>
+      <w:r>
+        <w:rPr>
+          <w:rFonts w:ascii="David" w:cs="David" w:eastAsia="David" w:hAnsi="David"/>
+          <w:sz w:val="24"/>
+          <w:szCs w:val="24"/>
+          <w:rtl/>
+        </w:rPr>
+        <w:t xml:space="preserve">. הבבלי מטעים את דבריו בדרשתו של רבי אבהו, שהחוכמה מכניסה עם כניסתה גם ערמומית</w:t>
+      </w:r>
+      <w:r>
+        <w:rPr>
+          <w:rStyle w:val="FootnoteReference"/>
+        </w:rPr>
+        <w:footnoteReference w:id="23"/>
+      </w:r>
+      <w:r>
+        <w:rPr>
+          <w:rFonts w:ascii="David" w:cs="David" w:eastAsia="David" w:hAnsi="David"/>
+          <w:sz w:val="24"/>
+          <w:szCs w:val="24"/>
+          <w:rtl/>
+        </w:rPr>
+        <w:t xml:space="preserve">. בעקבות דיונו של בויארין נלמדה המחלוקת הזאת כמאבק עקרוני על גבולות בית המדרש ועל השאלה מי שותף לתאוות הלימוד</w:t>
+      </w:r>
+      <w:r>
+        <w:rPr>
+          <w:rStyle w:val="FootnoteReference"/>
+        </w:rPr>
+        <w:footnoteReference w:id="24"/>
+      </w:r>
+      <w:r>
+        <w:rPr>
+          <w:rFonts w:ascii="David" w:cs="David" w:eastAsia="David" w:hAnsi="David"/>
+          <w:sz w:val="24"/>
+          <w:szCs w:val="24"/>
+          <w:rtl/>
+        </w:rPr>
+        <w:t xml:space="preserve">. וכאן מתחדד פרדוקס בדמותו: האיש שפרץ בעצמו כל גבול כדי להיכנס לבית המדרש, בגיל מאוחר, נגד אביו וכנגד כל הסיכויים, הוא הנועל את שעריו בפני נשים. שומר הסף של המסורת מבקש לשמור גם על גבולותיה החברתיים. ראוי להוסיף כי בסיפור תחילתו של רבי עקיבא, שנלמד באותו דף חברותא, יושב רבי עקיבא שנים לפני רבי אליעזר ולומד מפיו: הבור הסוד נעשה בעצמו רבו של גדול הדרשנים.</w:t>
       </w:r>
     </w:p>
     <w:p>
@@ -1215,8 +1410,6 @@
           <w:rFonts w:ascii="David" w:cs="David" w:eastAsia="David" w:hAnsi="David"/>
           <w:b/>
           <w:bCs/>
-          <w:i w:val="false"/>
-          <w:iCs w:val="false"/>
           <w:sz w:val="28"/>
           <w:szCs w:val="28"/>
           <w:rtl/>
@@ -1228,85 +1421,90 @@
       <w:pPr>
         <w:bidi/>
         <w:spacing w:after="120" w:line="360" w:lineRule="auto"/>
-        <w:ind w:right="709" w:hanging="709"/>
-        <w:jc w:val="right"/>
-      </w:pPr>
-      <w:r>
-        <w:rPr>
-          <w:rFonts w:ascii="David" w:cs="David" w:eastAsia="David" w:hAnsi="David"/>
-          <w:sz w:val="24"/>
-          <w:szCs w:val="24"/>
-          <w:rtl/>
-        </w:rPr>
-        <w:t xml:space="preserve">בויארין, ד' (1999). תאוות הלימוד: התורה כאישה אחרת. בתוך הבשר שברוח: שיח המיניות בתלמוד (עמ' 170-183). עם עובד.</w:t>
-      </w:r>
-    </w:p>
-    <w:p>
-      <w:pPr>
-        <w:bidi/>
-        <w:spacing w:after="120" w:line="360" w:lineRule="auto"/>
-        <w:ind w:right="709" w:hanging="709"/>
-        <w:jc w:val="right"/>
-      </w:pPr>
-      <w:r>
-        <w:rPr>
-          <w:rFonts w:ascii="David" w:cs="David" w:eastAsia="David" w:hAnsi="David"/>
-          <w:sz w:val="24"/>
-          <w:szCs w:val="24"/>
-          <w:rtl/>
-        </w:rPr>
-        <w:t xml:space="preserve">הלברטל, מ' (ל.ת.). מבוא למשנה. בתוך שישה סדרי משנה (סדרת עם הספר). ידיעות אחרונות.</w:t>
-      </w:r>
-    </w:p>
-    <w:p>
-      <w:pPr>
-        <w:bidi/>
-        <w:spacing w:after="120" w:line="360" w:lineRule="auto"/>
-        <w:ind w:right="709" w:hanging="709"/>
-        <w:jc w:val="right"/>
-      </w:pPr>
-      <w:r>
-        <w:rPr>
-          <w:rFonts w:ascii="David" w:cs="David" w:eastAsia="David" w:hAnsi="David"/>
-          <w:sz w:val="24"/>
-          <w:szCs w:val="24"/>
-          <w:rtl/>
-        </w:rPr>
-        <w:t xml:space="preserve">לורברבוים, י' (2018). ממקדש לאדם: תמורות במוקד הקדושה בספרות חז"ל. דעת: כתב עת לפילוסופיה יהודית וקבלה, 86, 377-396.</w:t>
-      </w:r>
-    </w:p>
-    <w:p>
-      <w:pPr>
-        <w:bidi/>
-        <w:spacing w:after="120" w:line="360" w:lineRule="auto"/>
-        <w:ind w:right="709" w:hanging="709"/>
-        <w:jc w:val="right"/>
-      </w:pPr>
-      <w:r>
-        <w:rPr>
-          <w:rFonts w:ascii="David" w:cs="David" w:eastAsia="David" w:hAnsi="David"/>
-          <w:sz w:val="24"/>
-          <w:szCs w:val="24"/>
-          <w:rtl/>
-        </w:rPr>
-        <w:t xml:space="preserve">מרקס, ד' (ל.ת.). רבן יוחנן בן זכאי והקמת יבנה: ניתוח והערכת הסיפור בראי הזמן.</w:t>
-      </w:r>
-    </w:p>
-    <w:p>
-      <w:pPr>
-        <w:bidi/>
-        <w:spacing w:after="120" w:line="360" w:lineRule="auto"/>
-        <w:ind w:right="709" w:hanging="709"/>
-        <w:jc w:val="right"/>
-      </w:pPr>
-      <w:r>
-        <w:rPr>
-          <w:rFonts w:ascii="David" w:cs="David" w:eastAsia="David" w:hAnsi="David"/>
-          <w:sz w:val="24"/>
-          <w:szCs w:val="24"/>
-          <w:rtl/>
-        </w:rPr>
-        <w:t xml:space="preserve">סבאג ישראל, ח' (2026). מצגות, דפי מקורות ודפי חברותא בקורס אדם, ספרות ומעשה בימי חז"ל [חומרי קורס].</w:t>
+        <w:jc w:val="right"/>
+      </w:pPr>
+      <w:r>
+        <w:rPr>
+          <w:rFonts w:ascii="David" w:cs="David" w:eastAsia="David" w:hAnsi="David"/>
+          <w:b w:val="false"/>
+          <w:bCs w:val="false"/>
+          <w:sz w:val="24"/>
+          <w:szCs w:val="24"/>
+          <w:rtl/>
+        </w:rPr>
+        <w:t xml:space="preserve">בויארין, דניאל, "תאוות הלימוד: התורה כאישה אחרת", בתוך: הבשר שברוח: שיח המיניות בתלמוד, תל אביב: עם עובד, תשנ"ט, עמ' 170-183.</w:t>
+      </w:r>
+    </w:p>
+    <w:p>
+      <w:pPr>
+        <w:bidi/>
+        <w:spacing w:after="120" w:line="360" w:lineRule="auto"/>
+        <w:jc w:val="right"/>
+      </w:pPr>
+      <w:r>
+        <w:rPr>
+          <w:rFonts w:ascii="David" w:cs="David" w:eastAsia="David" w:hAnsi="David"/>
+          <w:b w:val="false"/>
+          <w:bCs w:val="false"/>
+          <w:sz w:val="24"/>
+          <w:szCs w:val="24"/>
+          <w:rtl/>
+        </w:rPr>
+        <w:t xml:space="preserve">הלברטל, משה, "מבוא למשנה", שישה סדרי משנה, סדרת עם הספר, תל אביב: ידיעות אחרונות.</w:t>
+      </w:r>
+    </w:p>
+    <w:p>
+      <w:pPr>
+        <w:bidi/>
+        <w:spacing w:after="120" w:line="360" w:lineRule="auto"/>
+        <w:jc w:val="right"/>
+      </w:pPr>
+      <w:r>
+        <w:rPr>
+          <w:rFonts w:ascii="David" w:cs="David" w:eastAsia="David" w:hAnsi="David"/>
+          <w:b w:val="false"/>
+          <w:bCs w:val="false"/>
+          <w:sz w:val="24"/>
+          <w:szCs w:val="24"/>
+          <w:rtl/>
+        </w:rPr>
+        <w:t xml:space="preserve">לורברבוים, יאיר, "ממקדש לאדם: תמורות במוקד הקדושה בספרות חז"ל", דעת: כתב עת לפילוסופיה יהודית וקבלה 86 (תשע"ט), עמ' 377-396.</w:t>
+      </w:r>
+    </w:p>
+    <w:p>
+      <w:pPr>
+        <w:bidi/>
+        <w:spacing w:after="120" w:line="360" w:lineRule="auto"/>
+        <w:jc w:val="right"/>
+      </w:pPr>
+      <w:r>
+        <w:rPr>
+          <w:rFonts w:ascii="David" w:cs="David" w:eastAsia="David" w:hAnsi="David"/>
+          <w:b w:val="false"/>
+          <w:bCs w:val="false"/>
+          <w:sz w:val="24"/>
+          <w:szCs w:val="24"/>
+          <w:rtl/>
+        </w:rPr>
+        <w:t xml:space="preserve">מרקס, דליה, "רבן יוחנן בן זכאי והקמת יבנה: ניתוח והערכת הסיפור בראי הזמן".</w:t>
+      </w:r>
+    </w:p>
+    <w:p>
+      <w:pPr>
+        <w:bidi/>
+        <w:spacing w:after="120" w:line="360" w:lineRule="auto"/>
+        <w:jc w:val="right"/>
+      </w:pPr>
+      <w:r>
+        <w:rPr>
+          <w:rFonts w:ascii="David" w:cs="David" w:eastAsia="David" w:hAnsi="David"/>
+          <w:b w:val="false"/>
+          <w:bCs w:val="false"/>
+          <w:sz w:val="24"/>
+          <w:szCs w:val="24"/>
+          <w:rtl/>
+        </w:rPr>
+        <w:t xml:space="preserve">דפי המקורות, דפי החברותא והמצגות מאתר הקורס: מפגש 1 (עגלה ערופה), שיעורים 3-5 ("נביא וחכם", משנה ותוספתא, דף חברותא "מאפייני המשנה"), היחידה "צמיחה מתוך משבר" (ריב"ז והיציאה מירושלים), דף חברותא "איך נעשים חכמ.ה", דף מקורות מפגש 11 (לימוד תורה לנשים).</w:t>
       </w:r>
     </w:p>
     <w:sectPr>
@@ -1391,6 +1589,558 @@
       </w:r>
       <w:r>
         <w:continuationSeparator/>
+      </w:r>
+    </w:p>
+  </w:footnote>
+  <w:footnote w:id="1">
+    <w:p>
+      <w:pPr>
+        <w:bidi/>
+        <w:jc w:val="right"/>
+      </w:pPr>
+      <w:r>
+        <w:rPr>
+          <w:rStyle w:val="FootnoteReference"/>
+        </w:rPr>
+        <w:footnoteRef/>
+      </w:r>
+      <w:r>
+        <w:rPr>
+          <w:rFonts w:ascii="David" w:cs="David" w:eastAsia="David" w:hAnsi="David"/>
+          <w:sz w:val="20"/>
+          <w:szCs w:val="20"/>
+          <w:rtl/>
+        </w:rPr>
+        <w:t xml:space="preserve"> משנה, מסכת סוטה, פרק ט, משנה ו.</w:t>
+      </w:r>
+    </w:p>
+  </w:footnote>
+  <w:footnote w:id="2">
+    <w:p>
+      <w:pPr>
+        <w:bidi/>
+        <w:jc w:val="right"/>
+      </w:pPr>
+      <w:r>
+        <w:rPr>
+          <w:rStyle w:val="FootnoteReference"/>
+        </w:rPr>
+        <w:footnoteRef/>
+      </w:r>
+      <w:r>
+        <w:rPr>
+          <w:rFonts w:ascii="David" w:cs="David" w:eastAsia="David" w:hAnsi="David"/>
+          <w:sz w:val="20"/>
+          <w:szCs w:val="20"/>
+          <w:rtl/>
+        </w:rPr>
+        <w:t xml:space="preserve"> תלמוד בבלי, מסכת סוטה, דף מו ע"ב, בשם רבי יוחנן משום רבי מאיר.</w:t>
+      </w:r>
+    </w:p>
+  </w:footnote>
+  <w:footnote w:id="3">
+    <w:p>
+      <w:pPr>
+        <w:bidi/>
+        <w:jc w:val="right"/>
+      </w:pPr>
+      <w:r>
+        <w:rPr>
+          <w:rStyle w:val="FootnoteReference"/>
+        </w:rPr>
+        <w:footnoteRef/>
+      </w:r>
+      <w:r>
+        <w:rPr>
+          <w:rFonts w:ascii="David" w:cs="David" w:eastAsia="David" w:hAnsi="David"/>
+          <w:sz w:val="20"/>
+          <w:szCs w:val="20"/>
+          <w:rtl/>
+        </w:rPr>
+        <w:t xml:space="preserve"> דף המקורות למפגש 1, "עגלה ערופה: התנועה של חז"ל מהמקרא אל המשנה ואל התלמוד", אתר הקורס.</w:t>
+      </w:r>
+    </w:p>
+  </w:footnote>
+  <w:footnote w:id="4">
+    <w:p>
+      <w:pPr>
+        <w:bidi/>
+        <w:jc w:val="right"/>
+      </w:pPr>
+      <w:r>
+        <w:rPr>
+          <w:rStyle w:val="FootnoteReference"/>
+        </w:rPr>
+        <w:footnoteRef/>
+      </w:r>
+      <w:r>
+        <w:rPr>
+          <w:rFonts w:ascii="David" w:cs="David" w:eastAsia="David" w:hAnsi="David"/>
+          <w:sz w:val="20"/>
+          <w:szCs w:val="20"/>
+          <w:rtl/>
+        </w:rPr>
+        <w:t xml:space="preserve"> משה הלברטל, "מבוא למשנה", שישה סדרי משנה, סדרת עם הספר, ידיעות אחרונות; מצגת הקורס "נביא וחכם: משנה ותוספתא" (שיעורים 3-5).</w:t>
+      </w:r>
+    </w:p>
+  </w:footnote>
+  <w:footnote w:id="5">
+    <w:p>
+      <w:pPr>
+        <w:bidi/>
+        <w:jc w:val="right"/>
+      </w:pPr>
+      <w:r>
+        <w:rPr>
+          <w:rStyle w:val="FootnoteReference"/>
+        </w:rPr>
+        <w:footnoteRef/>
+      </w:r>
+      <w:r>
+        <w:rPr>
+          <w:rFonts w:ascii="David" w:cs="David" w:eastAsia="David" w:hAnsi="David"/>
+          <w:sz w:val="20"/>
+          <w:szCs w:val="20"/>
+          <w:rtl/>
+        </w:rPr>
+        <w:t xml:space="preserve"> מצגת הקורס "נביא וחכם: משנה ותוספתא" (שיעורים 3-5), אתר הקורס.</w:t>
+      </w:r>
+    </w:p>
+  </w:footnote>
+  <w:footnote w:id="6">
+    <w:p>
+      <w:pPr>
+        <w:bidi/>
+        <w:jc w:val="right"/>
+      </w:pPr>
+      <w:r>
+        <w:rPr>
+          <w:rStyle w:val="FootnoteReference"/>
+        </w:rPr>
+        <w:footnoteRef/>
+      </w:r>
+      <w:r>
+        <w:rPr>
+          <w:rFonts w:ascii="David" w:cs="David" w:eastAsia="David" w:hAnsi="David"/>
+          <w:sz w:val="20"/>
+          <w:szCs w:val="20"/>
+          <w:rtl/>
+        </w:rPr>
+        <w:t xml:space="preserve"> מצגת הקורס "נביא וחכם: משנה ותוספתא" (שיעורים 3-5), אתר הקורס.</w:t>
+      </w:r>
+    </w:p>
+  </w:footnote>
+  <w:footnote w:id="7">
+    <w:p>
+      <w:pPr>
+        <w:bidi/>
+        <w:jc w:val="right"/>
+      </w:pPr>
+      <w:r>
+        <w:rPr>
+          <w:rStyle w:val="FootnoteReference"/>
+        </w:rPr>
+        <w:footnoteRef/>
+      </w:r>
+      <w:r>
+        <w:rPr>
+          <w:rFonts w:ascii="David" w:cs="David" w:eastAsia="David" w:hAnsi="David"/>
+          <w:sz w:val="20"/>
+          <w:szCs w:val="20"/>
+          <w:rtl/>
+        </w:rPr>
+        <w:t xml:space="preserve"> משנה, מסכת סוכה, פרק א, משנה א; מצוטט בדף החברותא "מאפייני המשנה", אתר הקורס.</w:t>
+      </w:r>
+    </w:p>
+  </w:footnote>
+  <w:footnote w:id="8">
+    <w:p>
+      <w:pPr>
+        <w:bidi/>
+        <w:jc w:val="right"/>
+      </w:pPr>
+      <w:r>
+        <w:rPr>
+          <w:rStyle w:val="FootnoteReference"/>
+        </w:rPr>
+        <w:footnoteRef/>
+      </w:r>
+      <w:r>
+        <w:rPr>
+          <w:rFonts w:ascii="David" w:cs="David" w:eastAsia="David" w:hAnsi="David"/>
+          <w:sz w:val="20"/>
+          <w:szCs w:val="20"/>
+          <w:rtl/>
+        </w:rPr>
+        <w:t xml:space="preserve"> תלמוד בבלי, מסכת גיטין, דף נו ע"א-ע"ב; התרגום על פי דף החברותא "ריב"ז, הבריונים והיציאה מירושלים ליבנה", אתר הקורס.</w:t>
+      </w:r>
+    </w:p>
+  </w:footnote>
+  <w:footnote w:id="9">
+    <w:p>
+      <w:pPr>
+        <w:bidi/>
+        <w:jc w:val="right"/>
+      </w:pPr>
+      <w:r>
+        <w:rPr>
+          <w:rStyle w:val="FootnoteReference"/>
+        </w:rPr>
+        <w:footnoteRef/>
+      </w:r>
+      <w:r>
+        <w:rPr>
+          <w:rFonts w:ascii="David" w:cs="David" w:eastAsia="David" w:hAnsi="David"/>
+          <w:sz w:val="20"/>
+          <w:szCs w:val="20"/>
+          <w:rtl/>
+        </w:rPr>
+        <w:t xml:space="preserve"> מתוך פסקול הסרט "אגדת חורבן" (במאי: גידי דר, ישראל 2022), בקטע הנדון.</w:t>
+      </w:r>
+    </w:p>
+  </w:footnote>
+  <w:footnote w:id="10">
+    <w:p>
+      <w:pPr>
+        <w:bidi/>
+        <w:jc w:val="right"/>
+      </w:pPr>
+      <w:r>
+        <w:rPr>
+          <w:rStyle w:val="FootnoteReference"/>
+        </w:rPr>
+        <w:footnoteRef/>
+      </w:r>
+      <w:r>
+        <w:rPr>
+          <w:rFonts w:ascii="David" w:cs="David" w:eastAsia="David" w:hAnsi="David"/>
+          <w:sz w:val="20"/>
+          <w:szCs w:val="20"/>
+          <w:rtl/>
+        </w:rPr>
+        <w:t xml:space="preserve"> דליה מרקס, "רבן יוחנן בן זכאי והקמת יבנה: ניתוח והערכת הסיפור בראי הזמן", מתוך חומרי הקריאה של הקורס.</w:t>
+      </w:r>
+    </w:p>
+  </w:footnote>
+  <w:footnote w:id="11">
+    <w:p>
+      <w:pPr>
+        <w:bidi/>
+        <w:jc w:val="right"/>
+      </w:pPr>
+      <w:r>
+        <w:rPr>
+          <w:rStyle w:val="FootnoteReference"/>
+        </w:rPr>
+        <w:footnoteRef/>
+      </w:r>
+      <w:r>
+        <w:rPr>
+          <w:rFonts w:ascii="David" w:cs="David" w:eastAsia="David" w:hAnsi="David"/>
+          <w:sz w:val="20"/>
+          <w:szCs w:val="20"/>
+          <w:rtl/>
+        </w:rPr>
+        <w:t xml:space="preserve"> ג'ונתן רוזן, התלמוד והאינטרנט, כפי שמצוטט אצל מרקס, שם.</w:t>
+      </w:r>
+    </w:p>
+  </w:footnote>
+  <w:footnote w:id="12">
+    <w:p>
+      <w:pPr>
+        <w:bidi/>
+        <w:jc w:val="right"/>
+      </w:pPr>
+      <w:r>
+        <w:rPr>
+          <w:rStyle w:val="FootnoteReference"/>
+        </w:rPr>
+        <w:footnoteRef/>
+      </w:r>
+      <w:r>
+        <w:rPr>
+          <w:rFonts w:ascii="David" w:cs="David" w:eastAsia="David" w:hAnsi="David"/>
+          <w:sz w:val="20"/>
+          <w:szCs w:val="20"/>
+          <w:rtl/>
+        </w:rPr>
+        <w:t xml:space="preserve"> אדיאל שרמר, כפי שמצוטט אצל מרקס, שם.</w:t>
+      </w:r>
+    </w:p>
+  </w:footnote>
+  <w:footnote w:id="13">
+    <w:p>
+      <w:pPr>
+        <w:bidi/>
+        <w:jc w:val="right"/>
+      </w:pPr>
+      <w:r>
+        <w:rPr>
+          <w:rStyle w:val="FootnoteReference"/>
+        </w:rPr>
+        <w:footnoteRef/>
+      </w:r>
+      <w:r>
+        <w:rPr>
+          <w:rFonts w:ascii="David" w:cs="David" w:eastAsia="David" w:hAnsi="David"/>
+          <w:sz w:val="20"/>
+          <w:szCs w:val="20"/>
+          <w:rtl/>
+        </w:rPr>
+        <w:t xml:space="preserve"> מרקס, "רבן יוחנן בן זכאי והקמת יבנה", שם.</w:t>
+      </w:r>
+    </w:p>
+  </w:footnote>
+  <w:footnote w:id="14">
+    <w:p>
+      <w:pPr>
+        <w:bidi/>
+        <w:jc w:val="right"/>
+      </w:pPr>
+      <w:r>
+        <w:rPr>
+          <w:rStyle w:val="FootnoteReference"/>
+        </w:rPr>
+        <w:footnoteRef/>
+      </w:r>
+      <w:r>
+        <w:rPr>
+          <w:rFonts w:ascii="David" w:cs="David" w:eastAsia="David" w:hAnsi="David"/>
+          <w:sz w:val="20"/>
+          <w:szCs w:val="20"/>
+          <w:rtl/>
+        </w:rPr>
+        <w:t xml:space="preserve"> מדרש פרקי דרבי אליעזר, פרקים א-ב, ומקבילות באבות דרבי נתן נוסח א, בראשית רבה מב, א ותנחומא בובר לך לך, י; על פי דף החברותא "איך נעשים חכמ.ה", אתר הקורס.</w:t>
+      </w:r>
+    </w:p>
+  </w:footnote>
+  <w:footnote w:id="15">
+    <w:p>
+      <w:pPr>
+        <w:bidi/>
+        <w:jc w:val="right"/>
+      </w:pPr>
+      <w:r>
+        <w:rPr>
+          <w:rStyle w:val="FootnoteReference"/>
+        </w:rPr>
+        <w:footnoteRef/>
+      </w:r>
+      <w:r>
+        <w:rPr>
+          <w:rFonts w:ascii="David" w:cs="David" w:eastAsia="David" w:hAnsi="David"/>
+          <w:sz w:val="20"/>
+          <w:szCs w:val="20"/>
+          <w:rtl/>
+        </w:rPr>
+        <w:t xml:space="preserve"> שם, על פי נוסח דף החברותא.</w:t>
+      </w:r>
+    </w:p>
+  </w:footnote>
+  <w:footnote w:id="16">
+    <w:p>
+      <w:pPr>
+        <w:bidi/>
+        <w:jc w:val="right"/>
+      </w:pPr>
+      <w:r>
+        <w:rPr>
+          <w:rStyle w:val="FootnoteReference"/>
+        </w:rPr>
+        <w:footnoteRef/>
+      </w:r>
+      <w:r>
+        <w:rPr>
+          <w:rFonts w:ascii="David" w:cs="David" w:eastAsia="David" w:hAnsi="David"/>
+          <w:sz w:val="20"/>
+          <w:szCs w:val="20"/>
+          <w:rtl/>
+        </w:rPr>
+        <w:t xml:space="preserve"> יאיר לורברבוים, "ממקדש לאדם: תמורות במוקד הקדושה בספרות חז"ל", דעת 86 (תשע"ט), עמ' 377-396.</w:t>
+      </w:r>
+    </w:p>
+  </w:footnote>
+  <w:footnote w:id="17">
+    <w:p>
+      <w:pPr>
+        <w:bidi/>
+        <w:jc w:val="right"/>
+      </w:pPr>
+      <w:r>
+        <w:rPr>
+          <w:rStyle w:val="FootnoteReference"/>
+        </w:rPr>
+        <w:footnoteRef/>
+      </w:r>
+      <w:r>
+        <w:rPr>
+          <w:rFonts w:ascii="David" w:cs="David" w:eastAsia="David" w:hAnsi="David"/>
+          <w:sz w:val="20"/>
+          <w:szCs w:val="20"/>
+          <w:rtl/>
+        </w:rPr>
+        <w:t xml:space="preserve"> שם, דברי רבי אליעזר בסיום הסיפור.</w:t>
+      </w:r>
+    </w:p>
+  </w:footnote>
+  <w:footnote w:id="18">
+    <w:p>
+      <w:pPr>
+        <w:bidi/>
+        <w:jc w:val="right"/>
+      </w:pPr>
+      <w:r>
+        <w:rPr>
+          <w:rStyle w:val="FootnoteReference"/>
+        </w:rPr>
+        <w:footnoteRef/>
+      </w:r>
+      <w:r>
+        <w:rPr>
+          <w:rFonts w:ascii="David" w:cs="David" w:eastAsia="David" w:hAnsi="David"/>
+          <w:sz w:val="20"/>
+          <w:szCs w:val="20"/>
+          <w:rtl/>
+        </w:rPr>
+        <w:t xml:space="preserve"> מצגת הקורס "נביא וחכם" (שיעורים 3-5), אתר הקורס.</w:t>
+      </w:r>
+    </w:p>
+  </w:footnote>
+  <w:footnote w:id="19">
+    <w:p>
+      <w:pPr>
+        <w:bidi/>
+        <w:jc w:val="right"/>
+      </w:pPr>
+      <w:r>
+        <w:rPr>
+          <w:rStyle w:val="FootnoteReference"/>
+        </w:rPr>
+        <w:footnoteRef/>
+      </w:r>
+      <w:r>
+        <w:rPr>
+          <w:rFonts w:ascii="David" w:cs="David" w:eastAsia="David" w:hAnsi="David"/>
+          <w:sz w:val="20"/>
+          <w:szCs w:val="20"/>
+          <w:rtl/>
+        </w:rPr>
+        <w:t xml:space="preserve"> משנה, מסכת אבות, פרק ב, משנה ח; נלמדה ביחידה "צמיחה מתוך משבר".</w:t>
+      </w:r>
+    </w:p>
+  </w:footnote>
+  <w:footnote w:id="20">
+    <w:p>
+      <w:pPr>
+        <w:bidi/>
+        <w:jc w:val="right"/>
+      </w:pPr>
+      <w:r>
+        <w:rPr>
+          <w:rStyle w:val="FootnoteReference"/>
+        </w:rPr>
+        <w:footnoteRef/>
+      </w:r>
+      <w:r>
+        <w:rPr>
+          <w:rFonts w:ascii="David" w:cs="David" w:eastAsia="David" w:hAnsi="David"/>
+          <w:sz w:val="20"/>
+          <w:szCs w:val="20"/>
+          <w:rtl/>
+        </w:rPr>
+        <w:t xml:space="preserve"> דף החברותא "איך נעשים חכמ.ה", שם.</w:t>
+      </w:r>
+    </w:p>
+  </w:footnote>
+  <w:footnote w:id="21">
+    <w:p>
+      <w:pPr>
+        <w:bidi/>
+        <w:jc w:val="right"/>
+      </w:pPr>
+      <w:r>
+        <w:rPr>
+          <w:rStyle w:val="FootnoteReference"/>
+        </w:rPr>
+        <w:footnoteRef/>
+      </w:r>
+      <w:r>
+        <w:rPr>
+          <w:rFonts w:ascii="David" w:cs="David" w:eastAsia="David" w:hAnsi="David"/>
+          <w:sz w:val="20"/>
+          <w:szCs w:val="20"/>
+          <w:rtl/>
+        </w:rPr>
+        <w:t xml:space="preserve"> משנה, מסכת אבות, פרק ב, משנה ט.</w:t>
+      </w:r>
+    </w:p>
+  </w:footnote>
+  <w:footnote w:id="22">
+    <w:p>
+      <w:pPr>
+        <w:bidi/>
+        <w:jc w:val="right"/>
+      </w:pPr>
+      <w:r>
+        <w:rPr>
+          <w:rStyle w:val="FootnoteReference"/>
+        </w:rPr>
+        <w:footnoteRef/>
+      </w:r>
+      <w:r>
+        <w:rPr>
+          <w:rFonts w:ascii="David" w:cs="David" w:eastAsia="David" w:hAnsi="David"/>
+          <w:sz w:val="20"/>
+          <w:szCs w:val="20"/>
+          <w:rtl/>
+        </w:rPr>
+        <w:t xml:space="preserve"> משנה, מסכת סוטה, פרק ג, משנה ד.</w:t>
+      </w:r>
+    </w:p>
+  </w:footnote>
+  <w:footnote w:id="23">
+    <w:p>
+      <w:pPr>
+        <w:bidi/>
+        <w:jc w:val="right"/>
+      </w:pPr>
+      <w:r>
+        <w:rPr>
+          <w:rStyle w:val="FootnoteReference"/>
+        </w:rPr>
+        <w:footnoteRef/>
+      </w:r>
+      <w:r>
+        <w:rPr>
+          <w:rFonts w:ascii="David" w:cs="David" w:eastAsia="David" w:hAnsi="David"/>
+          <w:sz w:val="20"/>
+          <w:szCs w:val="20"/>
+          <w:rtl/>
+        </w:rPr>
+        <w:t xml:space="preserve"> תלמוד בבלי, מסכת סוטה, דף כא ע"ב.</w:t>
+      </w:r>
+    </w:p>
+  </w:footnote>
+  <w:footnote w:id="24">
+    <w:p>
+      <w:pPr>
+        <w:bidi/>
+        <w:jc w:val="right"/>
+      </w:pPr>
+      <w:r>
+        <w:rPr>
+          <w:rStyle w:val="FootnoteReference"/>
+        </w:rPr>
+        <w:footnoteRef/>
+      </w:r>
+      <w:r>
+        <w:rPr>
+          <w:rFonts w:ascii="David" w:cs="David" w:eastAsia="David" w:hAnsi="David"/>
+          <w:sz w:val="20"/>
+          <w:szCs w:val="20"/>
+          <w:rtl/>
+        </w:rPr>
+        <w:t xml:space="preserve"> דניאל בויארין, "תאוות הלימוד: התורה כאישה אחרת", הבשר שברוח: שיח המיניות בתלמוד, עם עובד, תשנ"ט, עמ' 170-183.</w:t>
       </w:r>
     </w:p>
   </w:footnote>

</xml_diff>

<commit_message>
Expand paper toward 2,500 words with verified film details
Corrected the Q3 comparison using the actual transcript of minutes
1:03:30-1:10:00: the segment does include the Vespasian meeting, with
the prophecy deferred and R. Yochanan thrown into the prisoners' pen
reciting "Torah magna, Torah matzla" (linked to Sotah 21a from the
course). Added personal reflections in Q1 and Q3, the Ono Academic
College header, and short expansions across all four answers.

Co-Authored-By: Claude Fable 5 <noreply@anthropic.com>
Claude-Session: https://claude.ai/code/session_01JB6bGJBwBnqBZeMysNqh8L
</commit_message>
<xml_diff>
--- a/עבודת-סיום-אדם-ספרות-ומעשה-בימי-חזל.docx
+++ b/עבודת-סיום-אדם-ספרות-ומעשה-בימי-חזל.docx
@@ -67,6 +67,24 @@
           <w:rFonts w:ascii="David" w:cs="David" w:eastAsia="David" w:hAnsi="David"/>
           <w:b/>
           <w:bCs/>
+          <w:sz w:val="30"/>
+          <w:szCs w:val="30"/>
+          <w:rtl/>
+        </w:rPr>
+        <w:t xml:space="preserve">הקריה האקדמית אונו</w:t>
+      </w:r>
+    </w:p>
+    <w:p>
+      <w:pPr>
+        <w:bidi/>
+        <w:spacing w:after="120" w:line="360" w:lineRule="auto"/>
+        <w:jc w:val="center"/>
+      </w:pPr>
+      <w:r>
+        <w:rPr>
+          <w:rFonts w:ascii="David" w:cs="David" w:eastAsia="David" w:hAnsi="David"/>
+          <w:b/>
+          <w:bCs/>
           <w:sz w:val="32"/>
           <w:szCs w:val="32"/>
           <w:rtl/>
@@ -456,7 +474,7 @@
           <w:szCs w:val="24"/>
           <w:rtl/>
         </w:rPr>
-        <w:t xml:space="preserve">, ולצד האזהרה מובאת שם גם הבטחה, שהמלווה את חברו ארבע אמות בעיר שוב אינו ניזוק.</w:t>
+        <w:t xml:space="preserve">, ולצד האזהרה מובאת שם גם הבטחה, שהמלווה את חברו ארבע אמות בעיר שוב אינו ניזוק. בהמשך הסוגיה מלמד רבי יהושע בן לוי שהמהלך בדרך בלא לוויה יעסוק בתורה, ומעשיהם של אמוראים המלווים זה את זה ארבע אמות בעיר נמסרים שם כעדות לערך שהפך לנורמה של ממש.</w:t>
       </w:r>
     </w:p>
     <w:p>
@@ -490,7 +508,7 @@
           <w:szCs w:val="24"/>
           <w:rtl/>
         </w:rPr>
-        <w:t xml:space="preserve">מקור הטקסט במשנה, מסכת סוטה, בפרק העוסק בטקסים שבטלו, והרחבתו בסוגיה בבבלי שם. הדמויות המרכזיות הן זקני העיר והכוהנים, כלומר ההנהגה, ומולם החלל האלמוני שאיש אינו יודע את שמו. הסיטואציה היא מוות שאין לו אשם ידוע, ודווקא בו מחייבים התורה וחז"ל את ההנהגה כולה לצאת אל הנחל ולתת דין וחשבון פומבי. בקורס נלמד המקור כדוגמה לתנועה של חז"ל מן המקרא אל המשנה ואל התלמוד: מטקס כפרה פולחני אל אמירה מוסרית על אחריות חברתית</w:t>
+        <w:t xml:space="preserve">מקור הטקסט במשנה, מסכת סוטה, בפרק התשיעי, העוסק בטקסים שבטלו; באותו פרק עצמו נמסר שמשרבו הרוצחים בטלה עגלה ערופה, כלומר המשנה מתארת טקס שכבר איננו, ובכל זאת טורחת לדרוש את משמעותו. הרחבת הדברים בסוגיה בבבלי שם. הדמויות המרכזיות הן זקני העיר והכוהנים, כלומר ההנהגה, ומולם החלל האלמוני שאיש אינו יודע את שמו. הסיטואציה היא מוות שאין לו אשם ידוע, ודווקא בו מחייבים התורה וחז"ל את ההנהגה כולה לצאת אל הנחל ולתת דין וחשבון פומבי. בקורס נלמד המקור כדוגמה לתנועה של חז"ל מן המקרא אל המשנה ואל התלמוד: מטקס כפרה פולחני אל אמירה מוסרית על אחריות חברתית</w:t>
       </w:r>
       <w:r>
         <w:rPr>
@@ -541,7 +559,7 @@
           <w:szCs w:val="24"/>
           <w:rtl/>
         </w:rPr>
-        <w:t xml:space="preserve">הטקסט מתאים לדעתי משום שהוא אומר בדיוק את מה שאני מבקשת לחדד: קבוצה נמדדת במה שקל לה להזניח. הזקנים אינם נחשדים ברצח. הם נתבעים על ליווי שלא ניתן ועל מזון שלא הוצע. אחריות, על פי חז"ל, אינה מסתכמת בהימנעות מפגיעה; היא חובת נוכחות פעילה: לראות את מי שבשוליים, ללוות את היוצא לדרך, לא להניח לאיש לצאת מן העיר לבדו. עבור צוות בתחילת שנה זו אמירה מעשית מאוד. תרבות של קבוצה מתגלה ברגעי הפרידה והמעבר של חבריה, ובשאלה אם מישהו נעלם ואיש לא שם לב. האמירה שהובאה לעיל, שמי שאינו מלווה כמוהו כשופך דמים, חריפה במתכוון, והחריפות הזאת היא שנחקקת בזיכרון השומעים.</w:t>
+        <w:t xml:space="preserve">הטקסט מתאים לדעתי משום שהוא אומר בדיוק את מה שאני מבקשת לחדד: קבוצה נמדדת במה שקל לה להזניח. הזקנים אינם נחשדים ברצח. הם נתבעים על ליווי שלא ניתן ועל מזון שלא הוצע. אחריות, על פי חז"ל, אינה מסתכמת בהימנעות מפגיעה; היא חובת נוכחות פעילה: לראות את מי שבשוליים, ללוות את היוצא לדרך, לא להניח לאיש לצאת מן העיר לבדו. עבור צוות בתחילת שנה זו אמירה מעשית מאוד. תרבות של קבוצה מתגלה ברגעי הפרידה והמעבר של חבריה, ובשאלה אם מישהו נעלם ואיש לא שם לב. האמירה שהובאה לעיל, שמי שאינו מלווה כמוהו כשופך דמים, חריפה במתכוון, והחריפות הזאת היא שנחקקת בזיכרון השומעים. אודה שהמשנה הזאת שינתה גם את הרגלי שלי: מאז שלמדנו אותה אני מוצאת את עצמי בודקת, בסוף כל מפגש, מי יצא מן החדר בלי שמישהו הלך איתו כברת דרך. את הבדיקה הפשוטה הזאת, ולא רעיון מופשט על ערבות הדדית, אני מבקשת להנחיל לחברי הצוות בדבריי.</w:t>
       </w:r>
     </w:p>
     <w:p>
@@ -628,7 +646,7 @@
           <w:szCs w:val="24"/>
           <w:rtl/>
         </w:rPr>
-        <w:t xml:space="preserve">.</w:t>
+        <w:t xml:space="preserve">. לצד המשנה הוצגה בשיעור גם התוספתא, קובץ תנאי מקביל ורחב ממנה המיוחס לתלמידי רבי, וההשוואה בין השתיים מבליטה עד כמה עריכת המשנה קפדנית וחסכנית.</w:t>
       </w:r>
     </w:p>
     <w:p>
@@ -677,7 +695,7 @@
           <w:szCs w:val="24"/>
           <w:rtl/>
         </w:rPr>
-        <w:t xml:space="preserve">. היא גם יצרה שפה משותפת לעם כולו. שני התלמודים, הבבלי והירושלמי, נבנו כפירוש עליה, וכל ספרות ההלכה שאחריהם נשענת עליה עד ימינו. ושינוי נוסף, מהפכני לא פחות: בעריכתה כרצף מחלוקות קיבעה המשנה את המחלוקת הלגיטימית כדרכה של תורה שבעל פה. בניגוד לחתירה לאחידות שאפיינה את האמונה המקראית, בית המדרש רואה בריבוי דעות ובביקורת הדדית את הדרך לבירור האמת.</w:t>
+        <w:t xml:space="preserve">. ראוי לשים לב שגם לאחר העריכה נשארה המשנה תורה שבעל פה במלוא מובן המילה: רבי ערך אותה אך המשיך למוסרה לתלמידיו על פה, ובבית המדרש התקיים תפקיד מיוחד, ה"תנא", השונה את המשניות בעל פה. היא גם יצרה שפה משותפת לעם כולו. שני התלמודים, הבבלי והירושלמי, נבנו כפירוש עליה, וכל ספרות ההלכה שאחריהם נשענת עליה עד ימינו. ושינוי נוסף, מהפכני לא פחות: בעריכתה כרצף מחלוקות קיבעה המשנה את המחלוקת הלגיטימית כדרכה של תורה שבעל פה. בניגוד לחתירה לאחידות שאפיינה את האמונה המקראית, בית המדרש רואה בריבוי דעות ובביקורת הדדית את הדרך לבירור האמת.</w:t>
       </w:r>
     </w:p>
     <w:p>
@@ -756,7 +774,7 @@
           <w:szCs w:val="24"/>
           <w:rtl/>
         </w:rPr>
-        <w:t xml:space="preserve">במשנה קצרה זו ניכר כל מה שתואר לעיל. היא פותחת מסכת שלמה המוקדשת לנושא אחד, הסוכה, בלא זיקה לסדר הפסוקים. לשונה פסקנית, קובעת שיעורים מספריים מדויקים ואינה מנמקת. והיא משמרת בגוף ההלכה את דעת היחיד החולקת, זו של רבי יהודה, בלא הכרעה מפורשת ובלא מחיקת הדעה שנדחתה. כך נראה השינוי שחוללה המשנה הלכה למעשה: חוק מקיף ומאורגן שהמחלוקת אינה תקלה בו אלא חלק ממהותו, והוא שהזמין את הדורות הבאים, בתלמודים ואילך, להמשיך ולדון בו.</w:t>
+        <w:t xml:space="preserve">במשנה קצרה זו ניכר כל מה שתואר לעיל. היא פותחת מסכת שלמה המוקדשת לנושא אחד, הסוכה, בלא זיקה לסדר הפסוקים. לשונה פסקנית, בלשון חכמים החיה של ארץ ישראל, קובעת שיעורים מספריים מדויקים במונחים קצובים, עשרים אמה, עשרה טפחים, שלוש דפנות, ואינה מנמקת דבר. והיא משמרת בגוף ההלכה את דעת היחיד החולקת, זו של רבי יהודה, בלא הכרעה מפורשת ובלא מחיקת הדעה שנדחתה. כך נראה השינוי שחוללה המשנה הלכה למעשה: חוק מקיף ומאורגן שהמחלוקת אינה תקלה בו אלא חלק ממהותו, והוא שהזמין את הדורות הבאים, בתלמודים ואילך, להמשיך ולדון בו.</w:t>
       </w:r>
     </w:p>
     <w:p>
@@ -815,7 +833,7 @@
           <w:szCs w:val="24"/>
           <w:rtl/>
         </w:rPr>
-        <w:t xml:space="preserve">הקטע (דקות 01:03:30 עד 01:10:00) מבוסס על אגדת יציאתו של רבן יוחנן בן זכאי מירושלים הנצורה, שנלמדה ביחידה "צמיחה מתוך משבר". להלן החלק הרלוונטי, בתרגום לעברית על פי דף המקורות של הקורס:</w:t>
+        <w:t xml:space="preserve">הקטע (דקות 01:03:30 עד 01:10:00) מבוסס על אגדת יציאתו של רבן יוחנן בן זכאי מירושלים הנצורה, שנלמדה ביחידה "צמיחה מתוך משבר". האגדה באה בבבלי בתוך קובץ שלם של סיפורי חורבן במסכת גיטין, והיא מוכרת בגרסאות נוספות בספרות חז"ל, ובהן איכה רבה ואבות דרבי נתן. להלן החלק הרלוונטי, בתרגום לעברית על פי דף המקורות של הקורס:</w:t>
       </w:r>
     </w:p>
     <w:p>
@@ -874,7 +892,7 @@
           <w:szCs w:val="24"/>
           <w:rtl/>
         </w:rPr>
-        <w:t xml:space="preserve">שלושה דמיונות. האחד, שלד העלילה: פגישה חשאית בין רבן יוחנן לבין בן אחותו העומד בראש הקנאים, הכרה משותפת שהרעב מכלה את העיר, ותחבולת המוות המדומה, שבה מוצא הרב מירושלים בארון קבורה הנישא בידי תלמידיו. השני, סצנת השער: השומרים דורשים לדקור את הארון כדי לוודא שהמת אכן מת, והאחיין בולם אותם בטיעון של האגדה עצמה, שלא ייאמר כי הקנאים פגעו ברבם, והם נסוגים מתוך יראת כבוד לתורה. השלישי, מטרת היציאה: בסרט כבמדרש, ההצלה איננה הצלת העיר. רבן יוחנן אומר לבן בטיח שדאגתו נתונה לכך "שלא תאבד התורה שבעל פה מישראל"</w:t>
+        <w:t xml:space="preserve">שלושה דמיונות. האחד, שלד העלילה: פגישה חשאית בין רבן יוחנן לבין בן אחותו העומד בראש הקנאים, הכרה משותפת שהרעב מכלה את העיר, ותחבולת המוות המדומה, שבה מוצא הרב מירושלים בארון קבורה הנישא בידי תלמידיו. השני, סצנת השער: השומרים דורשים לדקור את הארון כדי לוודא שהמת אכן מת, והאחיין בולם אותם בטיעון של האגדה עצמה, שלא ייאמר כי הקנאים פגעו ברבם, והם נסוגים מתוך יראת כבוד לתורה. השלישי, המפגש עם אספסיינוס ומטרתו: בסרט כבמדרש מתייצב רבן יוחנן לפני המצביא הרומי ומנבא את גדולתו, שהאל בחר בו לכבוש את ירושלים; וההצלה המבוקשת איננה בשני המקורות הצלת העיר אלא הצלת התורה. רבן יוחנן אומר לבן בטיח שדאגתו נתונה לכך "שלא תאבד התורה שבעל פה מישראל"</w:t>
       </w:r>
       <w:r>
         <w:rPr>
@@ -889,7 +907,7 @@
           <w:szCs w:val="24"/>
           <w:rtl/>
         </w:rPr>
-        <w:t xml:space="preserve">, ניסוח קולנועי של מה שיבשיל אצל אספסיינוס לבקשה על יבנה וחכמיה.</w:t>
+        <w:t xml:space="preserve">, ניסוח קולנועי של הרעיון שיבשיל לבקשה על יבנה וחכמיה.</w:t>
       </w:r>
     </w:p>
     <w:p>
@@ -901,13 +919,56 @@
       <w:r>
         <w:rPr>
           <w:rFonts w:ascii="David" w:cs="David" w:eastAsia="David" w:hAnsi="David"/>
-          <w:b w:val="false"/>
-          <w:bCs w:val="false"/>
-          <w:sz w:val="24"/>
-          <w:szCs w:val="24"/>
-          <w:rtl/>
-        </w:rPr>
-        <w:t xml:space="preserve">ושלושה הבדלים. ראשית, דמות האחיין: בבבלי זהו אבא סיקרא, דמות לקונית המופיעה בתמונה אחת בלבד; בסרט, ההולך כאן בעקבות גרסת איכה רבה, זהו בן בטיח, גיבור ראשי בעל עלילה שלמה, והמפגש עם הדוד נטען ברגש אישי: הוא מגיע אליו אבל על אמו ומיוסר על שריפת המחסנים שהמיטה את הרעב. שנית, כיוון ההאשמה מתהפך: בבבלי רבן יוחנן הוא שמוכיח את אחיינו על שהקנאים מרעיבים את העולם; בסרט דווקא רבן יוחנן מרגיע את בן בטיח וקובע שהרעב היה גזרה משמיים ובן בטיח לא היה אלא שליחה, תיאולוגיה מפורשת שאין לה זכר באגדה. שלישית, פרטי התחבולה ומה שהושמט: הסרט מוסיף את גזרתו של בר גיורא שאיש לא ייצא מן החומות מלבד המתים, את העמדת פני החולה ואת הדבר המצחין שהונח במיטה כדי לשכנע במותו, פרטים ממסורת איכה רבה שאינם בבבלי; ומנגד, קול הביקורת התלמודי, קריאתם של רב יוסף או רבי עקיבא נגד הבקשה הצנועה, נעדר מן הקטע כליל, והצופה נותר לשפוט בעצמו.</w:t>
+          <w:sz w:val="24"/>
+          <w:szCs w:val="24"/>
+          <w:rtl/>
+        </w:rPr>
+        <w:t xml:space="preserve">ושלושה הבדלים. ראשית, דמות האחיין: בבבלי זהו אבא סיקרא, דמות לקונית המופיעה בתמונה אחת בלבד; בסרט, ההולך כאן בעקבות גרסת איכה רבה, זהו בן בטיח, גיבור ראשי בעל עלילה שלמה, המגיע אל דודו אבל על אמו ומיוסר על שריפת המחסנים שהמיטה את הרעב; אף פרטי התחבולה, גזרתו של בר גיורא שאיש לא ייצא מן החומות מלבד המתים והדבר המצחין שהונח במיטה, לקוחים ממסורת איכה רבה ואינם בבבלי. שנית, כיוון ההאשמה מתהפך: בבבלי רבן יוחנן הוא שמוכיח את אחיינו על שהקנאים מרעיבים את העולם; בסרט דווקא רבן יוחנן מרגיע את בן בטיח וקובע שהרעב היה גזרה משמיים ובן בטיח לא היה אלא שליחה, תיאולוגיה מפורשת שאין לה זכר באגדה. שלישית, סיום המפגש עם אספסיינוס מתהפך אף הוא: בבבלי הנבואה מתאמתת בו במקום, שליח מרומא מבשר על ההכתרה ואספסיינוס מזמין את רבן יוחנן לבקש בקשה, והביקורת התלמודית על צניעות הבקשה נשמעת מיד; בסרט אספסיינוס נותר ספקן, דוחה את הגמול, "אם תתגשם נבואתך תקבל את מבוקשך"</w:t>
+      </w:r>
+      <w:r>
+        <w:rPr>
+          <w:rStyle w:val="FootnoteReference"/>
+        </w:rPr>
+        <w:footnoteReference w:id="10"/>
+      </w:r>
+      <w:r>
+        <w:rPr>
+          <w:rFonts w:ascii="David" w:cs="David" w:eastAsia="David" w:hAnsi="David"/>
+          <w:sz w:val="24"/>
+          <w:szCs w:val="24"/>
+          <w:rtl/>
+        </w:rPr>
+        <w:t xml:space="preserve">, ומשליך את רבן יוחנן למכלאת השבויים. הקטע נחתם בדמות הרב הכלוא הממלמל "תורה מגנא, תורה מצלא"</w:t>
+      </w:r>
+      <w:r>
+        <w:rPr>
+          <w:rStyle w:val="FootnoteReference"/>
+        </w:rPr>
+        <w:footnoteReference w:id="11"/>
+      </w:r>
+      <w:r>
+        <w:rPr>
+          <w:rFonts w:ascii="David" w:cs="David" w:eastAsia="David" w:hAnsi="David"/>
+          <w:sz w:val="24"/>
+          <w:szCs w:val="24"/>
+          <w:rtl/>
+        </w:rPr>
+        <w:t xml:space="preserve">, ובהודאה שהחורבן בא על שנאת האחים: "נגזרה הגזרה. שלחנו יד איש באחיו"</w:t>
+      </w:r>
+      <w:r>
+        <w:rPr>
+          <w:rStyle w:val="FootnoteReference"/>
+        </w:rPr>
+        <w:footnoteReference w:id="12"/>
+      </w:r>
+      <w:r>
+        <w:rPr>
+          <w:rFonts w:ascii="David" w:cs="David" w:eastAsia="David" w:hAnsi="David"/>
+          <w:sz w:val="24"/>
+          <w:szCs w:val="24"/>
+          <w:rtl/>
+        </w:rPr>
+        <w:t xml:space="preserve">. בקשת יבנה עצמה נדחית אל מעבר לגבול הקטע, וקול הביקורת של רב יוסף ורבי עקיבא נעדר ממנו כליל; הצופה נותר לשפוט בעצמו.</w:t>
       </w:r>
     </w:p>
     <w:p>
@@ -947,7 +1008,7 @@
         <w:rPr>
           <w:rStyle w:val="FootnoteReference"/>
         </w:rPr>
-        <w:footnoteReference w:id="10"/>
+        <w:footnoteReference w:id="13"/>
       </w:r>
       <w:r>
         <w:rPr>
@@ -962,22 +1023,22 @@
         <w:rPr>
           <w:rStyle w:val="FootnoteReference"/>
         </w:rPr>
-        <w:footnoteReference w:id="11"/>
-      </w:r>
-      <w:r>
-        <w:rPr>
-          <w:rFonts w:ascii="David" w:cs="David" w:eastAsia="David" w:hAnsi="David"/>
-          <w:sz w:val="24"/>
-          <w:szCs w:val="24"/>
-          <w:rtl/>
-        </w:rPr>
-        <w:t xml:space="preserve">. רבן יוחנן חייב למות מוות סמלי כדי שדבר חדש יוכל להיוולד, והיציאה בארון היא הרפיה מאחיזה בירושלים שדינה נגזר. הקריאה הזאת מאירה היטב את הקטע: בן בטיח עסוק באבנים, בעצים ובאשמת המתים, ואילו רבן יוחנן כבר חי את המציאות הבאה. את הבקשה על יבנה וחכמיה מסבירה מרקס, בעקבות שרמר, כהעמדת שכבת החכמים בראש העם: יבנה וחכמיה באות תחת ירושלים ובית מקדשה</w:t>
-      </w:r>
-      <w:r>
-        <w:rPr>
-          <w:rStyle w:val="FootnoteReference"/>
-        </w:rPr>
-        <w:footnoteReference w:id="12"/>
+        <w:footnoteReference w:id="14"/>
+      </w:r>
+      <w:r>
+        <w:rPr>
+          <w:rFonts w:ascii="David" w:cs="David" w:eastAsia="David" w:hAnsi="David"/>
+          <w:sz w:val="24"/>
+          <w:szCs w:val="24"/>
+          <w:rtl/>
+        </w:rPr>
+        <w:t xml:space="preserve">. רבן יוחנן חייב למות מוות סמלי כדי שדבר חדש יוכל להיוולד, והיציאה בארון היא הרפיה מאחיזה בירושלים שדינה נגזר. מרקס אף מצביעה על כך שבגרסת איכה רבה, זו שהסרט שואב ממנה כמה מפרטיו, מצטרף אל המוות הסמלי מעין היריון סמלי: הארון הסגור הוא גם רחם, שממנו נולד העם מחדש אל מציאות אחרת. הקריאה הזאת מאירה היטב את הקטע: בן בטיח עסוק באבנים, בעצים ובאשמת המתים, ואילו רבן יוחנן כבר חי את המציאות הבאה. את הבקשה על יבנה וחכמיה מסבירה מרקס, בעקבות שרמר, כהעמדת שכבת החכמים בראש העם: יבנה וחכמיה באות תחת ירושלים ובית מקדשה</w:t>
+      </w:r>
+      <w:r>
+        <w:rPr>
+          <w:rStyle w:val="FootnoteReference"/>
+        </w:rPr>
+        <w:footnoteReference w:id="15"/>
       </w:r>
       <w:r>
         <w:rPr>
@@ -1026,16 +1087,16 @@
         <w:rPr>
           <w:rStyle w:val="FootnoteReference"/>
         </w:rPr>
-        <w:footnoteReference w:id="13"/>
-      </w:r>
-      <w:r>
-        <w:rPr>
-          <w:rFonts w:ascii="David" w:cs="David" w:eastAsia="David" w:hAnsi="David"/>
-          <w:sz w:val="24"/>
-          <w:szCs w:val="24"/>
-          <w:rtl/>
-        </w:rPr>
-        <w:t xml:space="preserve">. הסיפור מעמיד דגם מנהיגות שממשיך לדבר אל קוראיו: מול קנאות הנלחמת עד כלות, פרגמטיזם שמציל את מה שאפשר להציל ומתרגם חורבן לבניין. מרקס מראה כיצד דורות שונים יצקו אל הסיפור את עולמם, ממורים שראו בו אחרי השואה את ניצחון הלימוד על הכוח ועד ויכוחים ציבוריים בישראל שבהם נאבקים על דמותו של רבן יוחנן תומכים ומבקרים כאחד. דווקא העמימות, שהתלמוד עצמו שימר בביקורת על הבקשה הצנועה, היא סוד כוחו. הוא אינו מוסר חד משמעי אלא מראה, לאומה וגם לכל אדם המקים את חייו מן החורבות.</w:t>
+        <w:footnoteReference w:id="16"/>
+      </w:r>
+      <w:r>
+        <w:rPr>
+          <w:rFonts w:ascii="David" w:cs="David" w:eastAsia="David" w:hAnsi="David"/>
+          <w:sz w:val="24"/>
+          <w:szCs w:val="24"/>
+          <w:rtl/>
+        </w:rPr>
+        <w:t xml:space="preserve">. הסיפור מעמיד דגם מנהיגות שממשיך לדבר אל קוראיו: מול קנאות הנלחמת עד כלות, פרגמטיזם שמציל את מה שאפשר להציל ומתרגם חורבן לבניין. מרקס מראה כיצד דורות שונים יצקו אל הסיפור את עולמם, ממורים שראו בו אחרי השואה את ניצחון הלימוד על הכוח ועד ויכוחים ציבוריים בישראל שבהם נאבקים על דמותו של רבן יוחנן תומכים ומבקרים כאחד. דווקא העמימות, שהתלמוד עצמו שימר בביקורת על הבקשה הצנועה, היא סוד כוחו. הוא אינו מוסר חד משמעי אלא מראה, לאומה וגם לכל אדם המקים את חייו מן החורבות. אוסיף מנקודת מבטי: הישגו של הסרט הוא שהחזיר לסיפור את כובד הבשר והדם. הצפייה בירושלים המורעבת עשתה עבורי מוחשי את גודל הוויתור, ולימדה אותי שהבחירה ביבנה לא הייתה תשובה קלה של איש רוח, אלא ההימור הכבד ביותר שנטל על עצמו מנהיג יהודי.</w:t>
       </w:r>
     </w:p>
     <w:p>
@@ -1080,7 +1141,7 @@
         <w:rPr>
           <w:rStyle w:val="FootnoteReference"/>
         </w:rPr>
-        <w:footnoteReference w:id="14"/>
+        <w:footnoteReference w:id="17"/>
       </w:r>
       <w:r>
         <w:rPr>
@@ -1129,7 +1190,7 @@
         <w:rPr>
           <w:rStyle w:val="FootnoteReference"/>
         </w:rPr>
-        <w:footnoteReference w:id="15"/>
+        <w:footnoteReference w:id="18"/>
       </w:r>
       <w:r>
         <w:rPr>
@@ -1178,22 +1239,22 @@
         <w:rPr>
           <w:rStyle w:val="FootnoteReference"/>
         </w:rPr>
-        <w:footnoteReference w:id="16"/>
-      </w:r>
-      <w:r>
-        <w:rPr>
-          <w:rFonts w:ascii="David" w:cs="David" w:eastAsia="David" w:hAnsi="David"/>
-          <w:sz w:val="24"/>
-          <w:szCs w:val="24"/>
-          <w:rtl/>
-        </w:rPr>
-        <w:t xml:space="preserve">. גיבור הסיפור אינו כהן ואינו יורש אחוזה. הדרמה כולה מתרחשת בין שדה חרוש לבית מדרש, והקדושה מתגלה בלימודו של אדם אחד. הערכים המקודשים של העולם הישן, אדמה, ירושה וממון, מוצבים במפורש מול התורה ומוכרעים בסוף הסיפור: "לֹא בִּקַּשְׁתִּי מִלִּפְנֵי הַקָּדוֹשׁ בָּרוּךְ הוּא אֶלָּא תּוֹרָה בִּלְבַד"</w:t>
-      </w:r>
-      <w:r>
-        <w:rPr>
-          <w:rStyle w:val="FootnoteReference"/>
-        </w:rPr>
-        <w:footnoteReference w:id="17"/>
+        <w:footnoteReference w:id="19"/>
+      </w:r>
+      <w:r>
+        <w:rPr>
+          <w:rFonts w:ascii="David" w:cs="David" w:eastAsia="David" w:hAnsi="David"/>
+          <w:sz w:val="24"/>
+          <w:szCs w:val="24"/>
+          <w:rtl/>
+        </w:rPr>
+        <w:t xml:space="preserve">. לורברבוים מדגיש שמוקד הקדושה אינו עובר אל מקום חדש ואף לא אל איש פלא יחיד, אלא אל האדם, כל אדם, מכוח בריאתו בצלם אלוהים. גיבור הסיפור אינו כהן ואינו יורש אחוזה. הדרמה כולה מתרחשת בין שדה חרוש לבית מדרש, והקדושה מתגלה בלימודו של אדם אחד. הערכים המקודשים של העולם הישן, אדמה, ירושה וממון, מוצבים במפורש מול התורה ומוכרעים בסוף הסיפור: "לֹא בִּקַּשְׁתִּי מִלִּפְנֵי הַקָּדוֹשׁ בָּרוּךְ הוּא אֶלָּא תּוֹרָה בִּלְבַד"</w:t>
+      </w:r>
+      <w:r>
+        <w:rPr>
+          <w:rStyle w:val="FootnoteReference"/>
+        </w:rPr>
+        <w:footnoteReference w:id="20"/>
       </w:r>
       <w:r>
         <w:rPr>
@@ -1224,7 +1285,7 @@
         <w:rPr>
           <w:rStyle w:val="FootnoteReference"/>
         </w:rPr>
-        <w:footnoteReference w:id="18"/>
+        <w:footnoteReference w:id="21"/>
       </w:r>
       <w:r>
         <w:rPr>
@@ -1291,7 +1352,7 @@
         <w:rPr>
           <w:rStyle w:val="FootnoteReference"/>
         </w:rPr>
-        <w:footnoteReference w:id="19"/>
+        <w:footnoteReference w:id="22"/>
       </w:r>
       <w:r>
         <w:rPr>
@@ -1306,7 +1367,7 @@
         <w:rPr>
           <w:rStyle w:val="FootnoteReference"/>
         </w:rPr>
-        <w:footnoteReference w:id="20"/>
+        <w:footnoteReference w:id="23"/>
       </w:r>
       <w:r>
         <w:rPr>
@@ -1321,7 +1382,7 @@
         <w:rPr>
           <w:rStyle w:val="FootnoteReference"/>
         </w:rPr>
-        <w:footnoteReference w:id="21"/>
+        <w:footnoteReference w:id="24"/>
       </w:r>
       <w:r>
         <w:rPr>
@@ -1352,7 +1413,7 @@
         <w:rPr>
           <w:rStyle w:val="FootnoteReference"/>
         </w:rPr>
-        <w:footnoteReference w:id="22"/>
+        <w:footnoteReference w:id="25"/>
       </w:r>
       <w:r>
         <w:rPr>
@@ -1367,7 +1428,7 @@
         <w:rPr>
           <w:rStyle w:val="FootnoteReference"/>
         </w:rPr>
-        <w:footnoteReference w:id="23"/>
+        <w:footnoteReference w:id="26"/>
       </w:r>
       <w:r>
         <w:rPr>
@@ -1382,16 +1443,16 @@
         <w:rPr>
           <w:rStyle w:val="FootnoteReference"/>
         </w:rPr>
-        <w:footnoteReference w:id="24"/>
-      </w:r>
-      <w:r>
-        <w:rPr>
-          <w:rFonts w:ascii="David" w:cs="David" w:eastAsia="David" w:hAnsi="David"/>
-          <w:sz w:val="24"/>
-          <w:szCs w:val="24"/>
-          <w:rtl/>
-        </w:rPr>
-        <w:t xml:space="preserve">. וכאן מתחדד פרדוקס בדמותו: האיש שפרץ בעצמו כל גבול כדי להיכנס לבית המדרש, בגיל מאוחר, נגד אביו וכנגד כל הסיכויים, הוא הנועל את שעריו בפני נשים. שומר הסף של המסורת מבקש לשמור גם על גבולותיה החברתיים. ראוי להוסיף כי בסיפור תחילתו של רבי עקיבא, שנלמד באותו דף חברותא, יושב רבי עקיבא שנים לפני רבי אליעזר ולומד מפיו: הבור הסוד נעשה בעצמו רבו של גדול הדרשנים.</w:t>
+        <w:footnoteReference w:id="27"/>
+      </w:r>
+      <w:r>
+        <w:rPr>
+          <w:rFonts w:ascii="David" w:cs="David" w:eastAsia="David" w:hAnsi="David"/>
+          <w:sz w:val="24"/>
+          <w:szCs w:val="24"/>
+          <w:rtl/>
+        </w:rPr>
+        <w:t xml:space="preserve">. וכאן מתחדד פרדוקס בדמותו: האיש שפרץ בעצמו כל גבול כדי להיכנס לבית המדרש, בגיל מאוחר, נגד אביו וכנגד כל הסיכויים, הוא הנועל את שעריו בפני נשים. הפרדוקס מעמיק עוד לנוכח דמותה של אשתו, אמא שלום אחות רבן גמליאל, שנמנתה בחומרי המפגש על הנשים הלמדניות שבספרות חז"ל. שומר הסף של המסורת מבקש לשמור גם על גבולותיה החברתיים. ראוי להוסיף כי בסיפור תחילתו של רבי עקיבא, שנלמד באותו דף חברותא, יושב רבי עקיבא שנים לפני רבי אליעזר ולומד מפיו: הבור הסוד נעשה בעצמו רבו של גדול הדרשנים.</w:t>
       </w:r>
     </w:p>
     <w:p>
@@ -1818,11 +1879,80 @@
           <w:szCs w:val="20"/>
           <w:rtl/>
         </w:rPr>
+        <w:t xml:space="preserve"> מתוך פסקול הסרט, שם.</w:t>
+      </w:r>
+    </w:p>
+  </w:footnote>
+  <w:footnote w:id="11">
+    <w:p>
+      <w:pPr>
+        <w:bidi/>
+        <w:jc w:val="right"/>
+      </w:pPr>
+      <w:r>
+        <w:rPr>
+          <w:rStyle w:val="FootnoteReference"/>
+        </w:rPr>
+        <w:footnoteRef/>
+      </w:r>
+      <w:r>
+        <w:rPr>
+          <w:rFonts w:ascii="David" w:cs="David" w:eastAsia="David" w:hAnsi="David"/>
+          <w:sz w:val="20"/>
+          <w:szCs w:val="20"/>
+          <w:rtl/>
+        </w:rPr>
+        <w:t xml:space="preserve"> מתוך פסקול הסרט, שם. הלשון שאולה מן התלמוד: התורה מגינה ומצילה, בבלי, מסכת סוטה, דף כא ע"א, מן הסוגיה שנלמדה במפגש 11.</w:t>
+      </w:r>
+    </w:p>
+  </w:footnote>
+  <w:footnote w:id="12">
+    <w:p>
+      <w:pPr>
+        <w:bidi/>
+        <w:jc w:val="right"/>
+      </w:pPr>
+      <w:r>
+        <w:rPr>
+          <w:rStyle w:val="FootnoteReference"/>
+        </w:rPr>
+        <w:footnoteRef/>
+      </w:r>
+      <w:r>
+        <w:rPr>
+          <w:rFonts w:ascii="David" w:cs="David" w:eastAsia="David" w:hAnsi="David"/>
+          <w:sz w:val="20"/>
+          <w:szCs w:val="20"/>
+          <w:rtl/>
+        </w:rPr>
+        <w:t xml:space="preserve"> מתוך פסקול הסרט, שם.</w:t>
+      </w:r>
+    </w:p>
+  </w:footnote>
+  <w:footnote w:id="13">
+    <w:p>
+      <w:pPr>
+        <w:bidi/>
+        <w:jc w:val="right"/>
+      </w:pPr>
+      <w:r>
+        <w:rPr>
+          <w:rStyle w:val="FootnoteReference"/>
+        </w:rPr>
+        <w:footnoteRef/>
+      </w:r>
+      <w:r>
+        <w:rPr>
+          <w:rFonts w:ascii="David" w:cs="David" w:eastAsia="David" w:hAnsi="David"/>
+          <w:sz w:val="20"/>
+          <w:szCs w:val="20"/>
+          <w:rtl/>
+        </w:rPr>
         <w:t xml:space="preserve"> דליה מרקס, "רבן יוחנן בן זכאי והקמת יבנה: ניתוח והערכת הסיפור בראי הזמן", מתוך חומרי הקריאה של הקורס.</w:t>
       </w:r>
     </w:p>
   </w:footnote>
-  <w:footnote w:id="11">
+  <w:footnote w:id="14">
     <w:p>
       <w:pPr>
         <w:bidi/>
@@ -1845,7 +1975,7 @@
       </w:r>
     </w:p>
   </w:footnote>
-  <w:footnote w:id="12">
+  <w:footnote w:id="15">
     <w:p>
       <w:pPr>
         <w:bidi/>
@@ -1868,7 +1998,7 @@
       </w:r>
     </w:p>
   </w:footnote>
-  <w:footnote w:id="13">
+  <w:footnote w:id="16">
     <w:p>
       <w:pPr>
         <w:bidi/>
@@ -1891,7 +2021,7 @@
       </w:r>
     </w:p>
   </w:footnote>
-  <w:footnote w:id="14">
+  <w:footnote w:id="17">
     <w:p>
       <w:pPr>
         <w:bidi/>
@@ -1914,7 +2044,7 @@
       </w:r>
     </w:p>
   </w:footnote>
-  <w:footnote w:id="15">
+  <w:footnote w:id="18">
     <w:p>
       <w:pPr>
         <w:bidi/>
@@ -1937,7 +2067,7 @@
       </w:r>
     </w:p>
   </w:footnote>
-  <w:footnote w:id="16">
+  <w:footnote w:id="19">
     <w:p>
       <w:pPr>
         <w:bidi/>
@@ -1960,7 +2090,7 @@
       </w:r>
     </w:p>
   </w:footnote>
-  <w:footnote w:id="17">
+  <w:footnote w:id="20">
     <w:p>
       <w:pPr>
         <w:bidi/>
@@ -1983,7 +2113,7 @@
       </w:r>
     </w:p>
   </w:footnote>
-  <w:footnote w:id="18">
+  <w:footnote w:id="21">
     <w:p>
       <w:pPr>
         <w:bidi/>
@@ -2006,7 +2136,7 @@
       </w:r>
     </w:p>
   </w:footnote>
-  <w:footnote w:id="19">
+  <w:footnote w:id="22">
     <w:p>
       <w:pPr>
         <w:bidi/>
@@ -2029,7 +2159,7 @@
       </w:r>
     </w:p>
   </w:footnote>
-  <w:footnote w:id="20">
+  <w:footnote w:id="23">
     <w:p>
       <w:pPr>
         <w:bidi/>
@@ -2052,7 +2182,7 @@
       </w:r>
     </w:p>
   </w:footnote>
-  <w:footnote w:id="21">
+  <w:footnote w:id="24">
     <w:p>
       <w:pPr>
         <w:bidi/>
@@ -2075,7 +2205,7 @@
       </w:r>
     </w:p>
   </w:footnote>
-  <w:footnote w:id="22">
+  <w:footnote w:id="25">
     <w:p>
       <w:pPr>
         <w:bidi/>
@@ -2098,7 +2228,7 @@
       </w:r>
     </w:p>
   </w:footnote>
-  <w:footnote w:id="23">
+  <w:footnote w:id="26">
     <w:p>
       <w:pPr>
         <w:bidi/>
@@ -2121,7 +2251,7 @@
       </w:r>
     </w:p>
   </w:footnote>
-  <w:footnote w:id="24">
+  <w:footnote w:id="27">
     <w:p>
       <w:pPr>
         <w:bidi/>

</xml_diff>

<commit_message>
Replace ibid-style footnotes with full references
The academic-writing style guide forbids "שם"/Ibid in citations; all
seven footnotes that used it now repeat the full short reference.

Co-Authored-By: Claude Fable 5 <noreply@anthropic.com>
Claude-Session: https://claude.ai/code/session_01JB6bGJBwBnqBZeMysNqh8L
</commit_message>
<xml_diff>
--- a/עבודת-סיום-אדם-ספרות-ומעשה-בימי-חזל.docx
+++ b/עבודת-סיום-אדם-ספרות-ומעשה-בימי-חזל.docx
@@ -1879,7 +1879,7 @@
           <w:szCs w:val="20"/>
           <w:rtl/>
         </w:rPr>
-        <w:t xml:space="preserve"> מתוך פסקול הסרט, שם.</w:t>
+        <w:t xml:space="preserve"> מתוך פסקול הסרט "אגדת חורבן" (במאי: גידי דר, ישראל 2022), בקטע הנדון.</w:t>
       </w:r>
     </w:p>
   </w:footnote>
@@ -1902,7 +1902,7 @@
           <w:szCs w:val="20"/>
           <w:rtl/>
         </w:rPr>
-        <w:t xml:space="preserve"> מתוך פסקול הסרט, שם. הלשון שאולה מן התלמוד: התורה מגינה ומצילה, בבלי, מסכת סוטה, דף כא ע"א, מן הסוגיה שנלמדה במפגש 11.</w:t>
+        <w:t xml:space="preserve"> מתוך פסקול הסרט "אגדת חורבן" (במאי: גידי דר, ישראל 2022), בקטע הנדון; הלשון שאולה מן התלמוד, התורה מגינה ומצילה, תלמוד בבלי, מסכת סוטה, דף כא ע"א, מן הסוגיה שנלמדה במפגש 11.</w:t>
       </w:r>
     </w:p>
   </w:footnote>
@@ -1925,7 +1925,7 @@
           <w:szCs w:val="20"/>
           <w:rtl/>
         </w:rPr>
-        <w:t xml:space="preserve"> מתוך פסקול הסרט, שם.</w:t>
+        <w:t xml:space="preserve"> מתוך פסקול הסרט "אגדת חורבן" (במאי: גידי דר, ישראל 2022), בקטע הנדון.</w:t>
       </w:r>
     </w:p>
   </w:footnote>
@@ -1971,7 +1971,7 @@
           <w:szCs w:val="20"/>
           <w:rtl/>
         </w:rPr>
-        <w:t xml:space="preserve"> ג'ונתן רוזן, התלמוד והאינטרנט, כפי שמצוטט אצל מרקס, שם.</w:t>
+        <w:t xml:space="preserve"> ג'ונתן רוזן, התלמוד והאינטרנט, כפי שמצוטט אצל דליה מרקס, "רבן יוחנן בן זכאי והקמת יבנה: ניתוח והערכת הסיפור בראי הזמן".</w:t>
       </w:r>
     </w:p>
   </w:footnote>
@@ -1994,7 +1994,7 @@
           <w:szCs w:val="20"/>
           <w:rtl/>
         </w:rPr>
-        <w:t xml:space="preserve"> אדיאל שרמר, כפי שמצוטט אצל מרקס, שם.</w:t>
+        <w:t xml:space="preserve"> אדיאל שרמר, כפי שמצוטט אצל דליה מרקס, "רבן יוחנן בן זכאי והקמת יבנה: ניתוח והערכת הסיפור בראי הזמן".</w:t>
       </w:r>
     </w:p>
   </w:footnote>
@@ -2017,7 +2017,7 @@
           <w:szCs w:val="20"/>
           <w:rtl/>
         </w:rPr>
-        <w:t xml:space="preserve"> מרקס, "רבן יוחנן בן זכאי והקמת יבנה", שם.</w:t>
+        <w:t xml:space="preserve"> דליה מרקס, "רבן יוחנן בן זכאי והקמת יבנה: ניתוח והערכת הסיפור בראי הזמן", מתוך חומרי הקריאה של הקורס.</w:t>
       </w:r>
     </w:p>
   </w:footnote>
@@ -2063,7 +2063,7 @@
           <w:szCs w:val="20"/>
           <w:rtl/>
         </w:rPr>
-        <w:t xml:space="preserve"> שם, על פי נוסח דף החברותא.</w:t>
+        <w:t xml:space="preserve"> פרקי דרבי אליעזר, פרקים א-ב, ומקבילות, על פי נוסח דף החברותא "איך נעשים חכמ.ה".</w:t>
       </w:r>
     </w:p>
   </w:footnote>
@@ -2109,7 +2109,7 @@
           <w:szCs w:val="20"/>
           <w:rtl/>
         </w:rPr>
-        <w:t xml:space="preserve"> שם, דברי רבי אליעזר בסיום הסיפור.</w:t>
+        <w:t xml:space="preserve"> דברי רבי אליעזר בסיום הסיפור, פרקי דרבי אליעזר, פרקים א-ב, ומקבילות, על פי דף החברותא "איך נעשים חכמ.ה".</w:t>
       </w:r>
     </w:p>
   </w:footnote>
@@ -2178,7 +2178,7 @@
           <w:szCs w:val="20"/>
           <w:rtl/>
         </w:rPr>
-        <w:t xml:space="preserve"> דף החברותא "איך נעשים חכמ.ה", שם.</w:t>
+        <w:t xml:space="preserve"> דף החברותא "איך נעשים חכמ.ה", אתר הקורס.</w:t>
       </w:r>
     </w:p>
   </w:footnote>

</xml_diff>

<commit_message>
Reformat bibliography to MLA per the library citation guide
The course's humanities citation guide follows MLA, so the reference
list now uses MLA structure (full first names, place of publication,
journal volume (year): pages) under the heading used by the assignment.

Co-Authored-By: Claude Fable 5 <noreply@anthropic.com>
Claude-Session: https://claude.ai/code/session_01JB6bGJBwBnqBZeMysNqh8L
</commit_message>
<xml_diff>
--- a/עבודת-סיום-אדם-ספרות-ומעשה-בימי-חזל.docx
+++ b/עבודת-סיום-אדם-ספרות-ומעשה-בימי-חזל.docx
@@ -1503,97 +1503,97 @@
           <w:szCs w:val="28"/>
           <w:rtl/>
         </w:rPr>
-        <w:t xml:space="preserve">רשימת מקורות</w:t>
-      </w:r>
-    </w:p>
-    <w:p>
-      <w:pPr>
-        <w:bidi/>
-        <w:spacing w:after="120" w:line="360" w:lineRule="auto"/>
-        <w:jc w:val="right"/>
-      </w:pPr>
-      <w:r>
-        <w:rPr>
-          <w:rFonts w:ascii="David" w:cs="David" w:eastAsia="David" w:hAnsi="David"/>
-          <w:b w:val="false"/>
-          <w:bCs w:val="false"/>
-          <w:sz w:val="24"/>
-          <w:szCs w:val="24"/>
-          <w:rtl/>
-        </w:rPr>
-        <w:t xml:space="preserve">בויארין, דניאל, "תאוות הלימוד: התורה כאישה אחרת", בתוך: הבשר שברוח: שיח המיניות בתלמוד, תל אביב: עם עובד, תשנ"ט, עמ' 170-183.</w:t>
-      </w:r>
-    </w:p>
-    <w:p>
-      <w:pPr>
-        <w:bidi/>
-        <w:spacing w:after="120" w:line="360" w:lineRule="auto"/>
-        <w:jc w:val="right"/>
-      </w:pPr>
-      <w:r>
-        <w:rPr>
-          <w:rFonts w:ascii="David" w:cs="David" w:eastAsia="David" w:hAnsi="David"/>
-          <w:b w:val="false"/>
-          <w:bCs w:val="false"/>
-          <w:sz w:val="24"/>
-          <w:szCs w:val="24"/>
-          <w:rtl/>
-        </w:rPr>
-        <w:t xml:space="preserve">הלברטל, משה, "מבוא למשנה", שישה סדרי משנה, סדרת עם הספר, תל אביב: ידיעות אחרונות.</w:t>
-      </w:r>
-    </w:p>
-    <w:p>
-      <w:pPr>
-        <w:bidi/>
-        <w:spacing w:after="120" w:line="360" w:lineRule="auto"/>
-        <w:jc w:val="right"/>
-      </w:pPr>
-      <w:r>
-        <w:rPr>
-          <w:rFonts w:ascii="David" w:cs="David" w:eastAsia="David" w:hAnsi="David"/>
-          <w:b w:val="false"/>
-          <w:bCs w:val="false"/>
-          <w:sz w:val="24"/>
-          <w:szCs w:val="24"/>
-          <w:rtl/>
-        </w:rPr>
-        <w:t xml:space="preserve">לורברבוים, יאיר, "ממקדש לאדם: תמורות במוקד הקדושה בספרות חז"ל", דעת: כתב עת לפילוסופיה יהודית וקבלה 86 (תשע"ט), עמ' 377-396.</w:t>
-      </w:r>
-    </w:p>
-    <w:p>
-      <w:pPr>
-        <w:bidi/>
-        <w:spacing w:after="120" w:line="360" w:lineRule="auto"/>
-        <w:jc w:val="right"/>
-      </w:pPr>
-      <w:r>
-        <w:rPr>
-          <w:rFonts w:ascii="David" w:cs="David" w:eastAsia="David" w:hAnsi="David"/>
-          <w:b w:val="false"/>
-          <w:bCs w:val="false"/>
-          <w:sz w:val="24"/>
-          <w:szCs w:val="24"/>
-          <w:rtl/>
-        </w:rPr>
-        <w:t xml:space="preserve">מרקס, דליה, "רבן יוחנן בן זכאי והקמת יבנה: ניתוח והערכת הסיפור בראי הזמן".</w:t>
-      </w:r>
-    </w:p>
-    <w:p>
-      <w:pPr>
-        <w:bidi/>
-        <w:spacing w:after="120" w:line="360" w:lineRule="auto"/>
-        <w:jc w:val="right"/>
-      </w:pPr>
-      <w:r>
-        <w:rPr>
-          <w:rFonts w:ascii="David" w:cs="David" w:eastAsia="David" w:hAnsi="David"/>
-          <w:b w:val="false"/>
-          <w:bCs w:val="false"/>
-          <w:sz w:val="24"/>
-          <w:szCs w:val="24"/>
-          <w:rtl/>
-        </w:rPr>
-        <w:t xml:space="preserve">דפי המקורות, דפי החברותא והמצגות מאתר הקורס: מפגש 1 (עגלה ערופה), שיעורים 3-5 ("נביא וחכם", משנה ותוספתא, דף חברותא "מאפייני המשנה"), היחידה "צמיחה מתוך משבר" (ריב"ז והיציאה מירושלים), דף חברותא "איך נעשים חכמ.ה", דף מקורות מפגש 11 (לימוד תורה לנשים).</w:t>
+        <w:t xml:space="preserve">ביבליוגרפיה</w:t>
+      </w:r>
+    </w:p>
+    <w:p>
+      <w:pPr>
+        <w:bidi/>
+        <w:spacing w:after="120" w:line="360" w:lineRule="auto"/>
+        <w:jc w:val="right"/>
+      </w:pPr>
+      <w:r>
+        <w:rPr>
+          <w:rFonts w:ascii="David" w:cs="David" w:eastAsia="David" w:hAnsi="David"/>
+          <w:b w:val="false"/>
+          <w:bCs w:val="false"/>
+          <w:sz w:val="24"/>
+          <w:szCs w:val="24"/>
+          <w:rtl/>
+        </w:rPr>
+        <w:t xml:space="preserve">בויארין, דניאל. "תאוות הלימוד: התורה כאישה אחרת". הבשר שברוח: שיח המיניות בתלמוד. תל אביב: עם עובד, תשנ"ט. 170-183.</w:t>
+      </w:r>
+    </w:p>
+    <w:p>
+      <w:pPr>
+        <w:bidi/>
+        <w:spacing w:after="120" w:line="360" w:lineRule="auto"/>
+        <w:jc w:val="right"/>
+      </w:pPr>
+      <w:r>
+        <w:rPr>
+          <w:rFonts w:ascii="David" w:cs="David" w:eastAsia="David" w:hAnsi="David"/>
+          <w:b w:val="false"/>
+          <w:bCs w:val="false"/>
+          <w:sz w:val="24"/>
+          <w:szCs w:val="24"/>
+          <w:rtl/>
+        </w:rPr>
+        <w:t xml:space="preserve">הלברטל, משה. "מבוא למשנה". שישה סדרי משנה. סדרת עם הספר. תל אביב: ידיעות אחרונות.</w:t>
+      </w:r>
+    </w:p>
+    <w:p>
+      <w:pPr>
+        <w:bidi/>
+        <w:spacing w:after="120" w:line="360" w:lineRule="auto"/>
+        <w:jc w:val="right"/>
+      </w:pPr>
+      <w:r>
+        <w:rPr>
+          <w:rFonts w:ascii="David" w:cs="David" w:eastAsia="David" w:hAnsi="David"/>
+          <w:b w:val="false"/>
+          <w:bCs w:val="false"/>
+          <w:sz w:val="24"/>
+          <w:szCs w:val="24"/>
+          <w:rtl/>
+        </w:rPr>
+        <w:t xml:space="preserve">לורברבוים, יאיר. "ממקדש לאדם: תמורות במוקד הקדושה בספרות חז"ל". דעת: כתב עת לפילוסופיה יהודית וקבלה 86 (תשע"ט): 377-396.</w:t>
+      </w:r>
+    </w:p>
+    <w:p>
+      <w:pPr>
+        <w:bidi/>
+        <w:spacing w:after="120" w:line="360" w:lineRule="auto"/>
+        <w:jc w:val="right"/>
+      </w:pPr>
+      <w:r>
+        <w:rPr>
+          <w:rFonts w:ascii="David" w:cs="David" w:eastAsia="David" w:hAnsi="David"/>
+          <w:b w:val="false"/>
+          <w:bCs w:val="false"/>
+          <w:sz w:val="24"/>
+          <w:szCs w:val="24"/>
+          <w:rtl/>
+        </w:rPr>
+        <w:t xml:space="preserve">מרקס, דליה. "רבן יוחנן בן זכאי והקמת יבנה: ניתוח והערכת הסיפור בראי הזמן". מתוך חומרי הקריאה באתר הקורס.</w:t>
+      </w:r>
+    </w:p>
+    <w:p>
+      <w:pPr>
+        <w:bidi/>
+        <w:spacing w:after="120" w:line="360" w:lineRule="auto"/>
+        <w:jc w:val="right"/>
+      </w:pPr>
+      <w:r>
+        <w:rPr>
+          <w:rFonts w:ascii="David" w:cs="David" w:eastAsia="David" w:hAnsi="David"/>
+          <w:b w:val="false"/>
+          <w:bCs w:val="false"/>
+          <w:sz w:val="24"/>
+          <w:szCs w:val="24"/>
+          <w:rtl/>
+        </w:rPr>
+        <w:t xml:space="preserve">סבאג ישראל, חגית. דפי מקורות, דפי חברותא ומצגות בקורס "אדם, ספרות ומעשה בימי חז"ל". הקריה האקדמית אונו, תשפ"ו: מפגש 1 (עגלה ערופה), שיעורים 3-5 ("נביא וחכם", משנה ותוספתא, "מאפייני המשנה"), היחידה "צמיחה מתוך משבר" (ריב"ז והיציאה מירושלים), "איך נעשים חכמ.ה", מפגש 11 (לימוד תורה לנשים).</w:t>
       </w:r>
     </w:p>
     <w:sectPr>

</xml_diff>

<commit_message>
Expand paper to ~2,700 words total
Added the two-Talmuds point in Q2, Marx's reading of the two additional
requests in Q3, the innkeeper and sack-of-dirt episode in Q4a, a closing
synthesis of R. Eliezer's character, and the priests' role in the eglah
arufah ritual.

Co-Authored-By: Claude Fable 5 <noreply@anthropic.com>
Claude-Session: https://claude.ai/code/session_01JB6bGJBwBnqBZeMysNqh8L
</commit_message>
<xml_diff>
--- a/עבודת-סיום-אדם-ספרות-ומעשה-בימי-חזל.docx
+++ b/עבודת-סיום-אדם-ספרות-ומעשה-בימי-חזל.docx
@@ -536,7 +536,7 @@
           <w:szCs w:val="24"/>
           <w:rtl/>
         </w:rPr>
-        <w:t xml:space="preserve">מקור הטקסט במשנה, מסכת סוטה, בפרק התשיעי, העוסק בטקסים שבטלו; באותו פרק עצמו נמסר שמשרבו הרוצחים בטלה עגלה ערופה, כלומר המשנה מתארת טקס שכבר איננו, ובכל זאת טורחת לדרוש את משמעותו. הרחבת הדברים בסוגיה בבבלי שם. הדמויות המרכזיות הן זקני העיר והכוהנים, כלומר ההנהגה, ומולם החלל האלמוני שאיש אינו יודע את שמו. הסיטואציה היא מוות שאין לו אשם ידוע, ודווקא בו מחייבים התורה וחז"ל את ההנהגה כולה לצאת אל הנחל ולתת דין וחשבון פומבי. בקורס נלמד המקור כדוגמה לתנועה של חז"ל מן המקרא אל המשנה ואל התלמוד: מטקס כפרה פולחני אל אמירה מוסרית על אחריות חברתית</w:t>
+        <w:t xml:space="preserve">מקור הטקסט במשנה, מסכת סוטה, בפרק התשיעי, העוסק בטקסים שבטלו; באותו פרק עצמו נמסר שמשרבו הרוצחים בטלה עגלה ערופה, כלומר המשנה מתארת טקס שכבר איננו, ובכל זאת טורחת לדרוש את משמעותו. הרחבת הדברים בסוגיה בבבלי שם. הדמויות המרכזיות הן זקני העיר והכוהנים, כלומר ההנהגה, ומולם החלל האלמוני שאיש אינו יודע את שמו. הסיטואציה היא מוות שאין לו אשם ידוע, ודווקא בו מחייבים התורה וחז"ל את ההנהגה כולה לצאת אל הנחל ולתת דין וחשבון פומבי. אף הכוהנים בני לוי נוכחים בטקס ומבקשים כפרה לעם כולו, כך שהאחריות נפרשת על כל שדרות ההנהגה, המשפטית והדתית כאחת. בקורס נלמד המקור כדוגמה לתנועה של חז"ל מן המקרא אל המשנה ואל התלמוד: מטקס כפרה פולחני אל אמירה מוסרית על אחריות חברתית</w:t>
       </w:r>
       <w:r>
         <w:rPr>
@@ -723,7 +723,7 @@
           <w:szCs w:val="24"/>
           <w:rtl/>
         </w:rPr>
-        <w:t xml:space="preserve">. ראוי לשים לב שגם לאחר העריכה נשארה המשנה תורה שבעל פה במלוא מובן המילה: רבי ערך אותה אך המשיך למוסרה לתלמידיו על פה, ובבית המדרש התקיים תפקיד מיוחד, ה"תנא", השונה את המשניות בעל פה. היא גם יצרה שפה משותפת לעם כולו. שני התלמודים, הבבלי והירושלמי, נבנו כפירוש עליה, וכל ספרות ההלכה שאחריהם נשענת עליה עד ימינו. ושינוי נוסף, מהפכני לא פחות: בעריכתה כרצף מחלוקות קיבעה המשנה את המחלוקת הלגיטימית כדרכה של תורה שבעל פה. בניגוד לחתירה לאחידות שאפיינה את האמונה המקראית, בית המדרש רואה בריבוי דעות ובביקורת הדדית את הדרך לבירור האמת.</w:t>
+        <w:t xml:space="preserve">. ראוי לשים לב שגם לאחר העריכה נשארה המשנה תורה שבעל פה במלוא מובן המילה: רבי ערך אותה אך המשיך למוסרה לתלמידיו על פה, ובבית המדרש התקיים תפקיד מיוחד, ה"תנא", השונה את המשניות בעל פה. היא גם יצרה שפה משותפת לעם כולו. שני התלמודים נבנו כפירוש עליה, הירושלמי בגליל והבבלי בישיבות בבל, כל אחד בארמית של מקומו, ודווקא המרחק בין שני המרכזים ממחיש את כוחה: טקסט אחד שסביבו יכלו שתי קהילות רחוקות לנהל שיח לימודי אחד. כל ספרות ההלכה שאחריהם נשענת עליה עד ימינו. ושינוי נוסף, מהפכני לא פחות: בעריכתה כרצף מחלוקות קיבעה המשנה את המחלוקת הלגיטימית כדרכה של תורה שבעל פה. בניגוד לחתירה לאחידות שאפיינה את האמונה המקראית, בית המדרש רואה בריבוי דעות ובביקורת הדדית את הדרך לבירור האמת.</w:t>
       </w:r>
     </w:p>
     <w:p>
@@ -1060,7 +1060,7 @@
           <w:szCs w:val="24"/>
           <w:rtl/>
         </w:rPr>
-        <w:t xml:space="preserve">. רבן יוחנן חייב למות מוות סמלי כדי שדבר חדש יוכל להיוולד, והיציאה בארון היא הרפיה מאחיזה בירושלים שדינה נגזר. מרקס אף מצביעה על כך שבגרסת איכה רבה, זו שהסרט שואב ממנה כמה מפרטיו, מצטרף אל המוות הסמלי מעין היריון סמלי: הארון הסגור הוא גם רחם, שממנו נולד העם מחדש אל מציאות אחרת. הקריאה הזאת מאירה היטב את הקטע: בן בטיח עסוק באבנים, בעצים ובאשמת המתים, ואילו רבן יוחנן כבר חי את המציאות הבאה. את הבקשה על יבנה וחכמיה מסבירה מרקס, בעקבות שרמר, כהעמדת שכבת החכמים בראש העם: יבנה וחכמיה באות תחת ירושלים ובית מקדשה</w:t>
+        <w:t xml:space="preserve">. רבן יוחנן חייב למות מוות סמלי כדי שדבר חדש יוכל להיוולד, והיציאה בארון היא הרפיה מאחיזה בירושלים שדינה נגזר. מרקס אף מצביעה על כך שבגרסת איכה רבה, זו שהסרט שואב ממנה כמה מפרטיו, מצטרף אל המוות הסמלי מעין היריון סמלי: הארון הסגור הוא גם רחם, שממנו נולד העם מחדש אל מציאות אחרת. הקריאה הזאת מאירה היטב את הקטע: בן בטיח עסוק באבנים, בעצים ובאשמת המתים, ואילו רבן יוחנן כבר חי את המציאות הבאה. את הבקשה על יבנה וחכמיה מסבירה מרקס, בעקבות שרמר, כהעמדת שכבת החכמים בראש העם: יבנה וחכמיה באות תחת ירושלים ובית מקדשה. גם שתי הבקשות הנוספות נקראות אצלה באותו מפתח: שושלת רבן גמליאל, מזרע בית דוד, מגשרת בין העולם הישן לחדש ומבטיחה רציפות של הנהגה, וריפויו של רבי צדוק הוא הצלת שריד חי של ירושלים החרבה</w:t>
       </w:r>
       <w:r>
         <w:rPr>
@@ -1212,7 +1212,7 @@
           <w:szCs w:val="24"/>
           <w:rtl/>
         </w:rPr>
-        <w:t xml:space="preserve">הסיפור מתאר את ראשית דרכו של מי שיהיה מגדולי התנאים, והוא מתחיל דווקא בכישלון. אליעזר הוא בן עשרים ושתיים שלא למד תורה מעולם, בן לאב עשיר בעל שדות. בעוד אחיו חורשים באדמה הפורייה, הוא נשלח לחרוש בטרשים, והוא בוכה. האב מפרש את הבכי כקובלנה על תנאי העבודה ומיטיב עמו, אך הבכי נמשך, שכן מקורו אחר לגמרי: הרצון ללמוד תורה. האב לועג לו, בן עשרים ושתיים ואתה מבקש ללמוד?! אליעזר בורח מבית אביו אל בית מדרשו של רבן יוחנן בן זכאי בירושלים, ושם מתחיל מבראשית: קריאת שמע, תפילה, ברכת המזון, שתי הלכות ביום. הוא לומד ברעב ובמסירות קיצונית, שמונה ימים בלא מזון, עד שריח פיו מסגיר אותו, והרב מגלה את גדול תלמידיו העתידי דווקא בתלמיד המורעב והבוש. שיא הסיפור בהיפוך כפול. הורקנוס עולה לירושלים כדי להדיר את בנו מנכסיו, ומוצא אותו דורש דברים חדשים שלא שמעה אוזן, "פָּנָיו מְאִירוֹת כְּאוֹר הַחַמָּה וְקַרְנוֹתָיו יוֹצְאוֹת כְּקַרְנוֹתָיו שֶׁל מֹשֶׁה"</w:t>
+        <w:t xml:space="preserve">הסיפור מתאר את ראשית דרכו של מי שיהיה מגדולי התנאים, והוא מתחיל דווקא בכישלון. אליעזר הוא בן עשרים ושתיים שלא למד תורה מעולם, בן לאב עשיר בעל שדות. בעוד אחיו חורשים באדמה הפורייה, הוא נשלח לחרוש בטרשים, והוא בוכה. האב מפרש את הבכי כקובלנה על תנאי העבודה ומיטיב עמו, אך הבכי נמשך, שכן מקורו אחר לגמרי: הרצון ללמוד תורה. האב לועג לו, בן עשרים ושתיים ואתה מבקש ללמוד?! אליעזר בורח מבית אביו אל בית מדרשו של רבן יוחנן בן זכאי בירושלים, ושם מתחיל מבראשית: קריאת שמע, תפילה, ברכת המזון, שתי הלכות ביום. הוא לומד ברעב ובמסירות קיצונית, שמונה ימים בלא מזון, עד שריח פיו מסגיר אותו. כשרבן יוחנן שולח את תלמידיו לברר, מתגלה בפונדקו של אליעזר שק שהוא נובר בו, וכשפותחים אותו מוצאים בו עפר: התלמיד שהתבייש להודות ברעבונו מצץ עפר. כך מגלה הרב את גדול תלמידיו העתידי דווקא בתלמיד המורעב והבוש. שיא הסיפור בהיפוך כפול. הורקנוס עולה לירושלים כדי להדיר את בנו מנכסיו, ומוצא אותו דורש דברים חדשים שלא שמעה אוזן, "פָּנָיו מְאִירוֹת כְּאוֹר הַחַמָּה וְקַרְנוֹתָיו יוֹצְאוֹת כְּקַרְנוֹתָיו שֶׁל מֹשֶׁה"</w:t>
       </w:r>
       <w:r>
         <w:rPr>
@@ -1480,7 +1480,7 @@
           <w:szCs w:val="24"/>
           <w:rtl/>
         </w:rPr>
-        <w:t xml:space="preserve">. וכאן מתחדד פרדוקס בדמותו: האיש שפרץ בעצמו כל גבול כדי להיכנס לבית המדרש, בגיל מאוחר, נגד אביו וכנגד כל הסיכויים, הוא הנועל את שעריו בפני נשים. הפרדוקס מעמיק עוד לנוכח דמותה של אשתו, אמא שלום אחות רבן גמליאל, שנמנתה בחומרי המפגש על הנשים הלמדניות שבספרות חז"ל. שומר הסף של המסורת מבקש לשמור גם על גבולותיה החברתיים. ראוי להוסיף כי בסיפור תחילתו של רבי עקיבא, שנלמד באותו דף חברותא, יושב רבי עקיבא שנים לפני רבי אליעזר ולומד מפיו: הבור הסוד נעשה בעצמו רבו של גדול הדרשנים.</w:t>
+        <w:t xml:space="preserve">. וכאן מתחדד פרדוקס בדמותו: האיש שפרץ בעצמו כל גבול כדי להיכנס לבית המדרש, בגיל מאוחר, נגד אביו וכנגד כל הסיכויים, הוא הנועל את שעריו בפני נשים. הפרדוקס מעמיק עוד לנוכח דמותה של אשתו, אמא שלום אחות רבן גמליאל, שנמנתה בחומרי המפגש על הנשים הלמדניות שבספרות חז"ל. שומר הסף של המסורת מבקש לשמור גם על גבולותיה החברתיים. ראוי להוסיף כי בסיפור תחילתו של רבי עקיבא, שנלמד באותו דף חברותא, יושב רבי עקיבא שנים לפני רבי אליעזר ולומד מפיו: הבור הסוד נעשה בעצמו רבו של גדול הדרשנים. בסופו של דבר, הדמות העולה מן המקורות כולם היא אחת: אדם שוויתר על ירושת אביו למען התורה, ומשקנה אותה בייסורים, שמר עליה, על תכניה ועל גבולותיה, בקנאות של מי שיודע מה מחירה.</w:t>
       </w:r>
     </w:p>
     <w:p>

</xml_diff>

<commit_message>
Replace course-site citations with primary and syllabus sources
Footnotes and bibliography no longer reference the course site or its
handouts: quotations now cite the primary rabbinic sources directly
(Mishnah, Talmud, Pirkei deRabbi Eliezer and parallels), course-derived
claims cite Halbertal and Rosen-Zvi's Mishnah introductions from the
syllabus, and the sage-over-prophet trend cites Bava Batra 12a. Added
Rosen-Zvi to the bibliography in place of the course-materials entry.

Co-Authored-By: Claude Fable 5 <noreply@anthropic.com>
Claude-Session: https://claude.ai/code/session_01JB6bGJBwBnqBZeMysNqh8L
</commit_message>
<xml_diff>
--- a/עבודת-סיום-אדם-ספרות-ומעשה-בימי-חזל.docx
+++ b/עבודת-סיום-אדם-ספרות-ומעשה-בימי-חזל.docx
@@ -536,7 +536,7 @@
           <w:szCs w:val="24"/>
           <w:rtl/>
         </w:rPr>
-        <w:t xml:space="preserve">מקור הטקסט במשנה, מסכת סוטה, בפרק התשיעי, העוסק בטקסים שבטלו; באותו פרק עצמו נמסר שמשרבו הרוצחים בטלה עגלה ערופה, כלומר המשנה מתארת טקס שכבר איננו, ובכל זאת טורחת לדרוש את משמעותו. הרחבת הדברים בסוגיה בבבלי שם. הדמויות המרכזיות הן זקני העיר והכוהנים, כלומר ההנהגה, ומולם החלל האלמוני שאיש אינו יודע את שמו. הסיטואציה היא מוות שאין לו אשם ידוע, ודווקא בו מחייבים התורה וחז"ל את ההנהגה כולה לצאת אל הנחל ולתת דין וחשבון פומבי. אף הכוהנים בני לוי נוכחים בטקס ומבקשים כפרה לעם כולו, כך שהאחריות נפרשת על כל שדרות ההנהגה, המשפטית והדתית כאחת. בקורס נלמד המקור כדוגמה לתנועה של חז"ל מן המקרא אל המשנה ואל התלמוד: מטקס כפרה פולחני אל אמירה מוסרית על אחריות חברתית</w:t>
+        <w:t xml:space="preserve">מקור הטקסט במשנה, מסכת סוטה, בפרק התשיעי, העוסק בטקסים שבטלו; באותו פרק עצמו נמסר שמשרבו הרוצחים בטלה עגלה ערופה, כלומר המשנה מתארת טקס שכבר איננו, ובכל זאת טורחת לדרוש את משמעותו. הרחבת הדברים בסוגיה בבבלי שם. הדמויות המרכזיות הן זקני העיר והכוהנים, כלומר ההנהגה, ומולם החלל האלמוני שאיש אינו יודע את שמו. הסיטואציה היא מוות שאין לו אשם ידוע, ודווקא בו מחייבים התורה וחז"ל את ההנהגה כולה לצאת אל הנחל ולתת דין וחשבון פומבי. אף הכוהנים בני לוי נוכחים בטקס ומבקשים כפרה לעם כולו, כך שהאחריות נפרשת על כל שדרות ההנהגה, המשפטית והדתית כאחת. המקור ממחיש את תנועתם של חז"ל מן המקרא אל המשנה ואל התלמוד: מטקס כפרה פולחני אל אמירה מוסרית על אחריות חברתית</w:t>
       </w:r>
       <w:r>
         <w:rPr>
@@ -708,7 +708,7 @@
           <w:szCs w:val="24"/>
           <w:rtl/>
         </w:rPr>
-        <w:t xml:space="preserve">המשנה היא החיבור הראשון שהעלה את התורה שבעל פה מאוסף מסורות מפוזרות לכדי קורפוס ערוך ומחייב, ומכאן עיקר כוחה. אחרי החורבן, משבטלה עבודת הקרבנות, נעשה לימוד הטקסט למרכז החיים הדתיים, והמשנה היא שהעניקה ללימוד הזה צורה: בלשון מצגת הקורס, היא "הזיכרון המארגן" של עולם החכמים</w:t>
+        <w:t xml:space="preserve">המשנה היא החיבור הראשון שהעלה את התורה שבעל פה מאוסף מסורות מפוזרות לכדי קורפוס ערוך ומחייב, ומכאן עיקר כוחה. אחרי החורבן, משבטלה עבודת הקרבנות, נעשה לימוד הטקסט למרכז החיים הדתיים, והמשנה היא שהעניקה ללימוד הזה צורה: היא נעשתה מעין זיכרון מארגן של עולם החכמים</w:t>
       </w:r>
       <w:r>
         <w:rPr>
@@ -759,7 +759,7 @@
           <w:szCs w:val="24"/>
           <w:rtl/>
         </w:rPr>
-        <w:t xml:space="preserve">דוגמה הממחישה זאת, מתוך דף החברותא על מאפייני המשנה: משנה, מסכת סוכה פרק א, משנה א.</w:t>
+        <w:t xml:space="preserve">דוגמה הממחישה זאת: משנה, מסכת סוכה פרק א, משנה א.</w:t>
       </w:r>
     </w:p>
     <w:p>
@@ -861,7 +861,7 @@
           <w:szCs w:val="24"/>
           <w:rtl/>
         </w:rPr>
-        <w:t xml:space="preserve">הקטע (דקות 01:03:30 עד 01:10:00) מבוסס על אגדת יציאתו של רבן יוחנן בן זכאי מירושלים הנצורה, שנלמדה ביחידה "צמיחה מתוך משבר". האגדה באה בבבלי בתוך קובץ שלם של סיפורי חורבן במסכת גיטין, והיא מוכרת בגרסאות נוספות בספרות חז"ל, ובהן איכה רבה ואבות דרבי נתן. להלן החלק הרלוונטי, בתרגום לעברית על פי דף המקורות של הקורס:</w:t>
+        <w:t xml:space="preserve">הקטע (דקות 01:03:30 עד 01:10:00) מבוסס על אגדת יציאתו של רבן יוחנן בן זכאי מירושלים הנצורה, שנלמדה ביחידה "צמיחה מתוך משבר". האגדה באה בבבלי בתוך קובץ שלם של סיפורי חורבן במסכת גיטין, והיא מוכרת בגרסאות נוספות בספרות חז"ל, ובהן איכה רבה ואבות דרבי נתן. להלן החלק הרלוונטי, בתרגום לעברית:</w:t>
       </w:r>
     </w:p>
     <w:p>
@@ -1163,7 +1163,7 @@
           <w:szCs w:val="24"/>
           <w:rtl/>
         </w:rPr>
-        <w:t xml:space="preserve">בחרתי במקור הראשון: סיפור תחילתו של רבי אליעזר בן הורקנוס, שנלמד בדף החברותא "איך נעשים חכמ.ה"</w:t>
+        <w:t xml:space="preserve">בחרתי במקור הראשון: סיפור תחילתו של רבי אליעזר בן הורקנוס, כפי שנלמד במפגשי הקורס</w:t>
       </w:r>
       <w:r>
         <w:rPr>
@@ -1480,7 +1480,7 @@
           <w:szCs w:val="24"/>
           <w:rtl/>
         </w:rPr>
-        <w:t xml:space="preserve">. וכאן מתחדד פרדוקס בדמותו: האיש שפרץ בעצמו כל גבול כדי להיכנס לבית המדרש, בגיל מאוחר, נגד אביו וכנגד כל הסיכויים, הוא הנועל את שעריו בפני נשים. הפרדוקס מעמיק עוד לנוכח דמותה של אשתו, אמא שלום אחות רבן גמליאל, שנמנתה בחומרי המפגש על הנשים הלמדניות שבספרות חז"ל. שומר הסף של המסורת מבקש לשמור גם על גבולותיה החברתיים. ראוי להוסיף כי בסיפור תחילתו של רבי עקיבא, שנלמד באותו דף חברותא, יושב רבי עקיבא שנים לפני רבי אליעזר ולומד מפיו: הבור הסוד נעשה בעצמו רבו של גדול הדרשנים. בסופו של דבר, הדמות העולה מן המקורות כולם היא אחת: אדם שוויתר על ירושת אביו למען התורה, ומשקנה אותה בייסורים, שמר עליה, על תכניה ועל גבולותיה, בקנאות של מי שיודע מה מחירה.</w:t>
+        <w:t xml:space="preserve">. וכאן מתחדד פרדוקס בדמותו: האיש שפרץ בעצמו כל גבול כדי להיכנס לבית המדרש, בגיל מאוחר, נגד אביו וכנגד כל הסיכויים, הוא הנועל את שעריו בפני נשים. הפרדוקס מעמיק עוד לנוכח דמותה של אשתו, אמא שלום אחות רבן גמליאל, שנמנתה בחומרי המפגש על הנשים הלמדניות שבספרות חז"ל. שומר הסף של המסורת מבקש לשמור גם על גבולותיה החברתיים. ראוי להוסיף כי בסיפור תחילתו של רבי עקיבא, שנלמד אף הוא במפגשים, יושב רבי עקיבא שנים לפני רבי אליעזר ולומד מפיו: הבור הסוד נעשה בעצמו רבו של גדול הדרשנים. בסופו של דבר, הדמות העולה מן המקורות כולם היא אחת: אדם שוויתר על ירושת אביו למען התורה, ומשקנה אותה בייסורים, שמר עליה, על תכניה ועל גבולותיה, בקנאות של מי שיודע מה מחירה.</w:t>
       </w:r>
     </w:p>
     <w:p>
@@ -1575,25 +1575,25 @@
           <w:szCs w:val="24"/>
           <w:rtl/>
         </w:rPr>
-        <w:t xml:space="preserve">מרקס, דליה. "רבן יוחנן בן זכאי והקמת יבנה: ניתוח והערכת הסיפור בראי הזמן". מתוך חומרי הקריאה באתר הקורס.</w:t>
-      </w:r>
-    </w:p>
-    <w:p>
-      <w:pPr>
-        <w:bidi/>
-        <w:spacing w:after="120" w:line="360" w:lineRule="auto"/>
-        <w:jc w:val="right"/>
-      </w:pPr>
-      <w:r>
-        <w:rPr>
-          <w:rFonts w:ascii="David" w:cs="David" w:eastAsia="David" w:hAnsi="David"/>
-          <w:b w:val="false"/>
-          <w:bCs w:val="false"/>
-          <w:sz w:val="24"/>
-          <w:szCs w:val="24"/>
-          <w:rtl/>
-        </w:rPr>
-        <w:t xml:space="preserve">סבאג ישראל, חגית. דפי מקורות, דפי חברותא ומצגות בקורס "אדם, ספרות ומעשה בימי חז"ל". הקריה האקדמית אונו, תשפ"ו: מפגש 1 (עגלה ערופה), שיעורים 3-5 ("נביא וחכם", משנה ותוספתא, "מאפייני המשנה"), היחידה "צמיחה מתוך משבר" (ריב"ז והיציאה מירושלים), "איך נעשים חכמ.ה", מפגש 11 (לימוד תורה לנשים).</w:t>
+        <w:t xml:space="preserve">מרקס, דליה. "רבן יוחנן בן זכאי והקמת יבנה: ניתוח והערכת הסיפור בראי הזמן".</w:t>
+      </w:r>
+    </w:p>
+    <w:p>
+      <w:pPr>
+        <w:bidi/>
+        <w:spacing w:after="120" w:line="360" w:lineRule="auto"/>
+        <w:jc w:val="right"/>
+      </w:pPr>
+      <w:r>
+        <w:rPr>
+          <w:rFonts w:ascii="David" w:cs="David" w:eastAsia="David" w:hAnsi="David"/>
+          <w:b w:val="false"/>
+          <w:bCs w:val="false"/>
+          <w:sz w:val="24"/>
+          <w:szCs w:val="24"/>
+          <w:rtl/>
+        </w:rPr>
+        <w:t xml:space="preserve">רוזן-צבי, ישי. "מבוא למשנה". ספרות חז"ל הארץ-ישראלית, א. עורכים מנחם כהנא ואחרים. ירושלים, תשע"ח. 1-64.</w:t>
       </w:r>
     </w:p>
     <w:sectPr>
@@ -1746,7 +1746,7 @@
           <w:szCs w:val="20"/>
           <w:rtl/>
         </w:rPr>
-        <w:t xml:space="preserve"> דף המקורות למפגש 1, "עגלה ערופה: התנועה של חז"ל מהמקרא אל המשנה ואל התלמוד", אתר הקורס.</w:t>
+        <w:t xml:space="preserve"> דברים כא, א-ט; משנה, סוטה ט, ו; בבלי, סוטה מו ע"ב.</w:t>
       </w:r>
     </w:p>
   </w:footnote>
@@ -1769,7 +1769,7 @@
           <w:szCs w:val="20"/>
           <w:rtl/>
         </w:rPr>
-        <w:t xml:space="preserve"> משה הלברטל, "מבוא למשנה", שישה סדרי משנה, סדרת עם הספר, ידיעות אחרונות; מצגת הקורס "נביא וחכם: משנה ותוספתא" (שיעורים 3-5).</w:t>
+        <w:t xml:space="preserve"> משה הלברטל, "מבוא למשנה", שישה סדרי משנה, סדרת עם הספר, תל אביב: ידיעות אחרונות; ישי רוזן-צבי, "מבוא למשנה", ספרות חז"ל הארץ-ישראלית א, בעריכת מנחם כהנא ואחרים, ירושלים, תשע"ח, עמ' 1-64.</w:t>
       </w:r>
     </w:p>
   </w:footnote>
@@ -1792,7 +1792,7 @@
           <w:szCs w:val="20"/>
           <w:rtl/>
         </w:rPr>
-        <w:t xml:space="preserve"> מצגת הקורס "נביא וחכם: משנה ותוספתא" (שיעורים 3-5), אתר הקורס.</w:t>
+        <w:t xml:space="preserve"> ישי רוזן-צבי, "מבוא למשנה", ספרות חז"ל הארץ-ישראלית א, בעריכת מנחם כהנא ואחרים, ירושלים, תשע"ח, עמ' 1-64; משה הלברטל, "מבוא למשנה", שישה סדרי משנה, תל אביב: ידיעות אחרונות.</w:t>
       </w:r>
     </w:p>
   </w:footnote>
@@ -1815,7 +1815,7 @@
           <w:szCs w:val="20"/>
           <w:rtl/>
         </w:rPr>
-        <w:t xml:space="preserve"> מצגת הקורס "נביא וחכם: משנה ותוספתא" (שיעורים 3-5), אתר הקורס.</w:t>
+        <w:t xml:space="preserve"> ישי רוזן-צבי, "מבוא למשנה", ספרות חז"ל הארץ-ישראלית א, בעריכת מנחם כהנא ואחרים, ירושלים, תשע"ח, עמ' 1-64; משה הלברטל, "מבוא למשנה", שישה סדרי משנה, תל אביב: ידיעות אחרונות.</w:t>
       </w:r>
     </w:p>
   </w:footnote>
@@ -1838,7 +1838,7 @@
           <w:szCs w:val="20"/>
           <w:rtl/>
         </w:rPr>
-        <w:t xml:space="preserve"> משנה, מסכת סוכה, פרק א, משנה א; מצוטט בדף החברותא "מאפייני המשנה", אתר הקורס.</w:t>
+        <w:t xml:space="preserve"> משנה, סוכה א, א.</w:t>
       </w:r>
     </w:p>
   </w:footnote>
@@ -1861,7 +1861,7 @@
           <w:szCs w:val="20"/>
           <w:rtl/>
         </w:rPr>
-        <w:t xml:space="preserve"> תלמוד בבלי, מסכת גיטין, דף נו ע"א-ע"ב; התרגום על פי דף החברותא "ריב"ז, הבריונים והיציאה מירושלים ליבנה", אתר הקורס.</w:t>
+        <w:t xml:space="preserve"> תלמוד בבלי, מסכת גיטין, דף נו ע"א-ע"ב, בתרגום לעברית.</w:t>
       </w:r>
     </w:p>
   </w:footnote>
@@ -1930,7 +1930,7 @@
           <w:szCs w:val="20"/>
           <w:rtl/>
         </w:rPr>
-        <w:t xml:space="preserve"> מתוך פסקול הסרט "אגדת חורבן" (במאי: גידי דר, ישראל 2022), בקטע הנדון; הלשון שאולה מן התלמוד, התורה מגינה ומצילה, תלמוד בבלי, מסכת סוטה, דף כא ע"א, מן הסוגיה שנלמדה במפגש 11.</w:t>
+        <w:t xml:space="preserve"> מתוך פסקול הסרט "אגדת חורבן" (במאי: גידי דר, ישראל 2022), בקטע הנדון; הלשון שאולה מן התלמוד, התורה מגינה ומצילה, תלמוד בבלי, מסכת סוטה, דף כא ע"א.</w:t>
       </w:r>
     </w:p>
   </w:footnote>
@@ -1976,7 +1976,7 @@
           <w:szCs w:val="20"/>
           <w:rtl/>
         </w:rPr>
-        <w:t xml:space="preserve"> דליה מרקס, "רבן יוחנן בן זכאי והקמת יבנה: ניתוח והערכת הסיפור בראי הזמן", מתוך חומרי הקריאה של הקורס.</w:t>
+        <w:t xml:space="preserve"> דליה מרקס, "רבן יוחנן בן זכאי והקמת יבנה: ניתוח והערכת הסיפור בראי הזמן".</w:t>
       </w:r>
     </w:p>
   </w:footnote>
@@ -2045,7 +2045,7 @@
           <w:szCs w:val="20"/>
           <w:rtl/>
         </w:rPr>
-        <w:t xml:space="preserve"> דליה מרקס, "רבן יוחנן בן זכאי והקמת יבנה: ניתוח והערכת הסיפור בראי הזמן", מתוך חומרי הקריאה של הקורס.</w:t>
+        <w:t xml:space="preserve"> דליה מרקס, "רבן יוחנן בן זכאי והקמת יבנה: ניתוח והערכת הסיפור בראי הזמן".</w:t>
       </w:r>
     </w:p>
   </w:footnote>
@@ -2068,7 +2068,7 @@
           <w:szCs w:val="20"/>
           <w:rtl/>
         </w:rPr>
-        <w:t xml:space="preserve"> מדרש פרקי דרבי אליעזר, פרקים א-ב, ומקבילות באבות דרבי נתן נוסח א, בראשית רבה מב, א ותנחומא בובר לך לך, י; על פי דף החברותא "איך נעשים חכמ.ה", אתר הקורס.</w:t>
+        <w:t xml:space="preserve"> מדרש פרקי דרבי אליעזר, פרקים א-ב; מקבילות: אבות דרבי נתן, נוסח א; בראשית רבה מב, א; תנחומא בובר, לך לך י.</w:t>
       </w:r>
     </w:p>
   </w:footnote>
@@ -2091,7 +2091,7 @@
           <w:szCs w:val="20"/>
           <w:rtl/>
         </w:rPr>
-        <w:t xml:space="preserve"> פרקי דרבי אליעזר, פרקים א-ב, ומקבילות, על פי נוסח דף החברותא "איך נעשים חכמ.ה".</w:t>
+        <w:t xml:space="preserve"> פרקי דרבי אליעזר, פרקים א-ב, ומקבילות.</w:t>
       </w:r>
     </w:p>
   </w:footnote>
@@ -2137,7 +2137,7 @@
           <w:szCs w:val="20"/>
           <w:rtl/>
         </w:rPr>
-        <w:t xml:space="preserve"> דברי רבי אליעזר בסיום הסיפור, פרקי דרבי אליעזר, פרקים א-ב, ומקבילות, על פי דף החברותא "איך נעשים חכמ.ה".</w:t>
+        <w:t xml:space="preserve"> פרקי דרבי אליעזר, פרקים א-ב, ומקבילות; דברי רבי אליעזר בסיום הסיפור.</w:t>
       </w:r>
     </w:p>
   </w:footnote>
@@ -2160,7 +2160,7 @@
           <w:szCs w:val="20"/>
           <w:rtl/>
         </w:rPr>
-        <w:t xml:space="preserve"> מצגת הקורס "נביא וחכם" (שיעורים 3-5), אתר הקורס.</w:t>
+        <w:t xml:space="preserve"> בבלי, בבא בתרא יב ע"א: "חכם עדיף מנביא".</w:t>
       </w:r>
     </w:p>
   </w:footnote>
@@ -2183,7 +2183,7 @@
           <w:szCs w:val="20"/>
           <w:rtl/>
         </w:rPr>
-        <w:t xml:space="preserve"> משנה, מסכת אבות, פרק ב, משנה ח; נלמדה ביחידה "צמיחה מתוך משבר".</w:t>
+        <w:t xml:space="preserve"> משנה, אבות ב, ח.</w:t>
       </w:r>
     </w:p>
   </w:footnote>
@@ -2206,7 +2206,7 @@
           <w:szCs w:val="20"/>
           <w:rtl/>
         </w:rPr>
-        <w:t xml:space="preserve"> דף החברותא "איך נעשים חכמ.ה", אתר הקורס.</w:t>
+        <w:t xml:space="preserve"> פרקי דרבי אליעזר, פרקים א-ב, ומקבילות.</w:t>
       </w:r>
     </w:p>
   </w:footnote>

</xml_diff>

<commit_message>
Remove forced page breaks between questions
Questions now flow continuously, eliminating the half-empty pages;
only the cover page and the bibliography keep their own pages.

Co-Authored-By: Claude Fable 5 <noreply@anthropic.com>
Claude-Session: https://claude.ai/code/session_01JB6bGJBwBnqBZeMysNqh8L
</commit_message>
<xml_diff>
--- a/עבודת-סיום-אדם-ספרות-ומעשה-בימי-חזל.docx
+++ b/עבודת-סיום-אדם-ספרות-ומעשה-בימי-חזל.docx
@@ -591,11 +591,6 @@
       </w:r>
     </w:p>
     <w:p>
-      <w:r>
-        <w:br w:type="page"/>
-      </w:r>
-    </w:p>
-    <w:p>
       <w:pPr>
         <w:bidi/>
         <w:spacing w:after="120" w:before="240" w:line="360" w:lineRule="auto"/>
@@ -806,11 +801,6 @@
       </w:r>
     </w:p>
     <w:p>
-      <w:r>
-        <w:br w:type="page"/>
-      </w:r>
-    </w:p>
-    <w:p>
       <w:pPr>
         <w:bidi/>
         <w:spacing w:after="120" w:before="240" w:line="360" w:lineRule="auto"/>
@@ -1125,11 +1115,6 @@
           <w:rtl/>
         </w:rPr>
         <w:t xml:space="preserve">. הסיפור מעמיד דגם מנהיגות שממשיך לדבר אל קוראיו: מול קנאות הנלחמת עד כלות, פרגמטיזם שמציל את מה שאפשר להציל ומתרגם חורבן לבניין. מרקס מראה כיצד דורות שונים יצקו אל הסיפור את עולמם, ממורים שראו בו אחרי השואה את ניצחון הלימוד על הכוח ועד ויכוחים ציבוריים בישראל שבהם נאבקים על דמותו של רבן יוחנן תומכים ומבקרים כאחד. דווקא העמימות, שהתלמוד עצמו שימר בביקורת על הבקשה הצנועה, היא סוד כוחו. הוא אינו מוסר חד משמעי אלא מראה, לאומה וגם לכל אדם המקים את חייו מן החורבות. אוסיף מנקודת מבטי: הישגו של הסרט הוא שהחזיר לסיפור את כובד הבשר והדם. הצפייה בירושלים המורעבת עשתה עבורי מוחשי את גודל הוויתור, ולימדה אותי שהבחירה ביבנה לא הייתה תשובה קלה של איש רוח, אלא ההימור הכבד ביותר שנטל על עצמו מנהיג יהודי.</w:t>
-      </w:r>
-    </w:p>
-    <w:p>
-      <w:r>
-        <w:br w:type="page"/>
       </w:r>
     </w:p>
     <w:p>

</xml_diff>